<commit_message>
Pack 16.7: contract — merge address paragraphs + keepNext on requisites/signatures
</commit_message>
<xml_diff>
--- a/templates/docx/contract_template.docx
+++ b/templates/docx/contract_template.docx
@@ -1,6 +1,6 @@
 
 <file path=word/document.xml><?xml version="1.0" encoding="utf-8"?>
-<w:document xmlns:wpc="http://schemas.microsoft.com/office/word/2010/wordprocessingCanvas" xmlns:cx="http://schemas.microsoft.com/office/drawing/2014/chartex" xmlns:cx1="http://schemas.microsoft.com/office/drawing/2015/9/8/chartex" xmlns:cx2="http://schemas.microsoft.com/office/drawing/2015/10/21/chartex" xmlns:cx3="http://schemas.microsoft.com/office/drawing/2016/5/9/chartex" xmlns:cx4="http://schemas.microsoft.com/office/drawing/2016/5/10/chartex" xmlns:cx5="http://schemas.microsoft.com/office/drawing/2016/5/11/chartex" xmlns:cx6="http://schemas.microsoft.com/office/drawing/2016/5/12/chartex" xmlns:cx7="http://schemas.microsoft.com/office/drawing/2016/5/13/chartex" xmlns:cx8="http://schemas.microsoft.com/office/drawing/2016/5/14/chartex" xmlns:mc="http://schemas.openxmlformats.org/markup-compatibility/2006" xmlns:aink="http://schemas.microsoft.com/office/drawing/2016/ink" xmlns:am3d="http://schemas.microsoft.com/office/drawing/2017/model3d" xmlns:o="urn:schemas-microsoft-com:office:office" xmlns:oel="http://schemas.microsoft.com/office/2019/extlst" xmlns:r="http://schemas.openxmlformats.org/officeDocument/2006/relationships" xmlns:m="http://schemas.openxmlformats.org/officeDocument/2006/math" xmlns:v="urn:schemas-microsoft-com:vml" xmlns:wp14="http://schemas.microsoft.com/office/word/2010/wordprocessingDrawing" xmlns:wp="http://schemas.openxmlformats.org/drawingml/2006/wordprocessingDrawing" xmlns:w10="urn:schemas-microsoft-com:office:word" xmlns:w="http://schemas.openxmlformats.org/wordprocessingml/2006/main" xmlns:w14="http://schemas.microsoft.com/office/word/2010/wordml" xmlns:w15="http://schemas.microsoft.com/office/word/2012/wordml" xmlns:w16cex="http://schemas.microsoft.com/office/word/2018/wordml/cex" xmlns:w16cid="http://schemas.microsoft.com/office/word/2016/wordml/cid" xmlns:w16="http://schemas.microsoft.com/office/word/2018/wordml" xmlns:w16du="http://schemas.microsoft.com/office/word/2023/wordml/word16du" xmlns:w16sdtdh="http://schemas.microsoft.com/office/word/2020/wordml/sdtdatahash" xmlns:w16sdtfl="http://schemas.microsoft.com/office/word/2024/wordml/sdtformatlock" xmlns:w16se="http://schemas.microsoft.com/office/word/2015/wordml/symex" xmlns:wpg="http://schemas.microsoft.com/office/word/2010/wordprocessingGroup" xmlns:wpi="http://schemas.microsoft.com/office/word/2010/wordprocessingInk" xmlns:wne="http://schemas.microsoft.com/office/word/2006/wordml" xmlns:wps="http://schemas.microsoft.com/office/word/2010/wordprocessingShape" mc:Ignorable="w14 w15 w16se w16cid w16 w16cex w16sdtdh w16sdtfl w16du wp14">
+<w:document xmlns:wpc="http://schemas.microsoft.com/office/word/2010/wordprocessingCanvas" xmlns:cx="http://schemas.microsoft.com/office/drawing/2014/chartex" xmlns:cx1="http://schemas.microsoft.com/office/drawing/2015/9/8/chartex" xmlns:cx2="http://schemas.microsoft.com/office/drawing/2015/10/21/chartex" xmlns:cx3="http://schemas.microsoft.com/office/drawing/2016/5/9/chartex" xmlns:cx4="http://schemas.microsoft.com/office/drawing/2016/5/10/chartex" xmlns:cx5="http://schemas.microsoft.com/office/drawing/2016/5/11/chartex" xmlns:cx6="http://schemas.microsoft.com/office/drawing/2016/5/12/chartex" xmlns:cx7="http://schemas.microsoft.com/office/drawing/2016/5/13/chartex" xmlns:cx8="http://schemas.microsoft.com/office/drawing/2016/5/14/chartex" xmlns:mc="http://schemas.openxmlformats.org/markup-compatibility/2006" xmlns:aink="http://schemas.microsoft.com/office/drawing/2016/ink" xmlns:am3d="http://schemas.microsoft.com/office/drawing/2017/model3d" xmlns:o="urn:schemas-microsoft-com:office:office" xmlns:r="http://schemas.openxmlformats.org/officeDocument/2006/relationships" xmlns:m="http://schemas.openxmlformats.org/officeDocument/2006/math" xmlns:v="urn:schemas-microsoft-com:vml" xmlns:wp14="http://schemas.microsoft.com/office/word/2010/wordprocessingDrawing" xmlns:wp="http://schemas.openxmlformats.org/drawingml/2006/wordprocessingDrawing" xmlns:w10="urn:schemas-microsoft-com:office:word" xmlns:w="http://schemas.openxmlformats.org/wordprocessingml/2006/main" xmlns:w14="http://schemas.microsoft.com/office/word/2010/wordml" xmlns:w15="http://schemas.microsoft.com/office/word/2012/wordml" xmlns:w16cid="http://schemas.microsoft.com/office/word/2016/wordml/cid" xmlns:w16se="http://schemas.microsoft.com/office/word/2015/wordml/symex" xmlns:wpg="http://schemas.microsoft.com/office/word/2010/wordprocessingGroup" xmlns:wpi="http://schemas.microsoft.com/office/word/2010/wordprocessingInk" xmlns:wne="http://schemas.microsoft.com/office/word/2006/wordml" xmlns:wps="http://schemas.microsoft.com/office/word/2010/wordprocessingShape" mc:Ignorable="w14 w15 w16se w16cid wp14">
   <w:body>
     <w:p>
       <w:pPr>
@@ -20,7 +20,7 @@
           <w:sz w:val="22"/>
           <w:szCs w:val="22"/>
         </w:rPr>
-        <w:t>Договор №{{ contract.number }}</w:t>
+        <w:t>Договор №</w:t>
       </w:r>
       <w:r>
         <w:rPr>
@@ -30,7 +30,9 @@
           <w:sz w:val="22"/>
           <w:szCs w:val="22"/>
         </w:rPr>
-      </w:r>
+        <w:t xml:space="preserve"> </w:t>
+      </w:r>
+      <w:proofErr w:type="gramStart"/>
       <w:r>
         <w:rPr>
           <w:rFonts w:ascii="Microsoft Sans Serif" w:hAnsi="Microsoft Sans Serif" w:cs="Microsoft Sans Serif"/>
@@ -39,7 +41,9 @@
           <w:sz w:val="22"/>
           <w:szCs w:val="22"/>
         </w:rPr>
-      </w:r>
+        <w:t xml:space="preserve">{{ </w:t>
+      </w:r>
+      <w:proofErr w:type="spellStart"/>
       <w:r>
         <w:rPr>
           <w:rFonts w:ascii="Microsoft Sans Serif" w:hAnsi="Microsoft Sans Serif" w:cs="Microsoft Sans Serif"/>
@@ -48,7 +52,9 @@
           <w:sz w:val="22"/>
           <w:szCs w:val="22"/>
         </w:rPr>
-      </w:r>
+        <w:t>contract</w:t>
+      </w:r>
+      <w:proofErr w:type="gramEnd"/>
       <w:r>
         <w:rPr>
           <w:rFonts w:ascii="Microsoft Sans Serif" w:hAnsi="Microsoft Sans Serif" w:cs="Microsoft Sans Serif"/>
@@ -57,7 +63,9 @@
           <w:sz w:val="22"/>
           <w:szCs w:val="22"/>
         </w:rPr>
-      </w:r>
+        <w:t>.number</w:t>
+      </w:r>
+      <w:proofErr w:type="spellEnd"/>
       <w:r>
         <w:rPr>
           <w:rFonts w:ascii="Microsoft Sans Serif" w:hAnsi="Microsoft Sans Serif" w:cs="Microsoft Sans Serif"/>
@@ -66,15 +74,7 @@
           <w:sz w:val="22"/>
           <w:szCs w:val="22"/>
         </w:rPr>
-      </w:r>
-      <w:r>
-        <w:rPr>
-          <w:rFonts w:ascii="Microsoft Sans Serif" w:hAnsi="Microsoft Sans Serif" w:cs="Microsoft Sans Serif"/>
-          <w:b/>
-          <w:bCs/>
-          <w:sz w:val="22"/>
-          <w:szCs w:val="22"/>
-        </w:rPr>
+        <w:t xml:space="preserve"> }}</w:t>
       </w:r>
     </w:p>
     <w:p>
@@ -117,6 +117,7 @@
           <w:rFonts w:ascii="Microsoft Sans Serif" w:hAnsi="Microsoft Sans Serif" w:cs="Microsoft Sans Serif"/>
           <w:sz w:val="22"/>
           <w:szCs w:val="22"/>
+          <w:lang w:val="en-US"/>
         </w:rPr>
       </w:pPr>
       <w:r>
@@ -125,154 +126,76 @@
           <w:sz w:val="22"/>
           <w:szCs w:val="22"/>
         </w:rPr>
-        <w:t>г. {{ contract.sign_city }}                                                                                                             {{ contract.sign_date_str }}</w:t>
-      </w:r>
-      <w:r>
-        <w:rPr>
-          <w:rFonts w:ascii="Microsoft Sans Serif" w:hAnsi="Microsoft Sans Serif" w:cs="Microsoft Sans Serif"/>
-          <w:sz w:val="22"/>
-          <w:szCs w:val="22"/>
-        </w:rPr>
-      </w:r>
-      <w:r>
-        <w:rPr>
-          <w:rFonts w:ascii="Microsoft Sans Serif" w:hAnsi="Microsoft Sans Serif" w:cs="Microsoft Sans Serif"/>
-          <w:sz w:val="22"/>
-          <w:szCs w:val="22"/>
-        </w:rPr>
-      </w:r>
-      <w:r>
-        <w:rPr>
-          <w:rFonts w:ascii="Microsoft Sans Serif" w:hAnsi="Microsoft Sans Serif" w:cs="Microsoft Sans Serif"/>
-          <w:sz w:val="22"/>
-          <w:szCs w:val="22"/>
-        </w:rPr>
-      </w:r>
-      <w:r>
-        <w:rPr>
-          <w:rFonts w:ascii="Microsoft Sans Serif" w:hAnsi="Microsoft Sans Serif" w:cs="Microsoft Sans Serif"/>
-          <w:sz w:val="22"/>
-          <w:szCs w:val="22"/>
-        </w:rPr>
-      </w:r>
-      <w:r>
-        <w:rPr>
-          <w:rFonts w:ascii="Microsoft Sans Serif" w:hAnsi="Microsoft Sans Serif" w:cs="Microsoft Sans Serif"/>
-          <w:sz w:val="22"/>
-          <w:szCs w:val="22"/>
-        </w:rPr>
-      </w:r>
-      <w:r>
-        <w:rPr>
-          <w:rFonts w:ascii="Microsoft Sans Serif" w:hAnsi="Microsoft Sans Serif" w:cs="Microsoft Sans Serif"/>
-          <w:sz w:val="22"/>
-          <w:szCs w:val="22"/>
-        </w:rPr>
-      </w:r>
-      <w:r>
-        <w:rPr>
-          <w:rFonts w:ascii="Microsoft Sans Serif" w:hAnsi="Microsoft Sans Serif" w:cs="Microsoft Sans Serif"/>
-          <w:sz w:val="22"/>
-          <w:szCs w:val="22"/>
-        </w:rPr>
-      </w:r>
-      <w:r>
-        <w:rPr>
-          <w:rFonts w:ascii="Microsoft Sans Serif" w:hAnsi="Microsoft Sans Serif" w:cs="Microsoft Sans Serif"/>
-          <w:sz w:val="22"/>
-          <w:szCs w:val="22"/>
-        </w:rPr>
-      </w:r>
-      <w:r>
-        <w:rPr>
-          <w:rFonts w:ascii="Microsoft Sans Serif" w:hAnsi="Microsoft Sans Serif" w:cs="Microsoft Sans Serif"/>
-          <w:sz w:val="22"/>
-          <w:szCs w:val="22"/>
-        </w:rPr>
-      </w:r>
-      <w:r>
-        <w:rPr>
-          <w:rFonts w:ascii="Microsoft Sans Serif" w:hAnsi="Microsoft Sans Serif" w:cs="Microsoft Sans Serif"/>
-          <w:sz w:val="22"/>
-          <w:szCs w:val="22"/>
-        </w:rPr>
-      </w:r>
-      <w:r>
-        <w:rPr>
-          <w:rFonts w:ascii="Microsoft Sans Serif" w:hAnsi="Microsoft Sans Serif" w:cs="Microsoft Sans Serif"/>
-          <w:sz w:val="22"/>
-          <w:szCs w:val="22"/>
-        </w:rPr>
-      </w:r>
-      <w:r>
-        <w:rPr>
-          <w:rFonts w:ascii="Microsoft Sans Serif" w:hAnsi="Microsoft Sans Serif" w:cs="Microsoft Sans Serif"/>
-          <w:sz w:val="22"/>
-          <w:szCs w:val="22"/>
-        </w:rPr>
-      </w:r>
-      <w:r>
-        <w:rPr>
-          <w:rFonts w:ascii="Microsoft Sans Serif" w:hAnsi="Microsoft Sans Serif" w:cs="Microsoft Sans Serif"/>
-          <w:sz w:val="22"/>
-          <w:szCs w:val="22"/>
-        </w:rPr>
-      </w:r>
-      <w:r>
-        <w:rPr>
-          <w:rFonts w:ascii="Microsoft Sans Serif" w:hAnsi="Microsoft Sans Serif" w:cs="Microsoft Sans Serif"/>
-          <w:sz w:val="22"/>
-          <w:szCs w:val="22"/>
-        </w:rPr>
-      </w:r>
-      <w:r>
-        <w:rPr>
-          <w:rFonts w:ascii="Microsoft Sans Serif" w:hAnsi="Microsoft Sans Serif" w:cs="Microsoft Sans Serif"/>
-          <w:sz w:val="22"/>
-          <w:szCs w:val="22"/>
-        </w:rPr>
-      </w:r>
-      <w:r>
-        <w:rPr>
-          <w:rFonts w:ascii="Microsoft Sans Serif" w:hAnsi="Microsoft Sans Serif" w:cs="Microsoft Sans Serif"/>
-          <w:sz w:val="22"/>
-          <w:szCs w:val="22"/>
-        </w:rPr>
-      </w:r>
-      <w:r>
-        <w:rPr>
-          <w:rFonts w:ascii="Microsoft Sans Serif" w:hAnsi="Microsoft Sans Serif" w:cs="Microsoft Sans Serif"/>
-          <w:sz w:val="22"/>
-          <w:szCs w:val="22"/>
-        </w:rPr>
-      </w:r>
-      <w:r>
-        <w:rPr>
-          <w:rFonts w:ascii="Microsoft Sans Serif" w:hAnsi="Microsoft Sans Serif" w:cs="Microsoft Sans Serif"/>
-          <w:sz w:val="22"/>
-          <w:szCs w:val="22"/>
-        </w:rPr>
-      </w:r>
-      <w:r>
-        <w:rPr>
-          <w:rFonts w:ascii="Microsoft Sans Serif" w:hAnsi="Microsoft Sans Serif" w:cs="Microsoft Sans Serif"/>
-          <w:sz w:val="22"/>
-          <w:szCs w:val="22"/>
-        </w:rPr>
-      </w:r>
-      <w:r>
-        <w:rPr>
-          <w:rFonts w:ascii="Microsoft Sans Serif" w:hAnsi="Microsoft Sans Serif" w:cs="Microsoft Sans Serif"/>
-          <w:sz w:val="22"/>
-          <w:szCs w:val="22"/>
-        </w:rPr>
-      </w:r>
-      <w:r>
-        <w:rPr>
-          <w:rFonts w:ascii="Microsoft Sans Serif" w:hAnsi="Microsoft Sans Serif" w:cs="Microsoft Sans Serif"/>
-          <w:sz w:val="22"/>
-          <w:szCs w:val="22"/>
-        </w:rPr>
+        <w:t>г</w:t>
+      </w:r>
+      <w:r>
+        <w:rPr>
+          <w:rFonts w:ascii="Microsoft Sans Serif" w:hAnsi="Microsoft Sans Serif" w:cs="Microsoft Sans Serif"/>
+          <w:sz w:val="22"/>
+          <w:szCs w:val="22"/>
+          <w:lang w:val="en-US"/>
+        </w:rPr>
+        <w:t xml:space="preserve">. </w:t>
+      </w:r>
+      <w:proofErr w:type="gramStart"/>
+      <w:r>
+        <w:rPr>
+          <w:rFonts w:ascii="Microsoft Sans Serif" w:hAnsi="Microsoft Sans Serif" w:cs="Microsoft Sans Serif"/>
+          <w:sz w:val="22"/>
+          <w:szCs w:val="22"/>
+          <w:lang w:val="en-US"/>
+        </w:rPr>
+        <w:t xml:space="preserve">{{ </w:t>
+      </w:r>
+      <w:proofErr w:type="spellStart"/>
+      <w:r>
+        <w:rPr>
+          <w:rFonts w:ascii="Microsoft Sans Serif" w:hAnsi="Microsoft Sans Serif" w:cs="Microsoft Sans Serif"/>
+          <w:sz w:val="22"/>
+          <w:szCs w:val="22"/>
+          <w:lang w:val="en-US"/>
+        </w:rPr>
+        <w:t>contract</w:t>
+      </w:r>
+      <w:proofErr w:type="gramEnd"/>
+      <w:r>
+        <w:rPr>
+          <w:rFonts w:ascii="Microsoft Sans Serif" w:hAnsi="Microsoft Sans Serif" w:cs="Microsoft Sans Serif"/>
+          <w:sz w:val="22"/>
+          <w:szCs w:val="22"/>
+          <w:lang w:val="en-US"/>
+        </w:rPr>
+        <w:t>.sign_city</w:t>
+      </w:r>
+      <w:proofErr w:type="spellEnd"/>
+      <w:r>
+        <w:rPr>
+          <w:rFonts w:ascii="Microsoft Sans Serif" w:hAnsi="Microsoft Sans Serif" w:cs="Microsoft Sans Serif"/>
+          <w:sz w:val="22"/>
+          <w:szCs w:val="22"/>
+          <w:lang w:val="en-US"/>
+        </w:rPr>
+        <w:t xml:space="preserve"> }}                                                                                                             {{ </w:t>
+      </w:r>
+      <w:proofErr w:type="spellStart"/>
+      <w:r>
+        <w:rPr>
+          <w:rFonts w:ascii="Microsoft Sans Serif" w:hAnsi="Microsoft Sans Serif" w:cs="Microsoft Sans Serif"/>
+          <w:sz w:val="22"/>
+          <w:szCs w:val="22"/>
+          <w:lang w:val="en-US"/>
+        </w:rPr>
+        <w:t>contract.sign_date_str</w:t>
+      </w:r>
+      <w:proofErr w:type="spellEnd"/>
+      <w:r>
+        <w:rPr>
+          <w:rFonts w:ascii="Microsoft Sans Serif" w:hAnsi="Microsoft Sans Serif" w:cs="Microsoft Sans Serif"/>
+          <w:sz w:val="22"/>
+          <w:szCs w:val="22"/>
+          <w:lang w:val="en-US"/>
+        </w:rPr>
+        <w:t xml:space="preserve"> }}</w:t>
       </w:r>
     </w:p>
     <w:p>
@@ -282,6 +205,7 @@
           <w:rFonts w:ascii="Microsoft Sans Serif" w:hAnsi="Microsoft Sans Serif" w:cs="Microsoft Sans Serif"/>
           <w:sz w:val="22"/>
           <w:szCs w:val="22"/>
+          <w:lang w:val="en-US"/>
         </w:rPr>
       </w:pPr>
     </w:p>
@@ -293,6 +217,7 @@
           <w:rFonts w:ascii="Microsoft Sans Serif" w:hAnsi="Microsoft Sans Serif" w:cs="Microsoft Sans Serif"/>
           <w:sz w:val="22"/>
           <w:szCs w:val="22"/>
+          <w:lang w:val="en-US"/>
         </w:rPr>
       </w:pPr>
       <w:r>
@@ -300,169 +225,605 @@
           <w:rFonts w:ascii="Microsoft Sans Serif" w:hAnsi="Microsoft Sans Serif" w:cs="Microsoft Sans Serif"/>
           <w:sz w:val="22"/>
           <w:szCs w:val="22"/>
-        </w:rPr>
-        <w:t>{{ applicant.citizen_phrase }} {{ applicant.full_name_native }}, именуем{{ applicant.named_suffix }} в дальнейшем "Исполнитель",  с  одной стороны  и {{ company.full_name_ru }}, именуемое в дальнейшем  "Заказчик", в лице {{ company.director_position_ru }}  {{ company.director_full_name_genitive_ru }}, с другой стороны, совместно именуемые "Стороны", по отдельности "Сторона", заключили настоящий Договор о нижеследующем:</w:t>
-      </w:r>
-      <w:r>
-        <w:rPr>
-          <w:rFonts w:ascii="Microsoft Sans Serif" w:hAnsi="Microsoft Sans Serif" w:cs="Microsoft Sans Serif"/>
-          <w:sz w:val="22"/>
-          <w:szCs w:val="22"/>
-        </w:rPr>
-      </w:r>
-      <w:r>
-        <w:rPr>
-          <w:rFonts w:ascii="Microsoft Sans Serif" w:hAnsi="Microsoft Sans Serif" w:cs="Microsoft Sans Serif"/>
-          <w:sz w:val="22"/>
-          <w:szCs w:val="22"/>
-        </w:rPr>
-      </w:r>
-      <w:r>
-        <w:rPr>
-          <w:rFonts w:ascii="Microsoft Sans Serif" w:hAnsi="Microsoft Sans Serif" w:cs="Microsoft Sans Serif"/>
-          <w:sz w:val="22"/>
-          <w:szCs w:val="22"/>
-        </w:rPr>
-      </w:r>
-      <w:r>
-        <w:rPr>
-          <w:rFonts w:ascii="Microsoft Sans Serif" w:hAnsi="Microsoft Sans Serif" w:cs="Microsoft Sans Serif"/>
-          <w:sz w:val="22"/>
-          <w:szCs w:val="22"/>
-        </w:rPr>
-      </w:r>
-      <w:r>
-        <w:rPr>
-          <w:rFonts w:ascii="Microsoft Sans Serif" w:hAnsi="Microsoft Sans Serif" w:cs="Microsoft Sans Serif"/>
-          <w:sz w:val="22"/>
-          <w:szCs w:val="22"/>
-        </w:rPr>
-      </w:r>
-      <w:r>
-        <w:rPr>
-          <w:rFonts w:ascii="Microsoft Sans Serif" w:hAnsi="Microsoft Sans Serif" w:cs="Microsoft Sans Serif"/>
-          <w:sz w:val="22"/>
-          <w:szCs w:val="22"/>
-        </w:rPr>
-      </w:r>
-      <w:r>
-        <w:rPr>
-          <w:rFonts w:ascii="Microsoft Sans Serif" w:hAnsi="Microsoft Sans Serif" w:cs="Microsoft Sans Serif"/>
-          <w:sz w:val="22"/>
-          <w:szCs w:val="22"/>
-        </w:rPr>
-      </w:r>
-      <w:r>
-        <w:rPr>
-          <w:rFonts w:ascii="Microsoft Sans Serif" w:hAnsi="Microsoft Sans Serif" w:cs="Microsoft Sans Serif"/>
-          <w:sz w:val="22"/>
-          <w:szCs w:val="22"/>
-        </w:rPr>
-      </w:r>
-      <w:r>
-        <w:rPr>
-          <w:rFonts w:ascii="Microsoft Sans Serif" w:hAnsi="Microsoft Sans Serif" w:cs="Microsoft Sans Serif"/>
-          <w:sz w:val="22"/>
-          <w:szCs w:val="22"/>
-        </w:rPr>
-      </w:r>
-      <w:r>
-        <w:rPr>
-          <w:rFonts w:ascii="Microsoft Sans Serif" w:hAnsi="Microsoft Sans Serif" w:cs="Microsoft Sans Serif"/>
-          <w:sz w:val="22"/>
-          <w:szCs w:val="22"/>
-        </w:rPr>
-      </w:r>
-      <w:r>
-        <w:rPr>
-          <w:rFonts w:ascii="Microsoft Sans Serif" w:hAnsi="Microsoft Sans Serif" w:cs="Microsoft Sans Serif"/>
-          <w:sz w:val="22"/>
-          <w:szCs w:val="22"/>
-        </w:rPr>
-      </w:r>
-      <w:r>
-        <w:rPr>
-          <w:rFonts w:ascii="Microsoft Sans Serif" w:hAnsi="Microsoft Sans Serif" w:cs="Microsoft Sans Serif"/>
-          <w:sz w:val="22"/>
-          <w:szCs w:val="22"/>
-        </w:rPr>
-      </w:r>
-      <w:r>
-        <w:rPr>
-          <w:rFonts w:ascii="Microsoft Sans Serif" w:hAnsi="Microsoft Sans Serif" w:cs="Microsoft Sans Serif"/>
-          <w:sz w:val="22"/>
-          <w:szCs w:val="22"/>
-        </w:rPr>
-      </w:r>
-      <w:r>
-        <w:rPr>
-          <w:rFonts w:ascii="Microsoft Sans Serif" w:hAnsi="Microsoft Sans Serif" w:cs="Microsoft Sans Serif"/>
-          <w:sz w:val="22"/>
-          <w:szCs w:val="22"/>
-        </w:rPr>
-      </w:r>
-      <w:r>
-        <w:rPr>
-          <w:rFonts w:ascii="Microsoft Sans Serif" w:hAnsi="Microsoft Sans Serif" w:cs="Microsoft Sans Serif"/>
-          <w:sz w:val="22"/>
-          <w:szCs w:val="22"/>
-        </w:rPr>
-      </w:r>
-      <w:r>
-        <w:rPr>
-          <w:rFonts w:ascii="Microsoft Sans Serif" w:hAnsi="Microsoft Sans Serif" w:cs="Microsoft Sans Serif"/>
-          <w:sz w:val="22"/>
-          <w:szCs w:val="22"/>
-        </w:rPr>
-      </w:r>
-      <w:r>
-        <w:rPr>
-          <w:rFonts w:ascii="Microsoft Sans Serif" w:hAnsi="Microsoft Sans Serif" w:cs="Microsoft Sans Serif"/>
-          <w:sz w:val="22"/>
-          <w:szCs w:val="22"/>
-        </w:rPr>
-      </w:r>
-      <w:r>
-        <w:rPr>
-          <w:rFonts w:ascii="Microsoft Sans Serif" w:hAnsi="Microsoft Sans Serif" w:cs="Microsoft Sans Serif"/>
-          <w:sz w:val="22"/>
-          <w:szCs w:val="22"/>
-        </w:rPr>
-      </w:r>
-      <w:r>
-        <w:rPr>
-          <w:rFonts w:ascii="Microsoft Sans Serif" w:hAnsi="Microsoft Sans Serif" w:cs="Microsoft Sans Serif"/>
-          <w:sz w:val="22"/>
-          <w:szCs w:val="22"/>
-        </w:rPr>
-      </w:r>
-      <w:r>
-        <w:rPr>
-          <w:rFonts w:ascii="Microsoft Sans Serif" w:hAnsi="Microsoft Sans Serif" w:cs="Microsoft Sans Serif"/>
-          <w:sz w:val="22"/>
-          <w:szCs w:val="22"/>
-        </w:rPr>
-      </w:r>
-      <w:r>
-        <w:rPr>
-          <w:rFonts w:ascii="Microsoft Sans Serif" w:hAnsi="Microsoft Sans Serif" w:cs="Microsoft Sans Serif"/>
-          <w:sz w:val="22"/>
-          <w:szCs w:val="22"/>
-        </w:rPr>
-      </w:r>
-      <w:r>
-        <w:rPr>
-          <w:rFonts w:ascii="Microsoft Sans Serif" w:hAnsi="Microsoft Sans Serif" w:cs="Microsoft Sans Serif"/>
-          <w:sz w:val="22"/>
-          <w:szCs w:val="22"/>
-        </w:rPr>
-      </w:r>
-      <w:r>
-        <w:rPr>
-          <w:rFonts w:ascii="Microsoft Sans Serif" w:hAnsi="Microsoft Sans Serif" w:cs="Microsoft Sans Serif"/>
-          <w:sz w:val="22"/>
-          <w:szCs w:val="22"/>
-        </w:rPr>
+          <w:lang w:val="en-US"/>
+        </w:rPr>
+        <w:t xml:space="preserve">{{ </w:t>
+      </w:r>
+      <w:proofErr w:type="spellStart"/>
+      <w:r>
+        <w:rPr>
+          <w:rFonts w:ascii="Microsoft Sans Serif" w:hAnsi="Microsoft Sans Serif" w:cs="Microsoft Sans Serif"/>
+          <w:sz w:val="22"/>
+          <w:szCs w:val="22"/>
+          <w:lang w:val="en-US"/>
+        </w:rPr>
+        <w:t>applicant.citizen_phrase</w:t>
+      </w:r>
+      <w:proofErr w:type="spellEnd"/>
+      <w:r>
+        <w:rPr>
+          <w:rFonts w:ascii="Microsoft Sans Serif" w:hAnsi="Microsoft Sans Serif" w:cs="Microsoft Sans Serif"/>
+          <w:sz w:val="22"/>
+          <w:szCs w:val="22"/>
+          <w:lang w:val="en-US"/>
+        </w:rPr>
+        <w:t xml:space="preserve"> }} {{ </w:t>
+      </w:r>
+      <w:proofErr w:type="spellStart"/>
+      <w:r>
+        <w:rPr>
+          <w:rFonts w:ascii="Microsoft Sans Serif" w:hAnsi="Microsoft Sans Serif" w:cs="Microsoft Sans Serif"/>
+          <w:sz w:val="22"/>
+          <w:szCs w:val="22"/>
+          <w:lang w:val="en-US"/>
+        </w:rPr>
+        <w:t>applicant.full_name_native</w:t>
+      </w:r>
+      <w:proofErr w:type="spellEnd"/>
+      <w:r>
+        <w:rPr>
+          <w:rFonts w:ascii="Microsoft Sans Serif" w:hAnsi="Microsoft Sans Serif" w:cs="Microsoft Sans Serif"/>
+          <w:sz w:val="22"/>
+          <w:szCs w:val="22"/>
+          <w:lang w:val="en-US"/>
+        </w:rPr>
+        <w:t xml:space="preserve"> }}, </w:t>
+      </w:r>
+      <w:r>
+        <w:rPr>
+          <w:rFonts w:ascii="Microsoft Sans Serif" w:hAnsi="Microsoft Sans Serif" w:cs="Microsoft Sans Serif"/>
+          <w:sz w:val="22"/>
+          <w:szCs w:val="22"/>
+        </w:rPr>
+        <w:t>именуем</w:t>
+      </w:r>
+      <w:r>
+        <w:rPr>
+          <w:rFonts w:ascii="Microsoft Sans Serif" w:hAnsi="Microsoft Sans Serif" w:cs="Microsoft Sans Serif"/>
+          <w:sz w:val="22"/>
+          <w:szCs w:val="22"/>
+          <w:lang w:val="en-US"/>
+        </w:rPr>
+        <w:t xml:space="preserve">{{ </w:t>
+      </w:r>
+      <w:proofErr w:type="spellStart"/>
+      <w:r>
+        <w:rPr>
+          <w:rFonts w:ascii="Microsoft Sans Serif" w:hAnsi="Microsoft Sans Serif" w:cs="Microsoft Sans Serif"/>
+          <w:sz w:val="22"/>
+          <w:szCs w:val="22"/>
+          <w:lang w:val="en-US"/>
+        </w:rPr>
+        <w:t>applicant.named_suffix</w:t>
+      </w:r>
+      <w:proofErr w:type="spellEnd"/>
+      <w:r>
+        <w:rPr>
+          <w:rFonts w:ascii="Microsoft Sans Serif" w:hAnsi="Microsoft Sans Serif" w:cs="Microsoft Sans Serif"/>
+          <w:sz w:val="22"/>
+          <w:szCs w:val="22"/>
+          <w:lang w:val="en-US"/>
+        </w:rPr>
+        <w:t xml:space="preserve"> }} </w:t>
+      </w:r>
+      <w:r>
+        <w:rPr>
+          <w:rFonts w:ascii="Microsoft Sans Serif" w:hAnsi="Microsoft Sans Serif" w:cs="Microsoft Sans Serif"/>
+          <w:sz w:val="22"/>
+          <w:szCs w:val="22"/>
+        </w:rPr>
+        <w:t>в</w:t>
+      </w:r>
+      <w:r>
+        <w:rPr>
+          <w:rFonts w:ascii="Microsoft Sans Serif" w:hAnsi="Microsoft Sans Serif" w:cs="Microsoft Sans Serif"/>
+          <w:sz w:val="22"/>
+          <w:szCs w:val="22"/>
+          <w:lang w:val="en-US"/>
+        </w:rPr>
+        <w:t xml:space="preserve"> </w:t>
+      </w:r>
+      <w:r>
+        <w:rPr>
+          <w:rFonts w:ascii="Microsoft Sans Serif" w:hAnsi="Microsoft Sans Serif" w:cs="Microsoft Sans Serif"/>
+          <w:sz w:val="22"/>
+          <w:szCs w:val="22"/>
+        </w:rPr>
+        <w:t>дальнейшем</w:t>
+      </w:r>
+      <w:r>
+        <w:rPr>
+          <w:rFonts w:ascii="Microsoft Sans Serif" w:hAnsi="Microsoft Sans Serif" w:cs="Microsoft Sans Serif"/>
+          <w:sz w:val="22"/>
+          <w:szCs w:val="22"/>
+          <w:lang w:val="en-US"/>
+        </w:rPr>
+        <w:t xml:space="preserve"> "</w:t>
+      </w:r>
+      <w:r>
+        <w:rPr>
+          <w:rFonts w:ascii="Microsoft Sans Serif" w:hAnsi="Microsoft Sans Serif" w:cs="Microsoft Sans Serif"/>
+          <w:sz w:val="22"/>
+          <w:szCs w:val="22"/>
+        </w:rPr>
+        <w:t>Исполнитель</w:t>
+      </w:r>
+      <w:r>
+        <w:rPr>
+          <w:rFonts w:ascii="Microsoft Sans Serif" w:hAnsi="Microsoft Sans Serif" w:cs="Microsoft Sans Serif"/>
+          <w:sz w:val="22"/>
+          <w:szCs w:val="22"/>
+          <w:lang w:val="en-US"/>
+        </w:rPr>
+        <w:t xml:space="preserve">",  </w:t>
+      </w:r>
+      <w:r>
+        <w:rPr>
+          <w:rFonts w:ascii="Microsoft Sans Serif" w:hAnsi="Microsoft Sans Serif" w:cs="Microsoft Sans Serif"/>
+          <w:sz w:val="22"/>
+          <w:szCs w:val="22"/>
+        </w:rPr>
+        <w:t>с</w:t>
+      </w:r>
+      <w:r>
+        <w:rPr>
+          <w:rFonts w:ascii="Microsoft Sans Serif" w:hAnsi="Microsoft Sans Serif" w:cs="Microsoft Sans Serif"/>
+          <w:sz w:val="22"/>
+          <w:szCs w:val="22"/>
+          <w:lang w:val="en-US"/>
+        </w:rPr>
+        <w:t xml:space="preserve">  </w:t>
+      </w:r>
+      <w:r>
+        <w:rPr>
+          <w:rFonts w:ascii="Microsoft Sans Serif" w:hAnsi="Microsoft Sans Serif" w:cs="Microsoft Sans Serif"/>
+          <w:sz w:val="22"/>
+          <w:szCs w:val="22"/>
+        </w:rPr>
+        <w:t>одной</w:t>
+      </w:r>
+      <w:r>
+        <w:rPr>
+          <w:rFonts w:ascii="Microsoft Sans Serif" w:hAnsi="Microsoft Sans Serif" w:cs="Microsoft Sans Serif"/>
+          <w:sz w:val="22"/>
+          <w:szCs w:val="22"/>
+          <w:lang w:val="en-US"/>
+        </w:rPr>
+        <w:t xml:space="preserve"> </w:t>
+      </w:r>
+      <w:r>
+        <w:rPr>
+          <w:rFonts w:ascii="Microsoft Sans Serif" w:hAnsi="Microsoft Sans Serif" w:cs="Microsoft Sans Serif"/>
+          <w:sz w:val="22"/>
+          <w:szCs w:val="22"/>
+        </w:rPr>
+        <w:t>стороны</w:t>
+      </w:r>
+      <w:r>
+        <w:rPr>
+          <w:rFonts w:ascii="Microsoft Sans Serif" w:hAnsi="Microsoft Sans Serif" w:cs="Microsoft Sans Serif"/>
+          <w:sz w:val="22"/>
+          <w:szCs w:val="22"/>
+          <w:lang w:val="en-US"/>
+        </w:rPr>
+        <w:t xml:space="preserve">  </w:t>
+      </w:r>
+      <w:r>
+        <w:rPr>
+          <w:rFonts w:ascii="Microsoft Sans Serif" w:hAnsi="Microsoft Sans Serif" w:cs="Microsoft Sans Serif"/>
+          <w:sz w:val="22"/>
+          <w:szCs w:val="22"/>
+        </w:rPr>
+        <w:t>и</w:t>
+      </w:r>
+      <w:r>
+        <w:rPr>
+          <w:rFonts w:ascii="Microsoft Sans Serif" w:hAnsi="Microsoft Sans Serif" w:cs="Microsoft Sans Serif"/>
+          <w:sz w:val="22"/>
+          <w:szCs w:val="22"/>
+          <w:lang w:val="en-US"/>
+        </w:rPr>
+        <w:t xml:space="preserve"> {{ </w:t>
+      </w:r>
+      <w:proofErr w:type="spellStart"/>
+      <w:r>
+        <w:rPr>
+          <w:rFonts w:ascii="Microsoft Sans Serif" w:hAnsi="Microsoft Sans Serif" w:cs="Microsoft Sans Serif"/>
+          <w:sz w:val="22"/>
+          <w:szCs w:val="22"/>
+          <w:lang w:val="en-US"/>
+        </w:rPr>
+        <w:t>company.full_name_ru</w:t>
+      </w:r>
+      <w:proofErr w:type="spellEnd"/>
+      <w:r>
+        <w:rPr>
+          <w:rFonts w:ascii="Microsoft Sans Serif" w:hAnsi="Microsoft Sans Serif" w:cs="Microsoft Sans Serif"/>
+          <w:sz w:val="22"/>
+          <w:szCs w:val="22"/>
+          <w:lang w:val="en-US"/>
+        </w:rPr>
+        <w:t xml:space="preserve"> }}, </w:t>
+      </w:r>
+      <w:r>
+        <w:rPr>
+          <w:rFonts w:ascii="Microsoft Sans Serif" w:hAnsi="Microsoft Sans Serif" w:cs="Microsoft Sans Serif"/>
+          <w:sz w:val="22"/>
+          <w:szCs w:val="22"/>
+        </w:rPr>
+        <w:t>именуемое</w:t>
+      </w:r>
+      <w:r>
+        <w:rPr>
+          <w:rFonts w:ascii="Microsoft Sans Serif" w:hAnsi="Microsoft Sans Serif" w:cs="Microsoft Sans Serif"/>
+          <w:sz w:val="22"/>
+          <w:szCs w:val="22"/>
+          <w:lang w:val="en-US"/>
+        </w:rPr>
+        <w:t xml:space="preserve"> </w:t>
+      </w:r>
+      <w:r>
+        <w:rPr>
+          <w:rFonts w:ascii="Microsoft Sans Serif" w:hAnsi="Microsoft Sans Serif" w:cs="Microsoft Sans Serif"/>
+          <w:sz w:val="22"/>
+          <w:szCs w:val="22"/>
+        </w:rPr>
+        <w:t>в</w:t>
+      </w:r>
+      <w:r>
+        <w:rPr>
+          <w:rFonts w:ascii="Microsoft Sans Serif" w:hAnsi="Microsoft Sans Serif" w:cs="Microsoft Sans Serif"/>
+          <w:sz w:val="22"/>
+          <w:szCs w:val="22"/>
+          <w:lang w:val="en-US"/>
+        </w:rPr>
+        <w:t xml:space="preserve"> </w:t>
+      </w:r>
+      <w:r>
+        <w:rPr>
+          <w:rFonts w:ascii="Microsoft Sans Serif" w:hAnsi="Microsoft Sans Serif" w:cs="Microsoft Sans Serif"/>
+          <w:sz w:val="22"/>
+          <w:szCs w:val="22"/>
+        </w:rPr>
+        <w:t>дальнейшем</w:t>
+      </w:r>
+      <w:r>
+        <w:rPr>
+          <w:rFonts w:ascii="Microsoft Sans Serif" w:hAnsi="Microsoft Sans Serif" w:cs="Microsoft Sans Serif"/>
+          <w:sz w:val="22"/>
+          <w:szCs w:val="22"/>
+          <w:lang w:val="en-US"/>
+        </w:rPr>
+        <w:t xml:space="preserve">  "</w:t>
+      </w:r>
+      <w:r>
+        <w:rPr>
+          <w:rFonts w:ascii="Microsoft Sans Serif" w:hAnsi="Microsoft Sans Serif" w:cs="Microsoft Sans Serif"/>
+          <w:sz w:val="22"/>
+          <w:szCs w:val="22"/>
+        </w:rPr>
+        <w:t>Заказчик</w:t>
+      </w:r>
+      <w:r>
+        <w:rPr>
+          <w:rFonts w:ascii="Microsoft Sans Serif" w:hAnsi="Microsoft Sans Serif" w:cs="Microsoft Sans Serif"/>
+          <w:sz w:val="22"/>
+          <w:szCs w:val="22"/>
+          <w:lang w:val="en-US"/>
+        </w:rPr>
+        <w:t xml:space="preserve">", </w:t>
+      </w:r>
+      <w:r>
+        <w:rPr>
+          <w:rFonts w:ascii="Microsoft Sans Serif" w:hAnsi="Microsoft Sans Serif" w:cs="Microsoft Sans Serif"/>
+          <w:sz w:val="22"/>
+          <w:szCs w:val="22"/>
+        </w:rPr>
+        <w:t>в</w:t>
+      </w:r>
+      <w:r>
+        <w:rPr>
+          <w:rFonts w:ascii="Microsoft Sans Serif" w:hAnsi="Microsoft Sans Serif" w:cs="Microsoft Sans Serif"/>
+          <w:sz w:val="22"/>
+          <w:szCs w:val="22"/>
+          <w:lang w:val="en-US"/>
+        </w:rPr>
+        <w:t xml:space="preserve"> </w:t>
+      </w:r>
+      <w:r>
+        <w:rPr>
+          <w:rFonts w:ascii="Microsoft Sans Serif" w:hAnsi="Microsoft Sans Serif" w:cs="Microsoft Sans Serif"/>
+          <w:sz w:val="22"/>
+          <w:szCs w:val="22"/>
+        </w:rPr>
+        <w:t>лице</w:t>
+      </w:r>
+      <w:r>
+        <w:rPr>
+          <w:rFonts w:ascii="Microsoft Sans Serif" w:hAnsi="Microsoft Sans Serif" w:cs="Microsoft Sans Serif"/>
+          <w:sz w:val="22"/>
+          <w:szCs w:val="22"/>
+          <w:lang w:val="en-US"/>
+        </w:rPr>
+        <w:t xml:space="preserve"> {{ </w:t>
+      </w:r>
+      <w:proofErr w:type="spellStart"/>
+      <w:r>
+        <w:rPr>
+          <w:rFonts w:ascii="Microsoft Sans Serif" w:hAnsi="Microsoft Sans Serif" w:cs="Microsoft Sans Serif"/>
+          <w:sz w:val="22"/>
+          <w:szCs w:val="22"/>
+          <w:lang w:val="en-US"/>
+        </w:rPr>
+        <w:t>company.director_position_ru</w:t>
+      </w:r>
+      <w:proofErr w:type="spellEnd"/>
+      <w:r>
+        <w:rPr>
+          <w:rFonts w:ascii="Microsoft Sans Serif" w:hAnsi="Microsoft Sans Serif" w:cs="Microsoft Sans Serif"/>
+          <w:sz w:val="22"/>
+          <w:szCs w:val="22"/>
+          <w:lang w:val="en-US"/>
+        </w:rPr>
+        <w:t xml:space="preserve"> }}  {{ </w:t>
+      </w:r>
+      <w:proofErr w:type="spellStart"/>
+      <w:r>
+        <w:rPr>
+          <w:rFonts w:ascii="Microsoft Sans Serif" w:hAnsi="Microsoft Sans Serif" w:cs="Microsoft Sans Serif"/>
+          <w:sz w:val="22"/>
+          <w:szCs w:val="22"/>
+          <w:lang w:val="en-US"/>
+        </w:rPr>
+        <w:t>company.director_full_name_genitive_ru</w:t>
+      </w:r>
+      <w:proofErr w:type="spellEnd"/>
+      <w:r>
+        <w:rPr>
+          <w:rFonts w:ascii="Microsoft Sans Serif" w:hAnsi="Microsoft Sans Serif" w:cs="Microsoft Sans Serif"/>
+          <w:sz w:val="22"/>
+          <w:szCs w:val="22"/>
+          <w:lang w:val="en-US"/>
+        </w:rPr>
+        <w:t xml:space="preserve"> }}, </w:t>
+      </w:r>
+      <w:r>
+        <w:rPr>
+          <w:rFonts w:ascii="Microsoft Sans Serif" w:hAnsi="Microsoft Sans Serif" w:cs="Microsoft Sans Serif"/>
+          <w:sz w:val="22"/>
+          <w:szCs w:val="22"/>
+        </w:rPr>
+        <w:t>с</w:t>
+      </w:r>
+      <w:r>
+        <w:rPr>
+          <w:rFonts w:ascii="Microsoft Sans Serif" w:hAnsi="Microsoft Sans Serif" w:cs="Microsoft Sans Serif"/>
+          <w:sz w:val="22"/>
+          <w:szCs w:val="22"/>
+          <w:lang w:val="en-US"/>
+        </w:rPr>
+        <w:t xml:space="preserve"> </w:t>
+      </w:r>
+      <w:r>
+        <w:rPr>
+          <w:rFonts w:ascii="Microsoft Sans Serif" w:hAnsi="Microsoft Sans Serif" w:cs="Microsoft Sans Serif"/>
+          <w:sz w:val="22"/>
+          <w:szCs w:val="22"/>
+        </w:rPr>
+        <w:t>другой</w:t>
+      </w:r>
+      <w:r>
+        <w:rPr>
+          <w:rFonts w:ascii="Microsoft Sans Serif" w:hAnsi="Microsoft Sans Serif" w:cs="Microsoft Sans Serif"/>
+          <w:sz w:val="22"/>
+          <w:szCs w:val="22"/>
+          <w:lang w:val="en-US"/>
+        </w:rPr>
+        <w:t xml:space="preserve"> </w:t>
+      </w:r>
+      <w:r>
+        <w:rPr>
+          <w:rFonts w:ascii="Microsoft Sans Serif" w:hAnsi="Microsoft Sans Serif" w:cs="Microsoft Sans Serif"/>
+          <w:sz w:val="22"/>
+          <w:szCs w:val="22"/>
+        </w:rPr>
+        <w:t>стороны</w:t>
+      </w:r>
+      <w:r>
+        <w:rPr>
+          <w:rFonts w:ascii="Microsoft Sans Serif" w:hAnsi="Microsoft Sans Serif" w:cs="Microsoft Sans Serif"/>
+          <w:sz w:val="22"/>
+          <w:szCs w:val="22"/>
+          <w:lang w:val="en-US"/>
+        </w:rPr>
+        <w:t xml:space="preserve">, </w:t>
+      </w:r>
+      <w:r>
+        <w:rPr>
+          <w:rFonts w:ascii="Microsoft Sans Serif" w:hAnsi="Microsoft Sans Serif" w:cs="Microsoft Sans Serif"/>
+          <w:sz w:val="22"/>
+          <w:szCs w:val="22"/>
+        </w:rPr>
+        <w:t>совместно</w:t>
+      </w:r>
+      <w:r>
+        <w:rPr>
+          <w:rFonts w:ascii="Microsoft Sans Serif" w:hAnsi="Microsoft Sans Serif" w:cs="Microsoft Sans Serif"/>
+          <w:sz w:val="22"/>
+          <w:szCs w:val="22"/>
+          <w:lang w:val="en-US"/>
+        </w:rPr>
+        <w:t xml:space="preserve"> </w:t>
+      </w:r>
+      <w:r>
+        <w:rPr>
+          <w:rFonts w:ascii="Microsoft Sans Serif" w:hAnsi="Microsoft Sans Serif" w:cs="Microsoft Sans Serif"/>
+          <w:sz w:val="22"/>
+          <w:szCs w:val="22"/>
+        </w:rPr>
+        <w:t>именуемые</w:t>
+      </w:r>
+      <w:r>
+        <w:rPr>
+          <w:rFonts w:ascii="Microsoft Sans Serif" w:hAnsi="Microsoft Sans Serif" w:cs="Microsoft Sans Serif"/>
+          <w:sz w:val="22"/>
+          <w:szCs w:val="22"/>
+          <w:lang w:val="en-US"/>
+        </w:rPr>
+        <w:t xml:space="preserve"> "</w:t>
+      </w:r>
+      <w:r>
+        <w:rPr>
+          <w:rFonts w:ascii="Microsoft Sans Serif" w:hAnsi="Microsoft Sans Serif" w:cs="Microsoft Sans Serif"/>
+          <w:sz w:val="22"/>
+          <w:szCs w:val="22"/>
+        </w:rPr>
+        <w:t>Стороны</w:t>
+      </w:r>
+      <w:r>
+        <w:rPr>
+          <w:rFonts w:ascii="Microsoft Sans Serif" w:hAnsi="Microsoft Sans Serif" w:cs="Microsoft Sans Serif"/>
+          <w:sz w:val="22"/>
+          <w:szCs w:val="22"/>
+          <w:lang w:val="en-US"/>
+        </w:rPr>
+        <w:t xml:space="preserve">", </w:t>
+      </w:r>
+      <w:r>
+        <w:rPr>
+          <w:rFonts w:ascii="Microsoft Sans Serif" w:hAnsi="Microsoft Sans Serif" w:cs="Microsoft Sans Serif"/>
+          <w:sz w:val="22"/>
+          <w:szCs w:val="22"/>
+        </w:rPr>
+        <w:t>по</w:t>
+      </w:r>
+      <w:r>
+        <w:rPr>
+          <w:rFonts w:ascii="Microsoft Sans Serif" w:hAnsi="Microsoft Sans Serif" w:cs="Microsoft Sans Serif"/>
+          <w:sz w:val="22"/>
+          <w:szCs w:val="22"/>
+          <w:lang w:val="en-US"/>
+        </w:rPr>
+        <w:t xml:space="preserve"> </w:t>
+      </w:r>
+      <w:r>
+        <w:rPr>
+          <w:rFonts w:ascii="Microsoft Sans Serif" w:hAnsi="Microsoft Sans Serif" w:cs="Microsoft Sans Serif"/>
+          <w:sz w:val="22"/>
+          <w:szCs w:val="22"/>
+        </w:rPr>
+        <w:t>отдельности</w:t>
+      </w:r>
+      <w:r>
+        <w:rPr>
+          <w:rFonts w:ascii="Microsoft Sans Serif" w:hAnsi="Microsoft Sans Serif" w:cs="Microsoft Sans Serif"/>
+          <w:sz w:val="22"/>
+          <w:szCs w:val="22"/>
+          <w:lang w:val="en-US"/>
+        </w:rPr>
+        <w:t xml:space="preserve"> "</w:t>
+      </w:r>
+      <w:r>
+        <w:rPr>
+          <w:rFonts w:ascii="Microsoft Sans Serif" w:hAnsi="Microsoft Sans Serif" w:cs="Microsoft Sans Serif"/>
+          <w:sz w:val="22"/>
+          <w:szCs w:val="22"/>
+        </w:rPr>
+        <w:t>Сторона</w:t>
+      </w:r>
+      <w:r>
+        <w:rPr>
+          <w:rFonts w:ascii="Microsoft Sans Serif" w:hAnsi="Microsoft Sans Serif" w:cs="Microsoft Sans Serif"/>
+          <w:sz w:val="22"/>
+          <w:szCs w:val="22"/>
+          <w:lang w:val="en-US"/>
+        </w:rPr>
+        <w:t xml:space="preserve">", </w:t>
+      </w:r>
+      <w:r>
+        <w:rPr>
+          <w:rFonts w:ascii="Microsoft Sans Serif" w:hAnsi="Microsoft Sans Serif" w:cs="Microsoft Sans Serif"/>
+          <w:sz w:val="22"/>
+          <w:szCs w:val="22"/>
+        </w:rPr>
+        <w:t>заключили</w:t>
+      </w:r>
+      <w:r>
+        <w:rPr>
+          <w:rFonts w:ascii="Microsoft Sans Serif" w:hAnsi="Microsoft Sans Serif" w:cs="Microsoft Sans Serif"/>
+          <w:sz w:val="22"/>
+          <w:szCs w:val="22"/>
+          <w:lang w:val="en-US"/>
+        </w:rPr>
+        <w:t xml:space="preserve"> </w:t>
+      </w:r>
+      <w:r>
+        <w:rPr>
+          <w:rFonts w:ascii="Microsoft Sans Serif" w:hAnsi="Microsoft Sans Serif" w:cs="Microsoft Sans Serif"/>
+          <w:sz w:val="22"/>
+          <w:szCs w:val="22"/>
+        </w:rPr>
+        <w:t>настоящий</w:t>
+      </w:r>
+      <w:r>
+        <w:rPr>
+          <w:rFonts w:ascii="Microsoft Sans Serif" w:hAnsi="Microsoft Sans Serif" w:cs="Microsoft Sans Serif"/>
+          <w:sz w:val="22"/>
+          <w:szCs w:val="22"/>
+          <w:lang w:val="en-US"/>
+        </w:rPr>
+        <w:t xml:space="preserve"> </w:t>
+      </w:r>
+      <w:r>
+        <w:rPr>
+          <w:rFonts w:ascii="Microsoft Sans Serif" w:hAnsi="Microsoft Sans Serif" w:cs="Microsoft Sans Serif"/>
+          <w:sz w:val="22"/>
+          <w:szCs w:val="22"/>
+        </w:rPr>
+        <w:t>Договор</w:t>
+      </w:r>
+      <w:r>
+        <w:rPr>
+          <w:rFonts w:ascii="Microsoft Sans Serif" w:hAnsi="Microsoft Sans Serif" w:cs="Microsoft Sans Serif"/>
+          <w:sz w:val="22"/>
+          <w:szCs w:val="22"/>
+          <w:lang w:val="en-US"/>
+        </w:rPr>
+        <w:t xml:space="preserve"> </w:t>
+      </w:r>
+      <w:r>
+        <w:rPr>
+          <w:rFonts w:ascii="Microsoft Sans Serif" w:hAnsi="Microsoft Sans Serif" w:cs="Microsoft Sans Serif"/>
+          <w:sz w:val="22"/>
+          <w:szCs w:val="22"/>
+        </w:rPr>
+        <w:t>о</w:t>
+      </w:r>
+      <w:r>
+        <w:rPr>
+          <w:rFonts w:ascii="Microsoft Sans Serif" w:hAnsi="Microsoft Sans Serif" w:cs="Microsoft Sans Serif"/>
+          <w:sz w:val="22"/>
+          <w:szCs w:val="22"/>
+          <w:lang w:val="en-US"/>
+        </w:rPr>
+        <w:t xml:space="preserve"> </w:t>
+      </w:r>
+      <w:r>
+        <w:rPr>
+          <w:rFonts w:ascii="Microsoft Sans Serif" w:hAnsi="Microsoft Sans Serif" w:cs="Microsoft Sans Serif"/>
+          <w:sz w:val="22"/>
+          <w:szCs w:val="22"/>
+        </w:rPr>
+        <w:t>нижеследующем</w:t>
+      </w:r>
+      <w:r>
+        <w:rPr>
+          <w:rFonts w:ascii="Microsoft Sans Serif" w:hAnsi="Microsoft Sans Serif" w:cs="Microsoft Sans Serif"/>
+          <w:sz w:val="22"/>
+          <w:szCs w:val="22"/>
+          <w:lang w:val="en-US"/>
+        </w:rPr>
+        <w:t>:</w:t>
       </w:r>
     </w:p>
     <w:p>
@@ -473,6 +834,7 @@
           <w:rFonts w:ascii="Microsoft Sans Serif" w:hAnsi="Microsoft Sans Serif" w:cs="Microsoft Sans Serif"/>
           <w:sz w:val="22"/>
           <w:szCs w:val="22"/>
+          <w:lang w:val="en-US"/>
         </w:rPr>
       </w:pPr>
     </w:p>
@@ -526,71 +888,43 @@
           <w:sz w:val="22"/>
           <w:szCs w:val="22"/>
         </w:rPr>
-        <w:t>Исполнитель обязуется по заданию Заказчика оказать услуги {{ position.title_ru }} (далее - Услуги):</w:t>
-      </w:r>
-      <w:r>
-        <w:rPr>
-          <w:rFonts w:ascii="Microsoft Sans Serif" w:hAnsi="Microsoft Sans Serif" w:cs="Microsoft Sans Serif"/>
-          <w:color w:val="EE0000"/>
-          <w:sz w:val="22"/>
-          <w:szCs w:val="22"/>
-        </w:rPr>
-      </w:r>
-      <w:r>
-        <w:rPr>
-          <w:rFonts w:ascii="Microsoft Sans Serif" w:hAnsi="Microsoft Sans Serif" w:cs="Microsoft Sans Serif"/>
-          <w:sz w:val="22"/>
-          <w:szCs w:val="22"/>
-        </w:rPr>
-      </w:r>
-      <w:r>
-        <w:rPr>
-          <w:rFonts w:ascii="Microsoft Sans Serif" w:hAnsi="Microsoft Sans Serif" w:cs="Microsoft Sans Serif"/>
-          <w:sz w:val="22"/>
-          <w:szCs w:val="22"/>
-        </w:rPr>
-      </w:r>
-      <w:r>
-        <w:rPr>
-          <w:rFonts w:ascii="Microsoft Sans Serif" w:hAnsi="Microsoft Sans Serif" w:cs="Microsoft Sans Serif"/>
-          <w:sz w:val="22"/>
-          <w:szCs w:val="22"/>
-        </w:rPr>
-      </w:r>
-      <w:r>
-        <w:rPr>
-          <w:rFonts w:ascii="Microsoft Sans Serif" w:hAnsi="Microsoft Sans Serif" w:cs="Microsoft Sans Serif"/>
-          <w:sz w:val="22"/>
-          <w:szCs w:val="22"/>
-        </w:rPr>
-      </w:r>
-      <w:r>
-        <w:rPr>
-          <w:rFonts w:ascii="Microsoft Sans Serif" w:hAnsi="Microsoft Sans Serif" w:cs="Microsoft Sans Serif"/>
-          <w:sz w:val="22"/>
-          <w:szCs w:val="22"/>
-        </w:rPr>
-      </w:r>
-      <w:r>
-        <w:rPr>
-          <w:rFonts w:ascii="Microsoft Sans Serif" w:hAnsi="Microsoft Sans Serif" w:cs="Microsoft Sans Serif"/>
-          <w:sz w:val="22"/>
-          <w:szCs w:val="22"/>
-        </w:rPr>
-      </w:r>
-      <w:r>
-        <w:rPr>
-          <w:rFonts w:ascii="Microsoft Sans Serif" w:hAnsi="Microsoft Sans Serif" w:cs="Microsoft Sans Serif"/>
-          <w:sz w:val="22"/>
-          <w:szCs w:val="22"/>
-        </w:rPr>
-      </w:r>
-      <w:r>
-        <w:rPr>
-          <w:rFonts w:ascii="Microsoft Sans Serif" w:hAnsi="Microsoft Sans Serif" w:cs="Microsoft Sans Serif"/>
-          <w:sz w:val="22"/>
-          <w:szCs w:val="22"/>
-        </w:rPr>
+        <w:t xml:space="preserve">Исполнитель обязуется по заданию Заказчика оказать услуги </w:t>
+      </w:r>
+      <w:proofErr w:type="gramStart"/>
+      <w:r>
+        <w:rPr>
+          <w:rFonts w:ascii="Microsoft Sans Serif" w:hAnsi="Microsoft Sans Serif" w:cs="Microsoft Sans Serif"/>
+          <w:sz w:val="22"/>
+          <w:szCs w:val="22"/>
+        </w:rPr>
+        <w:t xml:space="preserve">{{ </w:t>
+      </w:r>
+      <w:proofErr w:type="spellStart"/>
+      <w:r>
+        <w:rPr>
+          <w:rFonts w:ascii="Microsoft Sans Serif" w:hAnsi="Microsoft Sans Serif" w:cs="Microsoft Sans Serif"/>
+          <w:sz w:val="22"/>
+          <w:szCs w:val="22"/>
+        </w:rPr>
+        <w:t>position</w:t>
+      </w:r>
+      <w:proofErr w:type="gramEnd"/>
+      <w:r>
+        <w:rPr>
+          <w:rFonts w:ascii="Microsoft Sans Serif" w:hAnsi="Microsoft Sans Serif" w:cs="Microsoft Sans Serif"/>
+          <w:sz w:val="22"/>
+          <w:szCs w:val="22"/>
+        </w:rPr>
+        <w:t>.title_ru</w:t>
+      </w:r>
+      <w:proofErr w:type="spellEnd"/>
+      <w:r>
+        <w:rPr>
+          <w:rFonts w:ascii="Microsoft Sans Serif" w:hAnsi="Microsoft Sans Serif" w:cs="Microsoft Sans Serif"/>
+          <w:sz w:val="22"/>
+          <w:szCs w:val="22"/>
+        </w:rPr>
+        <w:t xml:space="preserve"> }} (далее - Услуги):</w:t>
       </w:r>
     </w:p>
     <w:p>
@@ -628,7 +962,43 @@
           <w:sz w:val="22"/>
           <w:szCs w:val="22"/>
         </w:rPr>
-        <w:t>Отрисовка инженерно-топографического плана по облаку точек в автокад (АкадТопоПлан);</w:t>
+        <w:t xml:space="preserve">Отрисовка инженерно-топографического плана по облаку точек в </w:t>
+      </w:r>
+      <w:proofErr w:type="spellStart"/>
+      <w:r>
+        <w:rPr>
+          <w:rFonts w:ascii="Microsoft Sans Serif" w:hAnsi="Microsoft Sans Serif" w:cs="Microsoft Sans Serif"/>
+          <w:sz w:val="22"/>
+          <w:szCs w:val="22"/>
+        </w:rPr>
+        <w:t>автокад</w:t>
+      </w:r>
+      <w:proofErr w:type="spellEnd"/>
+      <w:r>
+        <w:rPr>
+          <w:rFonts w:ascii="Microsoft Sans Serif" w:hAnsi="Microsoft Sans Serif" w:cs="Microsoft Sans Serif"/>
+          <w:sz w:val="22"/>
+          <w:szCs w:val="22"/>
+        </w:rPr>
+        <w:t xml:space="preserve"> (</w:t>
+      </w:r>
+      <w:proofErr w:type="spellStart"/>
+      <w:r>
+        <w:rPr>
+          <w:rFonts w:ascii="Microsoft Sans Serif" w:hAnsi="Microsoft Sans Serif" w:cs="Microsoft Sans Serif"/>
+          <w:sz w:val="22"/>
+          <w:szCs w:val="22"/>
+        </w:rPr>
+        <w:t>АкадТопоПлан</w:t>
+      </w:r>
+      <w:proofErr w:type="spellEnd"/>
+      <w:r>
+        <w:rPr>
+          <w:rFonts w:ascii="Microsoft Sans Serif" w:hAnsi="Microsoft Sans Serif" w:cs="Microsoft Sans Serif"/>
+          <w:sz w:val="22"/>
+          <w:szCs w:val="22"/>
+        </w:rPr>
+        <w:t>);</w:t>
       </w:r>
     </w:p>
     <w:p>
@@ -666,7 +1036,25 @@
           <w:sz w:val="22"/>
           <w:szCs w:val="22"/>
         </w:rPr>
-        <w:t>Отрисовка топографического плана по данным аэрофотосъемки (ортофотоплан);</w:t>
+        <w:t>Отрисовка топографического плана по данным аэрофотосъемки (</w:t>
+      </w:r>
+      <w:proofErr w:type="spellStart"/>
+      <w:r>
+        <w:rPr>
+          <w:rFonts w:ascii="Microsoft Sans Serif" w:hAnsi="Microsoft Sans Serif" w:cs="Microsoft Sans Serif"/>
+          <w:sz w:val="22"/>
+          <w:szCs w:val="22"/>
+        </w:rPr>
+        <w:t>ортофотоплан</w:t>
+      </w:r>
+      <w:proofErr w:type="spellEnd"/>
+      <w:r>
+        <w:rPr>
+          <w:rFonts w:ascii="Microsoft Sans Serif" w:hAnsi="Microsoft Sans Serif" w:cs="Microsoft Sans Serif"/>
+          <w:sz w:val="22"/>
+          <w:szCs w:val="22"/>
+        </w:rPr>
+        <w:t>);</w:t>
       </w:r>
     </w:p>
     <w:p>
@@ -723,7 +1111,25 @@
           <w:sz w:val="22"/>
           <w:szCs w:val="22"/>
         </w:rPr>
-        <w:t>Взаимодействие с согласователем: корректировка файла, с учетом проведенных согласований; отслеживание полноты и правильности нанесения подземных инженерных коммуникаций;</w:t>
+        <w:t xml:space="preserve">Взаимодействие с </w:t>
+      </w:r>
+      <w:proofErr w:type="spellStart"/>
+      <w:r>
+        <w:rPr>
+          <w:rFonts w:ascii="Microsoft Sans Serif" w:hAnsi="Microsoft Sans Serif" w:cs="Microsoft Sans Serif"/>
+          <w:sz w:val="22"/>
+          <w:szCs w:val="22"/>
+        </w:rPr>
+        <w:t>согласователем</w:t>
+      </w:r>
+      <w:proofErr w:type="spellEnd"/>
+      <w:r>
+        <w:rPr>
+          <w:rFonts w:ascii="Microsoft Sans Serif" w:hAnsi="Microsoft Sans Serif" w:cs="Microsoft Sans Serif"/>
+          <w:sz w:val="22"/>
+          <w:szCs w:val="22"/>
+        </w:rPr>
+        <w:t>: корректировка файла, с учетом проведенных согласований; отслеживание полноты и правильности нанесения подземных инженерных коммуникаций;</w:t>
       </w:r>
     </w:p>
     <w:p>
@@ -927,6 +1333,17 @@
     <w:p>
       <w:pPr>
         <w:pStyle w:val="ConsNormal"/>
+        <w:ind w:firstLine="567"/>
+        <w:rPr>
+          <w:rFonts w:ascii="Microsoft Sans Serif" w:hAnsi="Microsoft Sans Serif" w:cs="Microsoft Sans Serif"/>
+          <w:sz w:val="22"/>
+          <w:szCs w:val="22"/>
+        </w:rPr>
+      </w:pPr>
+    </w:p>
+    <w:p>
+      <w:pPr>
+        <w:pStyle w:val="ConsNormal"/>
         <w:ind w:left="567"/>
         <w:rPr>
           <w:rFonts w:ascii="Microsoft Sans Serif" w:hAnsi="Microsoft Sans Serif" w:cs="Microsoft Sans Serif"/>
@@ -1199,6 +1616,17 @@
     <w:p>
       <w:pPr>
         <w:pStyle w:val="ConsNormal"/>
+        <w:ind w:firstLine="540"/>
+        <w:rPr>
+          <w:rFonts w:ascii="Microsoft Sans Serif" w:hAnsi="Microsoft Sans Serif" w:cs="Microsoft Sans Serif"/>
+          <w:sz w:val="22"/>
+          <w:szCs w:val="22"/>
+        </w:rPr>
+      </w:pPr>
+    </w:p>
+    <w:p>
+      <w:pPr>
+        <w:pStyle w:val="ConsNormal"/>
         <w:jc w:val="center"/>
         <w:rPr>
           <w:rFonts w:ascii="Microsoft Sans Serif" w:hAnsi="Microsoft Sans Serif" w:cs="Microsoft Sans Serif"/>
@@ -1242,21 +1670,79 @@
           <w:sz w:val="22"/>
           <w:szCs w:val="22"/>
         </w:rPr>
-        <w:t>3.1. Вознаграждение Исполнителя составляет {{ fmt_money(contract.salary_rub) }} ({{ contract.salary_rub_words }}) рублей в месяц.</w:t>
-      </w:r>
-      <w:r>
-        <w:rPr>
-          <w:rFonts w:ascii="Microsoft Sans Serif" w:hAnsi="Microsoft Sans Serif" w:cs="Microsoft Sans Serif"/>
-          <w:sz w:val="22"/>
-          <w:szCs w:val="22"/>
-        </w:rPr>
-      </w:r>
-      <w:r>
-        <w:rPr>
-          <w:rFonts w:ascii="Microsoft Sans Serif" w:hAnsi="Microsoft Sans Serif" w:cs="Microsoft Sans Serif"/>
-          <w:sz w:val="22"/>
-          <w:szCs w:val="22"/>
-        </w:rPr>
+        <w:t xml:space="preserve">3.1. Вознаграждение Исполнителя составляет </w:t>
+      </w:r>
+      <w:proofErr w:type="gramStart"/>
+      <w:r>
+        <w:rPr>
+          <w:rFonts w:ascii="Microsoft Sans Serif" w:hAnsi="Microsoft Sans Serif" w:cs="Microsoft Sans Serif"/>
+          <w:sz w:val="22"/>
+          <w:szCs w:val="22"/>
+        </w:rPr>
+        <w:t xml:space="preserve">{{ </w:t>
+      </w:r>
+      <w:proofErr w:type="spellStart"/>
+      <w:r>
+        <w:rPr>
+          <w:rFonts w:ascii="Microsoft Sans Serif" w:hAnsi="Microsoft Sans Serif" w:cs="Microsoft Sans Serif"/>
+          <w:sz w:val="22"/>
+          <w:szCs w:val="22"/>
+        </w:rPr>
+        <w:t>fmt</w:t>
+      </w:r>
+      <w:proofErr w:type="gramEnd"/>
+      <w:r>
+        <w:rPr>
+          <w:rFonts w:ascii="Microsoft Sans Serif" w:hAnsi="Microsoft Sans Serif" w:cs="Microsoft Sans Serif"/>
+          <w:sz w:val="22"/>
+          <w:szCs w:val="22"/>
+        </w:rPr>
+        <w:t>_money</w:t>
+      </w:r>
+      <w:proofErr w:type="spellEnd"/>
+      <w:r>
+        <w:rPr>
+          <w:rFonts w:ascii="Microsoft Sans Serif" w:hAnsi="Microsoft Sans Serif" w:cs="Microsoft Sans Serif"/>
+          <w:sz w:val="22"/>
+          <w:szCs w:val="22"/>
+        </w:rPr>
+        <w:t>(</w:t>
+      </w:r>
+      <w:proofErr w:type="spellStart"/>
+      <w:r>
+        <w:rPr>
+          <w:rFonts w:ascii="Microsoft Sans Serif" w:hAnsi="Microsoft Sans Serif" w:cs="Microsoft Sans Serif"/>
+          <w:sz w:val="22"/>
+          <w:szCs w:val="22"/>
+        </w:rPr>
+        <w:t>contract.salary_rub</w:t>
+      </w:r>
+      <w:proofErr w:type="spellEnd"/>
+      <w:r>
+        <w:rPr>
+          <w:rFonts w:ascii="Microsoft Sans Serif" w:hAnsi="Microsoft Sans Serif" w:cs="Microsoft Sans Serif"/>
+          <w:sz w:val="22"/>
+          <w:szCs w:val="22"/>
+        </w:rPr>
+        <w:t xml:space="preserve">) }} ({{ </w:t>
+      </w:r>
+      <w:proofErr w:type="spellStart"/>
+      <w:r>
+        <w:rPr>
+          <w:rFonts w:ascii="Microsoft Sans Serif" w:hAnsi="Microsoft Sans Serif" w:cs="Microsoft Sans Serif"/>
+          <w:sz w:val="22"/>
+          <w:szCs w:val="22"/>
+        </w:rPr>
+        <w:t>contract.salary_rub_words</w:t>
+      </w:r>
+      <w:proofErr w:type="spellEnd"/>
+      <w:r>
+        <w:rPr>
+          <w:rFonts w:ascii="Microsoft Sans Serif" w:hAnsi="Microsoft Sans Serif" w:cs="Microsoft Sans Serif"/>
+          <w:sz w:val="22"/>
+          <w:szCs w:val="22"/>
+        </w:rPr>
+        <w:t xml:space="preserve"> }}) рублей в месяц.</w:t>
       </w:r>
     </w:p>
     <w:p>
@@ -1275,6 +1761,7 @@
           <w:sz w:val="22"/>
           <w:szCs w:val="22"/>
         </w:rPr>
+        <w:lastRenderedPageBreak/>
         <w:t>3.</w:t>
       </w:r>
       <w:r>
@@ -1291,7 +1778,16 @@
           <w:sz w:val="22"/>
           <w:szCs w:val="22"/>
         </w:rPr>
-        <w:t xml:space="preserve">. Цена Услуг, установленная п. 3.1 настоящего Договора, уплачивается </w:t>
+        <w:t xml:space="preserve">. Цена Услуг, установленная п. 3.1 настоящего Договора, </w:t>
+      </w:r>
+      <w:proofErr w:type="gramStart"/>
+      <w:r>
+        <w:rPr>
+          <w:rFonts w:ascii="Microsoft Sans Serif" w:hAnsi="Microsoft Sans Serif" w:cs="Microsoft Sans Serif"/>
+          <w:sz w:val="22"/>
+          <w:szCs w:val="22"/>
+        </w:rPr>
+        <w:t xml:space="preserve">уплачивается </w:t>
       </w:r>
       <w:r>
         <w:rPr>
@@ -1307,7 +1803,16 @@
           <w:sz w:val="22"/>
           <w:szCs w:val="22"/>
         </w:rPr>
-        <w:t>Заказчиком  путем  перечисления  денежных средств на счет Исполнителя  в течение 5-ти банковских  дней с момента подписания Сторонами Акта оказанных услуг в порядке, предусмотренном п. 2.3 настоящего Договора</w:t>
+        <w:t>Заказчиком</w:t>
+      </w:r>
+      <w:proofErr w:type="gramEnd"/>
+      <w:r>
+        <w:rPr>
+          <w:rFonts w:ascii="Microsoft Sans Serif" w:hAnsi="Microsoft Sans Serif" w:cs="Microsoft Sans Serif"/>
+          <w:sz w:val="22"/>
+          <w:szCs w:val="22"/>
+        </w:rPr>
+        <w:t xml:space="preserve">  путем  перечисления  денежных средств на счет Исполнителя  в течение 5-ти банковских  дней с момента подписания Сторонами Акта оказанных услуг в порядке, предусмотренном п. 2.3 настоящего Договора</w:t>
       </w:r>
       <w:r>
         <w:rPr>
@@ -1356,7 +1861,6 @@
           <w:sz w:val="22"/>
           <w:szCs w:val="22"/>
         </w:rPr>
-        <w:lastRenderedPageBreak/>
         <w:t>4. Сроки оказания Услуг</w:t>
       </w:r>
     </w:p>
@@ -1398,6 +1902,7 @@
           <w:rFonts w:ascii="Microsoft Sans Serif" w:hAnsi="Microsoft Sans Serif" w:cs="Microsoft Sans Serif"/>
           <w:sz w:val="22"/>
           <w:szCs w:val="22"/>
+          <w:lang w:val="en-US"/>
         </w:rPr>
       </w:pPr>
       <w:r>
@@ -1405,64 +1910,60 @@
           <w:rFonts w:ascii="Microsoft Sans Serif" w:hAnsi="Microsoft Sans Serif" w:cs="Microsoft Sans Serif"/>
           <w:sz w:val="22"/>
           <w:szCs w:val="22"/>
-        </w:rPr>
-        <w:t>4.1.1. Начало оказания Услуг - {{ fmt_date_long_ru(contract.sign_date) }}</w:t>
-      </w:r>
-      <w:r>
-        <w:rPr>
-          <w:rFonts w:ascii="Microsoft Sans Serif" w:hAnsi="Microsoft Sans Serif" w:cs="Microsoft Sans Serif"/>
-          <w:sz w:val="22"/>
-          <w:szCs w:val="22"/>
-        </w:rPr>
-      </w:r>
-      <w:r>
-        <w:rPr>
-          <w:rFonts w:ascii="Microsoft Sans Serif" w:hAnsi="Microsoft Sans Serif" w:cs="Microsoft Sans Serif"/>
-          <w:sz w:val="22"/>
-          <w:szCs w:val="22"/>
-        </w:rPr>
-      </w:r>
-      <w:r>
-        <w:rPr>
-          <w:rFonts w:ascii="Microsoft Sans Serif" w:hAnsi="Microsoft Sans Serif" w:cs="Microsoft Sans Serif"/>
-          <w:sz w:val="22"/>
-          <w:szCs w:val="22"/>
-        </w:rPr>
-      </w:r>
-      <w:r>
-        <w:rPr>
-          <w:rFonts w:ascii="Microsoft Sans Serif" w:hAnsi="Microsoft Sans Serif" w:cs="Microsoft Sans Serif"/>
-          <w:sz w:val="22"/>
-          <w:szCs w:val="22"/>
-        </w:rPr>
-      </w:r>
-      <w:r>
-        <w:rPr>
-          <w:rFonts w:ascii="Microsoft Sans Serif" w:hAnsi="Microsoft Sans Serif" w:cs="Microsoft Sans Serif"/>
-          <w:sz w:val="22"/>
-          <w:szCs w:val="22"/>
-        </w:rPr>
-      </w:r>
-      <w:r>
-        <w:rPr>
-          <w:rFonts w:ascii="Microsoft Sans Serif" w:hAnsi="Microsoft Sans Serif" w:cs="Microsoft Sans Serif"/>
-          <w:sz w:val="22"/>
-          <w:szCs w:val="22"/>
-        </w:rPr>
-      </w:r>
-      <w:r>
-        <w:rPr>
-          <w:rFonts w:ascii="Microsoft Sans Serif" w:hAnsi="Microsoft Sans Serif" w:cs="Microsoft Sans Serif"/>
-          <w:sz w:val="22"/>
-          <w:szCs w:val="22"/>
-        </w:rPr>
-      </w:r>
-      <w:r>
-        <w:rPr>
-          <w:rFonts w:ascii="Microsoft Sans Serif" w:hAnsi="Microsoft Sans Serif" w:cs="Microsoft Sans Serif"/>
-          <w:sz w:val="22"/>
-          <w:szCs w:val="22"/>
-        </w:rPr>
+          <w:lang w:val="en-US"/>
+        </w:rPr>
+        <w:t xml:space="preserve">4.1.1. </w:t>
+      </w:r>
+      <w:r>
+        <w:rPr>
+          <w:rFonts w:ascii="Microsoft Sans Serif" w:hAnsi="Microsoft Sans Serif" w:cs="Microsoft Sans Serif"/>
+          <w:sz w:val="22"/>
+          <w:szCs w:val="22"/>
+        </w:rPr>
+        <w:t>Начало</w:t>
+      </w:r>
+      <w:r>
+        <w:rPr>
+          <w:rFonts w:ascii="Microsoft Sans Serif" w:hAnsi="Microsoft Sans Serif" w:cs="Microsoft Sans Serif"/>
+          <w:sz w:val="22"/>
+          <w:szCs w:val="22"/>
+          <w:lang w:val="en-US"/>
+        </w:rPr>
+        <w:t xml:space="preserve"> </w:t>
+      </w:r>
+      <w:r>
+        <w:rPr>
+          <w:rFonts w:ascii="Microsoft Sans Serif" w:hAnsi="Microsoft Sans Serif" w:cs="Microsoft Sans Serif"/>
+          <w:sz w:val="22"/>
+          <w:szCs w:val="22"/>
+        </w:rPr>
+        <w:t>оказания</w:t>
+      </w:r>
+      <w:r>
+        <w:rPr>
+          <w:rFonts w:ascii="Microsoft Sans Serif" w:hAnsi="Microsoft Sans Serif" w:cs="Microsoft Sans Serif"/>
+          <w:sz w:val="22"/>
+          <w:szCs w:val="22"/>
+          <w:lang w:val="en-US"/>
+        </w:rPr>
+        <w:t xml:space="preserve"> </w:t>
+      </w:r>
+      <w:r>
+        <w:rPr>
+          <w:rFonts w:ascii="Microsoft Sans Serif" w:hAnsi="Microsoft Sans Serif" w:cs="Microsoft Sans Serif"/>
+          <w:sz w:val="22"/>
+          <w:szCs w:val="22"/>
+        </w:rPr>
+        <w:t>Услуг</w:t>
+      </w:r>
+      <w:r>
+        <w:rPr>
+          <w:rFonts w:ascii="Microsoft Sans Serif" w:hAnsi="Microsoft Sans Serif" w:cs="Microsoft Sans Serif"/>
+          <w:sz w:val="22"/>
+          <w:szCs w:val="22"/>
+          <w:lang w:val="en-US"/>
+        </w:rPr>
+        <w:t xml:space="preserve"> - {{ fmt_date_long_ru(contract.sign_date) }}</w:t>
       </w:r>
     </w:p>
     <w:p>
@@ -1473,6 +1974,7 @@
           <w:rFonts w:ascii="Microsoft Sans Serif" w:hAnsi="Microsoft Sans Serif" w:cs="Microsoft Sans Serif"/>
           <w:sz w:val="22"/>
           <w:szCs w:val="22"/>
+          <w:lang w:val="en-US"/>
         </w:rPr>
       </w:pPr>
       <w:r>
@@ -1480,64 +1982,60 @@
           <w:rFonts w:ascii="Microsoft Sans Serif" w:hAnsi="Microsoft Sans Serif" w:cs="Microsoft Sans Serif"/>
           <w:sz w:val="22"/>
           <w:szCs w:val="22"/>
-        </w:rPr>
-        <w:t>4.1.2. Окончание оказания Услуг - {{ fmt_date_long_ru(contract.end_date) }}</w:t>
-      </w:r>
-      <w:r>
-        <w:rPr>
-          <w:rFonts w:ascii="Microsoft Sans Serif" w:hAnsi="Microsoft Sans Serif" w:cs="Microsoft Sans Serif"/>
-          <w:sz w:val="22"/>
-          <w:szCs w:val="22"/>
-        </w:rPr>
-      </w:r>
-      <w:r>
-        <w:rPr>
-          <w:rFonts w:ascii="Microsoft Sans Serif" w:hAnsi="Microsoft Sans Serif" w:cs="Microsoft Sans Serif"/>
-          <w:sz w:val="22"/>
-          <w:szCs w:val="22"/>
-        </w:rPr>
-      </w:r>
-      <w:r>
-        <w:rPr>
-          <w:rFonts w:ascii="Microsoft Sans Serif" w:hAnsi="Microsoft Sans Serif" w:cs="Microsoft Sans Serif"/>
-          <w:sz w:val="22"/>
-          <w:szCs w:val="22"/>
-        </w:rPr>
-      </w:r>
-      <w:r>
-        <w:rPr>
-          <w:rFonts w:ascii="Microsoft Sans Serif" w:hAnsi="Microsoft Sans Serif" w:cs="Microsoft Sans Serif"/>
-          <w:sz w:val="22"/>
-          <w:szCs w:val="22"/>
-        </w:rPr>
-      </w:r>
-      <w:r>
-        <w:rPr>
-          <w:rFonts w:ascii="Microsoft Sans Serif" w:hAnsi="Microsoft Sans Serif" w:cs="Microsoft Sans Serif"/>
-          <w:sz w:val="22"/>
-          <w:szCs w:val="22"/>
-        </w:rPr>
-      </w:r>
-      <w:r>
-        <w:rPr>
-          <w:rFonts w:ascii="Microsoft Sans Serif" w:hAnsi="Microsoft Sans Serif" w:cs="Microsoft Sans Serif"/>
-          <w:sz w:val="22"/>
-          <w:szCs w:val="22"/>
-        </w:rPr>
-      </w:r>
-      <w:r>
-        <w:rPr>
-          <w:rFonts w:ascii="Microsoft Sans Serif" w:hAnsi="Microsoft Sans Serif" w:cs="Microsoft Sans Serif"/>
-          <w:sz w:val="22"/>
-          <w:szCs w:val="22"/>
-        </w:rPr>
-      </w:r>
-      <w:r>
-        <w:rPr>
-          <w:rFonts w:ascii="Microsoft Sans Serif" w:hAnsi="Microsoft Sans Serif" w:cs="Microsoft Sans Serif"/>
-          <w:sz w:val="22"/>
-          <w:szCs w:val="22"/>
-        </w:rPr>
+          <w:lang w:val="en-US"/>
+        </w:rPr>
+        <w:t xml:space="preserve">4.1.2. </w:t>
+      </w:r>
+      <w:r>
+        <w:rPr>
+          <w:rFonts w:ascii="Microsoft Sans Serif" w:hAnsi="Microsoft Sans Serif" w:cs="Microsoft Sans Serif"/>
+          <w:sz w:val="22"/>
+          <w:szCs w:val="22"/>
+        </w:rPr>
+        <w:t>Окончание</w:t>
+      </w:r>
+      <w:r>
+        <w:rPr>
+          <w:rFonts w:ascii="Microsoft Sans Serif" w:hAnsi="Microsoft Sans Serif" w:cs="Microsoft Sans Serif"/>
+          <w:sz w:val="22"/>
+          <w:szCs w:val="22"/>
+          <w:lang w:val="en-US"/>
+        </w:rPr>
+        <w:t xml:space="preserve"> </w:t>
+      </w:r>
+      <w:r>
+        <w:rPr>
+          <w:rFonts w:ascii="Microsoft Sans Serif" w:hAnsi="Microsoft Sans Serif" w:cs="Microsoft Sans Serif"/>
+          <w:sz w:val="22"/>
+          <w:szCs w:val="22"/>
+        </w:rPr>
+        <w:t>оказания</w:t>
+      </w:r>
+      <w:r>
+        <w:rPr>
+          <w:rFonts w:ascii="Microsoft Sans Serif" w:hAnsi="Microsoft Sans Serif" w:cs="Microsoft Sans Serif"/>
+          <w:sz w:val="22"/>
+          <w:szCs w:val="22"/>
+          <w:lang w:val="en-US"/>
+        </w:rPr>
+        <w:t xml:space="preserve"> </w:t>
+      </w:r>
+      <w:r>
+        <w:rPr>
+          <w:rFonts w:ascii="Microsoft Sans Serif" w:hAnsi="Microsoft Sans Serif" w:cs="Microsoft Sans Serif"/>
+          <w:sz w:val="22"/>
+          <w:szCs w:val="22"/>
+        </w:rPr>
+        <w:t>Услуг</w:t>
+      </w:r>
+      <w:r>
+        <w:rPr>
+          <w:rFonts w:ascii="Microsoft Sans Serif" w:hAnsi="Microsoft Sans Serif" w:cs="Microsoft Sans Serif"/>
+          <w:sz w:val="22"/>
+          <w:szCs w:val="22"/>
+          <w:lang w:val="en-US"/>
+        </w:rPr>
+        <w:t xml:space="preserve"> - {{ fmt_date_long_ru(contract.end_date) }}</w:t>
       </w:r>
     </w:p>
     <w:p>
@@ -1548,6 +2046,7 @@
           <w:rFonts w:ascii="Microsoft Sans Serif" w:hAnsi="Microsoft Sans Serif" w:cs="Microsoft Sans Serif"/>
           <w:sz w:val="22"/>
           <w:szCs w:val="22"/>
+          <w:lang w:val="en-US"/>
         </w:rPr>
       </w:pPr>
     </w:p>
@@ -1597,7 +2096,16 @@
           <w:sz w:val="22"/>
           <w:szCs w:val="22"/>
         </w:rPr>
-        <w:t>5.1. В случае нарушения срока оплаты Услуг, установленного</w:t>
+        <w:t xml:space="preserve">5.1. В случае нарушения срока оплаты Услуг, </w:t>
+      </w:r>
+      <w:proofErr w:type="gramStart"/>
+      <w:r>
+        <w:rPr>
+          <w:rFonts w:ascii="Microsoft Sans Serif" w:hAnsi="Microsoft Sans Serif" w:cs="Microsoft Sans Serif"/>
+          <w:sz w:val="22"/>
+          <w:szCs w:val="22"/>
+        </w:rPr>
+        <w:t>установленного</w:t>
       </w:r>
       <w:r>
         <w:rPr>
@@ -1613,7 +2121,16 @@
           <w:sz w:val="22"/>
           <w:szCs w:val="22"/>
         </w:rPr>
-        <w:t xml:space="preserve"> п. 3.2 настоящего Договора, Исполнитель вправе потребовать от </w:t>
+        <w:t xml:space="preserve"> п.</w:t>
+      </w:r>
+      <w:proofErr w:type="gramEnd"/>
+      <w:r>
+        <w:rPr>
+          <w:rFonts w:ascii="Microsoft Sans Serif" w:hAnsi="Microsoft Sans Serif" w:cs="Microsoft Sans Serif"/>
+          <w:sz w:val="22"/>
+          <w:szCs w:val="22"/>
+        </w:rPr>
+        <w:t xml:space="preserve"> 3.2 настоящего Договора, Исполнитель вправе потребовать от </w:t>
       </w:r>
       <w:r>
         <w:rPr>
@@ -1749,6 +2266,17 @@
         </w:rPr>
         <w:t>условий настоящего Договора Стороны несут ответственность в соответствии с положениями действующего законодательства Российской Федерации.</w:t>
       </w:r>
+    </w:p>
+    <w:p>
+      <w:pPr>
+        <w:pStyle w:val="ConsNormal"/>
+        <w:ind w:firstLine="540"/>
+        <w:rPr>
+          <w:rFonts w:ascii="Microsoft Sans Serif" w:hAnsi="Microsoft Sans Serif" w:cs="Microsoft Sans Serif"/>
+          <w:sz w:val="22"/>
+          <w:szCs w:val="22"/>
+        </w:rPr>
+      </w:pPr>
     </w:p>
     <w:p>
       <w:pPr>
@@ -1843,6 +2371,17 @@
     <w:p>
       <w:pPr>
         <w:pStyle w:val="ConsNormal"/>
+        <w:ind w:firstLine="540"/>
+        <w:rPr>
+          <w:rFonts w:ascii="Microsoft Sans Serif" w:hAnsi="Microsoft Sans Serif" w:cs="Microsoft Sans Serif"/>
+          <w:sz w:val="22"/>
+          <w:szCs w:val="22"/>
+        </w:rPr>
+      </w:pPr>
+    </w:p>
+    <w:p>
+      <w:pPr>
+        <w:pStyle w:val="ConsNormal"/>
         <w:jc w:val="center"/>
         <w:rPr>
           <w:rFonts w:ascii="Microsoft Sans Serif" w:hAnsi="Microsoft Sans Serif" w:cs="Microsoft Sans Serif"/>
@@ -1880,14 +2419,8 @@
           <w:szCs w:val="22"/>
         </w:rPr>
       </w:pPr>
-      <w:r>
-        <w:rPr>
-          <w:rFonts w:ascii="Microsoft Sans Serif" w:hAnsi="Microsoft Sans Serif" w:cs="Microsoft Sans Serif"/>
-          <w:sz w:val="22"/>
-          <w:szCs w:val="22"/>
-        </w:rPr>
-        <w:t>7.1. Настоящий Договор вступает в силу с момента его подписания обеими Сторонами и действует до исполнения Сторонами всех обязательств по нему.</w:t>
-      </w:r>
+      <w:bookmarkStart w:id="0" w:name="_GoBack"/>
+      <w:bookmarkEnd w:id="0"/>
     </w:p>
     <w:p>
       <w:pPr>
@@ -1905,7 +2438,7 @@
           <w:sz w:val="22"/>
           <w:szCs w:val="22"/>
         </w:rPr>
-        <w:t>7.2. Изменение условий настоящего Договора возможно по соглашению Сторон, составленному в письменной форме и подписанному обеими Сторонами настоящего Договора.</w:t>
+        <w:t>7.1. Настоящий Договор вступает в силу с момента его подписания обеими Сторонами и действует до исполнения Сторонами всех обязательств по нему.</w:t>
       </w:r>
     </w:p>
     <w:p>
@@ -1924,7 +2457,7 @@
           <w:sz w:val="22"/>
           <w:szCs w:val="22"/>
         </w:rPr>
-        <w:t>7.3. Услуги оказываются с использованием удалённых технологий и не требуют постоянного присутствия Исполнителя по месту нахождения Заказчика.</w:t>
+        <w:t>7.2. Изменение условий настоящего Договора возможно по соглашению Сторон, составленному в письменной форме и подписанному обеими Сторонами настоящего Договора.</w:t>
       </w:r>
     </w:p>
     <w:p>
@@ -1943,7 +2476,7 @@
           <w:sz w:val="22"/>
           <w:szCs w:val="22"/>
         </w:rPr>
-        <w:t>7.4. Стороны подтверждают, что:</w:t>
+        <w:t>7.3. Услуги оказываются с использованием удалённых технологий и не требуют постоянного присутствия Исполнителя по месту нахождения Заказчика.</w:t>
       </w:r>
     </w:p>
     <w:p>
@@ -1962,7 +2495,7 @@
           <w:sz w:val="22"/>
           <w:szCs w:val="22"/>
         </w:rPr>
-        <w:t xml:space="preserve"> - настоящий договор не является трудовым договором;</w:t>
+        <w:t>7.4. Стороны подтверждают, что:</w:t>
       </w:r>
     </w:p>
     <w:p>
@@ -1981,7 +2514,7 @@
           <w:sz w:val="22"/>
           <w:szCs w:val="22"/>
         </w:rPr>
-        <w:t xml:space="preserve"> - Исполнитель действует как независимый подрядчик;</w:t>
+        <w:t xml:space="preserve"> - настоящий договор не является трудовым договором;</w:t>
       </w:r>
     </w:p>
     <w:p>
@@ -2000,7 +2533,7 @@
           <w:sz w:val="22"/>
           <w:szCs w:val="22"/>
         </w:rPr>
-        <w:t>-  Заказчик не осуществляет контроль рабочего времени Исполнителя;</w:t>
+        <w:t xml:space="preserve"> - Исполнитель действует как независимый подрядчик;</w:t>
       </w:r>
     </w:p>
     <w:p>
@@ -2019,7 +2552,7 @@
           <w:sz w:val="22"/>
           <w:szCs w:val="22"/>
         </w:rPr>
-        <w:t xml:space="preserve"> - объем и график оказания Услуг определяется по согласованию Сторон и не предполагает фиксированного рабочего времени;</w:t>
+        <w:t>-  Заказчик не осуществляет контроль рабочего времени Исполнителя;</w:t>
       </w:r>
     </w:p>
     <w:p>
@@ -2038,7 +2571,7 @@
           <w:sz w:val="22"/>
           <w:szCs w:val="22"/>
         </w:rPr>
-        <w:t xml:space="preserve"> - Исполнитель несет самостоятельную ответственность за уплату налогов и обязательных платежей в соответствии с применимым законодательством.</w:t>
+        <w:t xml:space="preserve"> - объем и график оказания Услуг определяется по согласованию Сторон и не предполагает фиксированного рабочего времени;</w:t>
       </w:r>
     </w:p>
     <w:p>
@@ -2057,6 +2590,26 @@
           <w:sz w:val="22"/>
           <w:szCs w:val="22"/>
         </w:rPr>
+        <w:t xml:space="preserve"> - Исполнитель несет самостоятельную ответственность за уплату налогов и обязательных платежей в соответствии с применимым законодательством.</w:t>
+      </w:r>
+    </w:p>
+    <w:p>
+      <w:pPr>
+        <w:pStyle w:val="ConsNormal"/>
+        <w:ind w:firstLine="540"/>
+        <w:rPr>
+          <w:rFonts w:ascii="Microsoft Sans Serif" w:hAnsi="Microsoft Sans Serif" w:cs="Microsoft Sans Serif"/>
+          <w:sz w:val="22"/>
+          <w:szCs w:val="22"/>
+        </w:rPr>
+        <w:keepNext/>
+      </w:pPr>
+      <w:r>
+        <w:rPr>
+          <w:rFonts w:ascii="Microsoft Sans Serif" w:hAnsi="Microsoft Sans Serif" w:cs="Microsoft Sans Serif"/>
+          <w:sz w:val="22"/>
+          <w:szCs w:val="22"/>
+        </w:rPr>
         <w:t>7.</w:t>
       </w:r>
       <w:r>
@@ -2075,6 +2628,28 @@
         </w:rPr>
         <w:t>. Настоящий Договор составлен в двух экземплярах, имеющих равную юридическую силу, по одному для каждой Стороны.</w:t>
       </w:r>
+    </w:p>
+    <w:p>
+      <w:pPr>
+        <w:pStyle w:val="ConsNormal"/>
+        <w:ind w:firstLine="540"/>
+        <w:rPr>
+          <w:rFonts w:ascii="Microsoft Sans Serif" w:hAnsi="Microsoft Sans Serif" w:cs="Microsoft Sans Serif"/>
+          <w:sz w:val="22"/>
+          <w:szCs w:val="22"/>
+        </w:rPr>
+      </w:pPr>
+    </w:p>
+    <w:p>
+      <w:pPr>
+        <w:pStyle w:val="ConsNormal"/>
+        <w:ind w:firstLine="540"/>
+        <w:rPr>
+          <w:rFonts w:ascii="Microsoft Sans Serif" w:hAnsi="Microsoft Sans Serif" w:cs="Microsoft Sans Serif"/>
+          <w:sz w:val="22"/>
+          <w:szCs w:val="22"/>
+        </w:rPr>
+      </w:pPr>
     </w:p>
     <w:p>
       <w:pPr>
@@ -2096,6 +2671,7 @@
           <w:sz w:val="22"/>
           <w:szCs w:val="22"/>
         </w:rPr>
+        <w:keepNext/>
       </w:pPr>
       <w:r>
         <w:rPr>
@@ -2115,6 +2691,7 @@
           <w:sz w:val="22"/>
           <w:szCs w:val="22"/>
         </w:rPr>
+        <w:keepNext/>
       </w:pPr>
     </w:p>
     <w:tbl>
@@ -2149,6 +2726,7 @@
                 <w:sz w:val="22"/>
                 <w:szCs w:val="22"/>
               </w:rPr>
+              <w:keepNext/>
             </w:pPr>
             <w:r>
               <w:rPr>
@@ -2168,8 +2746,11 @@
                 <w:bCs/>
                 <w:sz w:val="22"/>
                 <w:szCs w:val="22"/>
+                <w:lang w:val="en-US"/>
               </w:rPr>
+              <w:keepNext/>
             </w:pPr>
+            <w:proofErr w:type="gramStart"/>
             <w:r>
               <w:rPr>
                 <w:rFonts w:ascii="Microsoft Sans Serif" w:hAnsi="Microsoft Sans Serif" w:cs="Microsoft Sans Serif"/>
@@ -2177,8 +2758,45 @@
                 <w:bCs/>
                 <w:sz w:val="22"/>
                 <w:szCs w:val="22"/>
+                <w:lang w:val="en-US"/>
               </w:rPr>
-              <w:t>{{ company.short_name }}</w:t>
+              <w:t xml:space="preserve">{{ </w:t>
+            </w:r>
+            <w:proofErr w:type="spellStart"/>
+            <w:r>
+              <w:rPr>
+                <w:rFonts w:ascii="Microsoft Sans Serif" w:hAnsi="Microsoft Sans Serif" w:cs="Microsoft Sans Serif"/>
+                <w:b/>
+                <w:bCs/>
+                <w:sz w:val="22"/>
+                <w:szCs w:val="22"/>
+                <w:lang w:val="en-US"/>
+              </w:rPr>
+              <w:t>company</w:t>
+            </w:r>
+            <w:proofErr w:type="gramEnd"/>
+            <w:r>
+              <w:rPr>
+                <w:rFonts w:ascii="Microsoft Sans Serif" w:hAnsi="Microsoft Sans Serif" w:cs="Microsoft Sans Serif"/>
+                <w:b/>
+                <w:bCs/>
+                <w:sz w:val="22"/>
+                <w:szCs w:val="22"/>
+                <w:lang w:val="en-US"/>
+              </w:rPr>
+              <w:t>.short_name</w:t>
+            </w:r>
+            <w:proofErr w:type="spellEnd"/>
+            <w:r>
+              <w:rPr>
+                <w:rFonts w:ascii="Microsoft Sans Serif" w:hAnsi="Microsoft Sans Serif" w:cs="Microsoft Sans Serif"/>
+                <w:b/>
+                <w:bCs/>
+                <w:sz w:val="22"/>
+                <w:szCs w:val="22"/>
+                <w:lang w:val="en-US"/>
+              </w:rPr>
+              <w:t xml:space="preserve"> }}</w:t>
             </w:r>
           </w:p>
           <w:p>
@@ -2188,7 +2806,9 @@
                 <w:rFonts w:ascii="Microsoft Sans Serif" w:hAnsi="Microsoft Sans Serif" w:cs="Microsoft Sans Serif"/>
                 <w:sz w:val="22"/>
                 <w:szCs w:val="22"/>
+                <w:lang w:val="en-US"/>
               </w:rPr>
+              <w:keepNext/>
             </w:pPr>
             <w:r>
               <w:rPr>
@@ -2196,7 +2816,93 @@
                 <w:sz w:val="22"/>
                 <w:szCs w:val="22"/>
               </w:rPr>
-              <w:t>ИНН {{ company.tax_id_primary }}, КПП {{ company.tax_id_secondary }}</w:t>
+              <w:t>ИНН</w:t>
+            </w:r>
+            <w:r>
+              <w:rPr>
+                <w:rFonts w:ascii="Microsoft Sans Serif" w:hAnsi="Microsoft Sans Serif" w:cs="Microsoft Sans Serif"/>
+                <w:sz w:val="22"/>
+                <w:szCs w:val="22"/>
+                <w:lang w:val="en-US"/>
+              </w:rPr>
+              <w:t xml:space="preserve"> </w:t>
+            </w:r>
+            <w:proofErr w:type="gramStart"/>
+            <w:r>
+              <w:rPr>
+                <w:rFonts w:ascii="Microsoft Sans Serif" w:hAnsi="Microsoft Sans Serif" w:cs="Microsoft Sans Serif"/>
+                <w:sz w:val="22"/>
+                <w:szCs w:val="22"/>
+                <w:lang w:val="en-US"/>
+              </w:rPr>
+              <w:t xml:space="preserve">{{ </w:t>
+            </w:r>
+            <w:proofErr w:type="spellStart"/>
+            <w:r>
+              <w:rPr>
+                <w:rFonts w:ascii="Microsoft Sans Serif" w:hAnsi="Microsoft Sans Serif" w:cs="Microsoft Sans Serif"/>
+                <w:sz w:val="22"/>
+                <w:szCs w:val="22"/>
+                <w:lang w:val="en-US"/>
+              </w:rPr>
+              <w:t>company.tax</w:t>
+            </w:r>
+            <w:proofErr w:type="gramEnd"/>
+            <w:r>
+              <w:rPr>
+                <w:rFonts w:ascii="Microsoft Sans Serif" w:hAnsi="Microsoft Sans Serif" w:cs="Microsoft Sans Serif"/>
+                <w:sz w:val="22"/>
+                <w:szCs w:val="22"/>
+                <w:lang w:val="en-US"/>
+              </w:rPr>
+              <w:t>_id_primary</w:t>
+            </w:r>
+            <w:proofErr w:type="spellEnd"/>
+            <w:r>
+              <w:rPr>
+                <w:rFonts w:ascii="Microsoft Sans Serif" w:hAnsi="Microsoft Sans Serif" w:cs="Microsoft Sans Serif"/>
+                <w:sz w:val="22"/>
+                <w:szCs w:val="22"/>
+                <w:lang w:val="en-US"/>
+              </w:rPr>
+              <w:t xml:space="preserve"> }}, </w:t>
+            </w:r>
+            <w:r>
+              <w:rPr>
+                <w:rFonts w:ascii="Microsoft Sans Serif" w:hAnsi="Microsoft Sans Serif" w:cs="Microsoft Sans Serif"/>
+                <w:sz w:val="22"/>
+                <w:szCs w:val="22"/>
+              </w:rPr>
+              <w:t>КПП</w:t>
+            </w:r>
+            <w:r>
+              <w:rPr>
+                <w:rFonts w:ascii="Microsoft Sans Serif" w:hAnsi="Microsoft Sans Serif" w:cs="Microsoft Sans Serif"/>
+                <w:sz w:val="22"/>
+                <w:szCs w:val="22"/>
+                <w:lang w:val="en-US"/>
+              </w:rPr>
+              <w:t xml:space="preserve"> {{ </w:t>
+            </w:r>
+            <w:proofErr w:type="spellStart"/>
+            <w:r>
+              <w:rPr>
+                <w:rFonts w:ascii="Microsoft Sans Serif" w:hAnsi="Microsoft Sans Serif" w:cs="Microsoft Sans Serif"/>
+                <w:sz w:val="22"/>
+                <w:szCs w:val="22"/>
+                <w:lang w:val="en-US"/>
+              </w:rPr>
+              <w:t>company.tax_id_secondary</w:t>
+            </w:r>
+            <w:proofErr w:type="spellEnd"/>
+            <w:r>
+              <w:rPr>
+                <w:rFonts w:ascii="Microsoft Sans Serif" w:hAnsi="Microsoft Sans Serif" w:cs="Microsoft Sans Serif"/>
+                <w:sz w:val="22"/>
+                <w:szCs w:val="22"/>
+                <w:lang w:val="en-US"/>
+              </w:rPr>
+              <w:t xml:space="preserve"> }}</w:t>
             </w:r>
           </w:p>
           <w:p>
@@ -2207,34 +2913,65 @@
                 <w:rFonts w:ascii="Microsoft Sans Serif" w:hAnsi="Microsoft Sans Serif" w:cs="Microsoft Sans Serif"/>
                 <w:sz w:val="22"/>
                 <w:szCs w:val="22"/>
+                <w:lang w:val="en-US"/>
               </w:rPr>
+              <w:keepNext/>
             </w:pPr>
+            <w:proofErr w:type="spellStart"/>
             <w:r>
               <w:rPr>
                 <w:rFonts w:ascii="Microsoft Sans Serif" w:hAnsi="Microsoft Sans Serif" w:cs="Microsoft Sans Serif"/>
                 <w:sz w:val="22"/>
                 <w:szCs w:val="22"/>
               </w:rPr>
-              <w:t xml:space="preserve">Юрид. адрес: {{ company.legal_address_line1 }} </w:t>
+              <w:t xml:space="preserve">Юрид. адрес: {{ company.legal_address }} </w:t>
             </w:r>
-          </w:p>
-          <w:p>
-            <w:pPr>
-              <w:pStyle w:val="ConsDTNormal"/>
-              <w:ind w:right="321"/>
+            <w:proofErr w:type="spellEnd"/>
+            <w:r>
               <w:rPr>
                 <w:rFonts w:ascii="Microsoft Sans Serif" w:hAnsi="Microsoft Sans Serif" w:cs="Microsoft Sans Serif"/>
                 <w:sz w:val="22"/>
                 <w:szCs w:val="22"/>
+                <w:lang w:val="en-US"/>
               </w:rPr>
-            </w:pPr>
+              <w:t xml:space="preserve"/>
+            </w:r>
             <w:r>
               <w:rPr>
                 <w:rFonts w:ascii="Microsoft Sans Serif" w:hAnsi="Microsoft Sans Serif" w:cs="Microsoft Sans Serif"/>
                 <w:sz w:val="22"/>
                 <w:szCs w:val="22"/>
               </w:rPr>
-              <w:t>{{ company.legal_address_line2 }}</w:t>
+              <w:t/>
+            </w:r>
+            <w:r>
+              <w:rPr>
+                <w:rFonts w:ascii="Microsoft Sans Serif" w:hAnsi="Microsoft Sans Serif" w:cs="Microsoft Sans Serif"/>
+                <w:sz w:val="22"/>
+                <w:szCs w:val="22"/>
+                <w:lang w:val="en-US"/>
+              </w:rPr>
+              <w:t xml:space="preserve"/>
+            </w:r>
+            <w:proofErr w:type="gramStart"/>
+            <w:r>
+              <w:rPr>
+                <w:rFonts w:ascii="Microsoft Sans Serif" w:hAnsi="Microsoft Sans Serif" w:cs="Microsoft Sans Serif"/>
+                <w:sz w:val="22"/>
+                <w:szCs w:val="22"/>
+                <w:lang w:val="en-US"/>
+              </w:rPr>
+              <w:t/>
+            </w:r>
+            <w:proofErr w:type="gramEnd"/>
+            <w:r>
+              <w:rPr>
+                <w:rFonts w:ascii="Microsoft Sans Serif" w:hAnsi="Microsoft Sans Serif" w:cs="Microsoft Sans Serif"/>
+                <w:sz w:val="22"/>
+                <w:szCs w:val="22"/>
+                <w:lang w:val="en-US"/>
+              </w:rPr>
+              <w:t xml:space="preserve"/>
             </w:r>
           </w:p>
           <w:p>
@@ -2244,7 +2981,9 @@
                 <w:rFonts w:ascii="Microsoft Sans Serif" w:hAnsi="Microsoft Sans Serif" w:cs="Microsoft Sans Serif"/>
                 <w:sz w:val="22"/>
                 <w:szCs w:val="22"/>
+                <w:lang w:val="en-US"/>
               </w:rPr>
+              <w:keepNext/>
             </w:pPr>
             <w:r>
               <w:rPr>
@@ -2252,7 +2991,17 @@
                 <w:sz w:val="22"/>
                 <w:szCs w:val="22"/>
               </w:rPr>
-              <w:t>Почт. адрес: {{ company.postal_address_line1 }}</w:t>
+              <w:lastRenderedPageBreak/>
+              <w:t xml:space="preserve">Почт. адрес: {{ company.postal_address }}</w:t>
+            </w:r>
+            <w:r>
+              <w:rPr>
+                <w:rFonts w:ascii="Microsoft Sans Serif" w:hAnsi="Microsoft Sans Serif" w:cs="Microsoft Sans Serif"/>
+                <w:sz w:val="22"/>
+                <w:szCs w:val="22"/>
+                <w:lang w:val="en-US"/>
+              </w:rPr>
+              <w:t xml:space="preserve"/>
             </w:r>
             <w:r>
               <w:rPr>
@@ -2260,24 +3009,36 @@
                 <w:sz w:val="22"/>
                 <w:szCs w:val="22"/>
               </w:rPr>
+              <w:t/>
             </w:r>
-          </w:p>
-          <w:p>
-            <w:pPr>
-              <w:pStyle w:val="ConsDTNormal"/>
-              <w:rPr>
-                <w:rFonts w:ascii="Microsoft Sans Serif" w:hAnsi="Microsoft Sans Serif" w:cs="Microsoft Sans Serif"/>
-                <w:sz w:val="22"/>
-                <w:szCs w:val="22"/>
-              </w:rPr>
-            </w:pPr>
             <w:r>
               <w:rPr>
                 <w:rFonts w:ascii="Microsoft Sans Serif" w:hAnsi="Microsoft Sans Serif" w:cs="Microsoft Sans Serif"/>
                 <w:sz w:val="22"/>
                 <w:szCs w:val="22"/>
+                <w:lang w:val="en-US"/>
               </w:rPr>
-              <w:t>{{ company.postal_address_line2 }}</w:t>
+              <w:t xml:space="preserve"/>
+            </w:r>
+            <w:proofErr w:type="gramStart"/>
+            <w:r>
+              <w:rPr>
+                <w:rFonts w:ascii="Microsoft Sans Serif" w:hAnsi="Microsoft Sans Serif" w:cs="Microsoft Sans Serif"/>
+                <w:sz w:val="22"/>
+                <w:szCs w:val="22"/>
+                <w:lang w:val="en-US"/>
+              </w:rPr>
+              <w:t/>
+            </w:r>
+            <w:proofErr w:type="gramEnd"/>
+            <w:r>
+              <w:rPr>
+                <w:rFonts w:ascii="Microsoft Sans Serif" w:hAnsi="Microsoft Sans Serif" w:cs="Microsoft Sans Serif"/>
+                <w:sz w:val="22"/>
+                <w:szCs w:val="22"/>
+                <w:lang w:val="en-US"/>
+              </w:rPr>
+              <w:t/>
             </w:r>
           </w:p>
           <w:p>
@@ -2288,7 +3049,9 @@
                 <w:bCs/>
                 <w:sz w:val="22"/>
                 <w:szCs w:val="22"/>
+                <w:lang w:val="en-US"/>
               </w:rPr>
+              <w:keepNext/>
             </w:pPr>
             <w:r>
               <w:rPr>
@@ -2297,15 +3060,17 @@
                 <w:sz w:val="22"/>
                 <w:szCs w:val="22"/>
               </w:rPr>
-              <w:t>Р\с: {{ company.bank_account }}</w:t>
+              <w:t>Р</w:t>
             </w:r>
             <w:r>
               <w:rPr>
                 <w:rFonts w:ascii="Microsoft Sans Serif" w:hAnsi="Microsoft Sans Serif" w:cs="Microsoft Sans Serif"/>
-                <w:b/>
+                <w:bCs/>
                 <w:sz w:val="22"/>
                 <w:szCs w:val="22"/>
+                <w:lang w:val="en-US"/>
               </w:rPr>
+              <w:t>\</w:t>
             </w:r>
             <w:r>
               <w:rPr>
@@ -2314,6 +3079,61 @@
                 <w:sz w:val="22"/>
                 <w:szCs w:val="22"/>
               </w:rPr>
+              <w:t>с</w:t>
+            </w:r>
+            <w:r>
+              <w:rPr>
+                <w:rFonts w:ascii="Microsoft Sans Serif" w:hAnsi="Microsoft Sans Serif" w:cs="Microsoft Sans Serif"/>
+                <w:bCs/>
+                <w:sz w:val="22"/>
+                <w:szCs w:val="22"/>
+                <w:lang w:val="en-US"/>
+              </w:rPr>
+              <w:t xml:space="preserve">: </w:t>
+            </w:r>
+            <w:proofErr w:type="gramStart"/>
+            <w:r>
+              <w:rPr>
+                <w:rFonts w:ascii="Microsoft Sans Serif" w:hAnsi="Microsoft Sans Serif" w:cs="Microsoft Sans Serif"/>
+                <w:bCs/>
+                <w:sz w:val="22"/>
+                <w:szCs w:val="22"/>
+                <w:lang w:val="en-US"/>
+              </w:rPr>
+              <w:t xml:space="preserve">{{ </w:t>
+            </w:r>
+            <w:proofErr w:type="spellStart"/>
+            <w:r>
+              <w:rPr>
+                <w:rFonts w:ascii="Microsoft Sans Serif" w:hAnsi="Microsoft Sans Serif" w:cs="Microsoft Sans Serif"/>
+                <w:bCs/>
+                <w:sz w:val="22"/>
+                <w:szCs w:val="22"/>
+                <w:lang w:val="en-US"/>
+              </w:rPr>
+              <w:t>company</w:t>
+            </w:r>
+            <w:proofErr w:type="gramEnd"/>
+            <w:r>
+              <w:rPr>
+                <w:rFonts w:ascii="Microsoft Sans Serif" w:hAnsi="Microsoft Sans Serif" w:cs="Microsoft Sans Serif"/>
+                <w:bCs/>
+                <w:sz w:val="22"/>
+                <w:szCs w:val="22"/>
+                <w:lang w:val="en-US"/>
+              </w:rPr>
+              <w:t>.bank_account</w:t>
+            </w:r>
+            <w:proofErr w:type="spellEnd"/>
+            <w:r>
+              <w:rPr>
+                <w:rFonts w:ascii="Microsoft Sans Serif" w:hAnsi="Microsoft Sans Serif" w:cs="Microsoft Sans Serif"/>
+                <w:bCs/>
+                <w:sz w:val="22"/>
+                <w:szCs w:val="22"/>
+                <w:lang w:val="en-US"/>
+              </w:rPr>
+              <w:t xml:space="preserve"> }}</w:t>
             </w:r>
           </w:p>
           <w:p>
@@ -2324,16 +3144,53 @@
                 <w:bCs/>
                 <w:sz w:val="22"/>
                 <w:szCs w:val="22"/>
+                <w:lang w:val="en-US"/>
               </w:rPr>
+              <w:keepNext/>
             </w:pPr>
+            <w:proofErr w:type="gramStart"/>
             <w:r>
               <w:rPr>
                 <w:rFonts w:ascii="Microsoft Sans Serif" w:hAnsi="Microsoft Sans Serif" w:cs="Microsoft Sans Serif"/>
                 <w:bCs/>
                 <w:sz w:val="22"/>
                 <w:szCs w:val="22"/>
+                <w:lang w:val="en-US"/>
               </w:rPr>
-              <w:t>{{ company.bank_name }}</w:t>
+              <w:t xml:space="preserve">{{ </w:t>
+            </w:r>
+            <w:proofErr w:type="spellStart"/>
+            <w:r>
+              <w:rPr>
+                <w:rFonts w:ascii="Microsoft Sans Serif" w:hAnsi="Microsoft Sans Serif" w:cs="Microsoft Sans Serif"/>
+                <w:bCs/>
+                <w:sz w:val="22"/>
+                <w:szCs w:val="22"/>
+                <w:lang w:val="en-US"/>
+              </w:rPr>
+              <w:t>company</w:t>
+            </w:r>
+            <w:proofErr w:type="gramEnd"/>
+            <w:r>
+              <w:rPr>
+                <w:rFonts w:ascii="Microsoft Sans Serif" w:hAnsi="Microsoft Sans Serif" w:cs="Microsoft Sans Serif"/>
+                <w:bCs/>
+                <w:sz w:val="22"/>
+                <w:szCs w:val="22"/>
+                <w:lang w:val="en-US"/>
+              </w:rPr>
+              <w:t>.bank_name</w:t>
+            </w:r>
+            <w:proofErr w:type="spellEnd"/>
+            <w:r>
+              <w:rPr>
+                <w:rFonts w:ascii="Microsoft Sans Serif" w:hAnsi="Microsoft Sans Serif" w:cs="Microsoft Sans Serif"/>
+                <w:bCs/>
+                <w:sz w:val="22"/>
+                <w:szCs w:val="22"/>
+                <w:lang w:val="en-US"/>
+              </w:rPr>
+              <w:t xml:space="preserve"> }}</w:t>
             </w:r>
           </w:p>
           <w:p>
@@ -2344,7 +3201,9 @@
                 <w:bCs/>
                 <w:sz w:val="22"/>
                 <w:szCs w:val="22"/>
+                <w:lang w:val="en-US"/>
               </w:rPr>
+              <w:keepNext/>
             </w:pPr>
             <w:r>
               <w:rPr>
@@ -2353,7 +3212,80 @@
                 <w:sz w:val="22"/>
                 <w:szCs w:val="22"/>
               </w:rPr>
-              <w:t>БИК банка: {{ company.bank_bic }}</w:t>
+              <w:t>БИК</w:t>
+            </w:r>
+            <w:r>
+              <w:rPr>
+                <w:rFonts w:ascii="Microsoft Sans Serif" w:hAnsi="Microsoft Sans Serif" w:cs="Microsoft Sans Serif"/>
+                <w:bCs/>
+                <w:sz w:val="22"/>
+                <w:szCs w:val="22"/>
+                <w:lang w:val="en-US"/>
+              </w:rPr>
+              <w:t xml:space="preserve"> </w:t>
+            </w:r>
+            <w:r>
+              <w:rPr>
+                <w:rFonts w:ascii="Microsoft Sans Serif" w:hAnsi="Microsoft Sans Serif" w:cs="Microsoft Sans Serif"/>
+                <w:bCs/>
+                <w:sz w:val="22"/>
+                <w:szCs w:val="22"/>
+              </w:rPr>
+              <w:t>банка</w:t>
+            </w:r>
+            <w:r>
+              <w:rPr>
+                <w:rFonts w:ascii="Microsoft Sans Serif" w:hAnsi="Microsoft Sans Serif" w:cs="Microsoft Sans Serif"/>
+                <w:bCs/>
+                <w:sz w:val="22"/>
+                <w:szCs w:val="22"/>
+                <w:lang w:val="en-US"/>
+              </w:rPr>
+              <w:t xml:space="preserve">: </w:t>
+            </w:r>
+            <w:proofErr w:type="gramStart"/>
+            <w:r>
+              <w:rPr>
+                <w:rFonts w:ascii="Microsoft Sans Serif" w:hAnsi="Microsoft Sans Serif" w:cs="Microsoft Sans Serif"/>
+                <w:bCs/>
+                <w:sz w:val="22"/>
+                <w:szCs w:val="22"/>
+                <w:lang w:val="en-US"/>
+              </w:rPr>
+              <w:t xml:space="preserve">{{ </w:t>
+            </w:r>
+            <w:proofErr w:type="spellStart"/>
+            <w:r>
+              <w:rPr>
+                <w:rFonts w:ascii="Microsoft Sans Serif" w:hAnsi="Microsoft Sans Serif" w:cs="Microsoft Sans Serif"/>
+                <w:bCs/>
+                <w:sz w:val="22"/>
+                <w:szCs w:val="22"/>
+                <w:lang w:val="en-US"/>
+              </w:rPr>
+              <w:t>company</w:t>
+            </w:r>
+            <w:proofErr w:type="gramEnd"/>
+            <w:r>
+              <w:rPr>
+                <w:rFonts w:ascii="Microsoft Sans Serif" w:hAnsi="Microsoft Sans Serif" w:cs="Microsoft Sans Serif"/>
+                <w:bCs/>
+                <w:sz w:val="22"/>
+                <w:szCs w:val="22"/>
+                <w:lang w:val="en-US"/>
+              </w:rPr>
+              <w:t>.bank_bic</w:t>
+            </w:r>
+            <w:proofErr w:type="spellEnd"/>
+            <w:r>
+              <w:rPr>
+                <w:rFonts w:ascii="Microsoft Sans Serif" w:hAnsi="Microsoft Sans Serif" w:cs="Microsoft Sans Serif"/>
+                <w:bCs/>
+                <w:sz w:val="22"/>
+                <w:szCs w:val="22"/>
+                <w:lang w:val="en-US"/>
+              </w:rPr>
+              <w:t xml:space="preserve"> }}</w:t>
             </w:r>
           </w:p>
           <w:p>
@@ -2364,7 +3296,9 @@
                 <w:bCs/>
                 <w:sz w:val="22"/>
                 <w:szCs w:val="22"/>
+                <w:lang w:val="en-US"/>
               </w:rPr>
+              <w:keepNext/>
             </w:pPr>
             <w:r>
               <w:rPr>
@@ -2373,7 +3307,80 @@
                 <w:sz w:val="22"/>
                 <w:szCs w:val="22"/>
               </w:rPr>
-              <w:t>К\с: {{ company.bank_correspondent_account }}</w:t>
+              <w:t>К</w:t>
+            </w:r>
+            <w:r>
+              <w:rPr>
+                <w:rFonts w:ascii="Microsoft Sans Serif" w:hAnsi="Microsoft Sans Serif" w:cs="Microsoft Sans Serif"/>
+                <w:bCs/>
+                <w:sz w:val="22"/>
+                <w:szCs w:val="22"/>
+                <w:lang w:val="en-US"/>
+              </w:rPr>
+              <w:t>\</w:t>
+            </w:r>
+            <w:r>
+              <w:rPr>
+                <w:rFonts w:ascii="Microsoft Sans Serif" w:hAnsi="Microsoft Sans Serif" w:cs="Microsoft Sans Serif"/>
+                <w:bCs/>
+                <w:sz w:val="22"/>
+                <w:szCs w:val="22"/>
+              </w:rPr>
+              <w:t>с</w:t>
+            </w:r>
+            <w:r>
+              <w:rPr>
+                <w:rFonts w:ascii="Microsoft Sans Serif" w:hAnsi="Microsoft Sans Serif" w:cs="Microsoft Sans Serif"/>
+                <w:bCs/>
+                <w:sz w:val="22"/>
+                <w:szCs w:val="22"/>
+                <w:lang w:val="en-US"/>
+              </w:rPr>
+              <w:t xml:space="preserve">: </w:t>
+            </w:r>
+            <w:proofErr w:type="gramStart"/>
+            <w:r>
+              <w:rPr>
+                <w:rFonts w:ascii="Microsoft Sans Serif" w:hAnsi="Microsoft Sans Serif" w:cs="Microsoft Sans Serif"/>
+                <w:bCs/>
+                <w:sz w:val="22"/>
+                <w:szCs w:val="22"/>
+                <w:lang w:val="en-US"/>
+              </w:rPr>
+              <w:t xml:space="preserve">{{ </w:t>
+            </w:r>
+            <w:proofErr w:type="spellStart"/>
+            <w:r>
+              <w:rPr>
+                <w:rFonts w:ascii="Microsoft Sans Serif" w:hAnsi="Microsoft Sans Serif" w:cs="Microsoft Sans Serif"/>
+                <w:bCs/>
+                <w:sz w:val="22"/>
+                <w:szCs w:val="22"/>
+                <w:lang w:val="en-US"/>
+              </w:rPr>
+              <w:t>company</w:t>
+            </w:r>
+            <w:proofErr w:type="gramEnd"/>
+            <w:r>
+              <w:rPr>
+                <w:rFonts w:ascii="Microsoft Sans Serif" w:hAnsi="Microsoft Sans Serif" w:cs="Microsoft Sans Serif"/>
+                <w:bCs/>
+                <w:sz w:val="22"/>
+                <w:szCs w:val="22"/>
+                <w:lang w:val="en-US"/>
+              </w:rPr>
+              <w:t>.bank_correspondent_account</w:t>
+            </w:r>
+            <w:proofErr w:type="spellEnd"/>
+            <w:r>
+              <w:rPr>
+                <w:rFonts w:ascii="Microsoft Sans Serif" w:hAnsi="Microsoft Sans Serif" w:cs="Microsoft Sans Serif"/>
+                <w:bCs/>
+                <w:sz w:val="22"/>
+                <w:szCs w:val="22"/>
+                <w:lang w:val="en-US"/>
+              </w:rPr>
+              <w:t xml:space="preserve"> }}</w:t>
             </w:r>
           </w:p>
           <w:p>
@@ -2383,7 +3390,9 @@
                 <w:rFonts w:ascii="Microsoft Sans Serif" w:hAnsi="Microsoft Sans Serif" w:cs="Microsoft Sans Serif"/>
                 <w:sz w:val="22"/>
                 <w:szCs w:val="22"/>
+                <w:lang w:val="en-US"/>
               </w:rPr>
+              <w:keepNext/>
             </w:pPr>
           </w:p>
         </w:tc>
@@ -2399,14 +3408,18 @@
                 <w:rFonts w:ascii="Microsoft Sans Serif" w:hAnsi="Microsoft Sans Serif" w:cs="Microsoft Sans Serif"/>
                 <w:sz w:val="22"/>
                 <w:szCs w:val="22"/>
+                <w:lang w:val="en-US"/>
               </w:rPr>
+              <w:keepNext/>
             </w:pPr>
             <w:r>
               <w:rPr>
                 <w:rFonts w:ascii="Microsoft Sans Serif" w:hAnsi="Microsoft Sans Serif" w:cs="Microsoft Sans Serif"/>
                 <w:sz w:val="22"/>
                 <w:szCs w:val="22"/>
+                <w:lang w:val="en-US"/>
               </w:rPr>
+              <w:lastRenderedPageBreak/>
               <w:t xml:space="preserve"> </w:t>
             </w:r>
             <w:r>
@@ -2415,7 +3428,16 @@
                 <w:sz w:val="22"/>
                 <w:szCs w:val="22"/>
               </w:rPr>
-              <w:t>Исполнитель:</w:t>
+              <w:t>Исполнитель</w:t>
+            </w:r>
+            <w:r>
+              <w:rPr>
+                <w:rFonts w:ascii="Microsoft Sans Serif" w:hAnsi="Microsoft Sans Serif" w:cs="Microsoft Sans Serif"/>
+                <w:sz w:val="22"/>
+                <w:szCs w:val="22"/>
+                <w:lang w:val="en-US"/>
+              </w:rPr>
+              <w:t>:</w:t>
             </w:r>
           </w:p>
           <w:p>
@@ -2432,8 +3454,11 @@
                 <w:bCs/>
                 <w:sz w:val="22"/>
                 <w:szCs w:val="22"/>
+                <w:lang w:val="en-US"/>
               </w:rPr>
+              <w:keepNext/>
             </w:pPr>
+            <w:proofErr w:type="gramStart"/>
             <w:r>
               <w:rPr>
                 <w:rFonts w:ascii="Microsoft Sans Serif" w:hAnsi="Microsoft Sans Serif" w:cs="Microsoft Sans Serif"/>
@@ -2441,8 +3466,45 @@
                 <w:bCs/>
                 <w:sz w:val="22"/>
                 <w:szCs w:val="22"/>
+                <w:lang w:val="en-US"/>
               </w:rPr>
-              <w:t>{{ applicant.full_name_native }}</w:t>
+              <w:t xml:space="preserve">{{ </w:t>
+            </w:r>
+            <w:proofErr w:type="spellStart"/>
+            <w:r>
+              <w:rPr>
+                <w:rFonts w:ascii="Microsoft Sans Serif" w:hAnsi="Microsoft Sans Serif" w:cs="Microsoft Sans Serif"/>
+                <w:b/>
+                <w:bCs/>
+                <w:sz w:val="22"/>
+                <w:szCs w:val="22"/>
+                <w:lang w:val="en-US"/>
+              </w:rPr>
+              <w:t>applicant</w:t>
+            </w:r>
+            <w:proofErr w:type="gramEnd"/>
+            <w:r>
+              <w:rPr>
+                <w:rFonts w:ascii="Microsoft Sans Serif" w:hAnsi="Microsoft Sans Serif" w:cs="Microsoft Sans Serif"/>
+                <w:b/>
+                <w:bCs/>
+                <w:sz w:val="22"/>
+                <w:szCs w:val="22"/>
+                <w:lang w:val="en-US"/>
+              </w:rPr>
+              <w:t>.full_name_native</w:t>
+            </w:r>
+            <w:proofErr w:type="spellEnd"/>
+            <w:r>
+              <w:rPr>
+                <w:rFonts w:ascii="Microsoft Sans Serif" w:hAnsi="Microsoft Sans Serif" w:cs="Microsoft Sans Serif"/>
+                <w:b/>
+                <w:bCs/>
+                <w:sz w:val="22"/>
+                <w:szCs w:val="22"/>
+                <w:lang w:val="en-US"/>
+              </w:rPr>
+              <w:t xml:space="preserve"> }}</w:t>
             </w:r>
           </w:p>
           <w:p>
@@ -2457,7 +3519,9 @@
                 <w:rFonts w:ascii="Microsoft Sans Serif" w:hAnsi="Microsoft Sans Serif" w:cs="Microsoft Sans Serif"/>
                 <w:sz w:val="22"/>
                 <w:szCs w:val="22"/>
+                <w:lang w:val="en-US"/>
               </w:rPr>
+              <w:keepNext/>
             </w:pPr>
             <w:r>
               <w:rPr>
@@ -2465,7 +3529,7 @@
                 <w:sz w:val="22"/>
                 <w:szCs w:val="22"/>
               </w:rPr>
-              <w:t xml:space="preserve">Паспорт {{ applicant.passport_formatted }}, </w:t>
+              <w:t>Паспорт</w:t>
             </w:r>
             <w:r>
               <w:rPr>
@@ -2474,14 +3538,9 @@
                 <w:szCs w:val="22"/>
                 <w:lang w:val="en-US"/>
               </w:rPr>
+              <w:t xml:space="preserve"> </w:t>
             </w:r>
-            <w:r>
-              <w:rPr>
-                <w:rFonts w:ascii="Microsoft Sans Serif" w:hAnsi="Microsoft Sans Serif" w:cs="Microsoft Sans Serif"/>
-                <w:sz w:val="22"/>
-                <w:szCs w:val="22"/>
-              </w:rPr>
-            </w:r>
+            <w:proofErr w:type="gramStart"/>
             <w:r>
               <w:rPr>
                 <w:rFonts w:ascii="Microsoft Sans Serif" w:hAnsi="Microsoft Sans Serif" w:cs="Microsoft Sans Serif"/>
@@ -2489,20 +3548,37 @@
                 <w:szCs w:val="22"/>
                 <w:lang w:val="en-US"/>
               </w:rPr>
+              <w:t xml:space="preserve">{{ </w:t>
             </w:r>
+            <w:proofErr w:type="spellStart"/>
             <w:r>
               <w:rPr>
                 <w:rFonts w:ascii="Microsoft Sans Serif" w:hAnsi="Microsoft Sans Serif" w:cs="Microsoft Sans Serif"/>
                 <w:sz w:val="22"/>
                 <w:szCs w:val="22"/>
+                <w:lang w:val="en-US"/>
               </w:rPr>
+              <w:t>applicant</w:t>
             </w:r>
+            <w:proofErr w:type="gramEnd"/>
             <w:r>
               <w:rPr>
                 <w:rFonts w:ascii="Microsoft Sans Serif" w:hAnsi="Microsoft Sans Serif" w:cs="Microsoft Sans Serif"/>
                 <w:sz w:val="22"/>
                 <w:szCs w:val="22"/>
+                <w:lang w:val="en-US"/>
               </w:rPr>
+              <w:t>.passport_formatted</w:t>
+            </w:r>
+            <w:proofErr w:type="spellEnd"/>
+            <w:r>
+              <w:rPr>
+                <w:rFonts w:ascii="Microsoft Sans Serif" w:hAnsi="Microsoft Sans Serif" w:cs="Microsoft Sans Serif"/>
+                <w:sz w:val="22"/>
+                <w:szCs w:val="22"/>
+                <w:lang w:val="en-US"/>
+              </w:rPr>
+              <w:t xml:space="preserve"> }}, </w:t>
             </w:r>
           </w:p>
           <w:p>
@@ -2517,7 +3593,9 @@
                 <w:rFonts w:ascii="Microsoft Sans Serif" w:hAnsi="Microsoft Sans Serif" w:cs="Microsoft Sans Serif"/>
                 <w:sz w:val="22"/>
                 <w:szCs w:val="22"/>
+                <w:lang w:val="en-US"/>
               </w:rPr>
+              <w:keepNext/>
             </w:pPr>
             <w:r>
               <w:rPr>
@@ -2525,7 +3603,76 @@
                 <w:sz w:val="22"/>
                 <w:szCs w:val="22"/>
               </w:rPr>
-              <w:t xml:space="preserve">выдан {{ fmt_date_ru(applicant.passport_issue_date) }}г. {{ applicant.passport_issuer }} </w:t>
+              <w:t>выдан</w:t>
+            </w:r>
+            <w:r>
+              <w:rPr>
+                <w:rFonts w:ascii="Microsoft Sans Serif" w:hAnsi="Microsoft Sans Serif" w:cs="Microsoft Sans Serif"/>
+                <w:sz w:val="22"/>
+                <w:szCs w:val="22"/>
+                <w:lang w:val="en-US"/>
+              </w:rPr>
+              <w:t xml:space="preserve"> </w:t>
+            </w:r>
+            <w:proofErr w:type="gramStart"/>
+            <w:r>
+              <w:rPr>
+                <w:rFonts w:ascii="Microsoft Sans Serif" w:hAnsi="Microsoft Sans Serif" w:cs="Microsoft Sans Serif"/>
+                <w:sz w:val="22"/>
+                <w:szCs w:val="22"/>
+                <w:lang w:val="en-US"/>
+              </w:rPr>
+              <w:t xml:space="preserve">{{ </w:t>
+            </w:r>
+            <w:proofErr w:type="spellStart"/>
+            <w:r>
+              <w:rPr>
+                <w:rFonts w:ascii="Microsoft Sans Serif" w:hAnsi="Microsoft Sans Serif" w:cs="Microsoft Sans Serif"/>
+                <w:sz w:val="22"/>
+                <w:szCs w:val="22"/>
+                <w:lang w:val="en-US"/>
+              </w:rPr>
+              <w:t>fmt</w:t>
+            </w:r>
+            <w:proofErr w:type="gramEnd"/>
+            <w:r>
+              <w:rPr>
+                <w:rFonts w:ascii="Microsoft Sans Serif" w:hAnsi="Microsoft Sans Serif" w:cs="Microsoft Sans Serif"/>
+                <w:sz w:val="22"/>
+                <w:szCs w:val="22"/>
+                <w:lang w:val="en-US"/>
+              </w:rPr>
+              <w:t>_date_ru</w:t>
+            </w:r>
+            <w:proofErr w:type="spellEnd"/>
+            <w:r>
+              <w:rPr>
+                <w:rFonts w:ascii="Microsoft Sans Serif" w:hAnsi="Microsoft Sans Serif" w:cs="Microsoft Sans Serif"/>
+                <w:sz w:val="22"/>
+                <w:szCs w:val="22"/>
+                <w:lang w:val="en-US"/>
+              </w:rPr>
+              <w:t>(</w:t>
+            </w:r>
+            <w:proofErr w:type="spellStart"/>
+            <w:r>
+              <w:rPr>
+                <w:rFonts w:ascii="Microsoft Sans Serif" w:hAnsi="Microsoft Sans Serif" w:cs="Microsoft Sans Serif"/>
+                <w:sz w:val="22"/>
+                <w:szCs w:val="22"/>
+                <w:lang w:val="en-US"/>
+              </w:rPr>
+              <w:t>applicant.passport_issue_date</w:t>
+            </w:r>
+            <w:proofErr w:type="spellEnd"/>
+            <w:r>
+              <w:rPr>
+                <w:rFonts w:ascii="Microsoft Sans Serif" w:hAnsi="Microsoft Sans Serif" w:cs="Microsoft Sans Serif"/>
+                <w:sz w:val="22"/>
+                <w:szCs w:val="22"/>
+                <w:lang w:val="en-US"/>
+              </w:rPr>
+              <w:t>) }}</w:t>
             </w:r>
             <w:r>
               <w:rPr>
@@ -2533,13 +3680,36 @@
                 <w:sz w:val="22"/>
                 <w:szCs w:val="22"/>
               </w:rPr>
+              <w:t>г</w:t>
             </w:r>
             <w:r>
               <w:rPr>
                 <w:rFonts w:ascii="Microsoft Sans Serif" w:hAnsi="Microsoft Sans Serif" w:cs="Microsoft Sans Serif"/>
                 <w:sz w:val="22"/>
                 <w:szCs w:val="22"/>
+                <w:lang w:val="en-US"/>
               </w:rPr>
+              <w:t xml:space="preserve">. {{ </w:t>
+            </w:r>
+            <w:proofErr w:type="spellStart"/>
+            <w:r>
+              <w:rPr>
+                <w:rFonts w:ascii="Microsoft Sans Serif" w:hAnsi="Microsoft Sans Serif" w:cs="Microsoft Sans Serif"/>
+                <w:sz w:val="22"/>
+                <w:szCs w:val="22"/>
+                <w:lang w:val="en-US"/>
+              </w:rPr>
+              <w:t>applicant.passport_issuer</w:t>
+            </w:r>
+            <w:proofErr w:type="spellEnd"/>
+            <w:r>
+              <w:rPr>
+                <w:rFonts w:ascii="Microsoft Sans Serif" w:hAnsi="Microsoft Sans Serif" w:cs="Microsoft Sans Serif"/>
+                <w:sz w:val="22"/>
+                <w:szCs w:val="22"/>
+                <w:lang w:val="en-US"/>
+              </w:rPr>
+              <w:t xml:space="preserve"> }} </w:t>
             </w:r>
           </w:p>
           <w:p>
@@ -2554,7 +3724,9 @@
                 <w:rFonts w:ascii="Microsoft Sans Serif" w:hAnsi="Microsoft Sans Serif" w:cs="Microsoft Sans Serif"/>
                 <w:sz w:val="22"/>
                 <w:szCs w:val="22"/>
+                <w:lang w:val="en-US"/>
               </w:rPr>
+              <w:keepNext/>
             </w:pPr>
             <w:r>
               <w:rPr>
@@ -2562,14 +3734,48 @@
                 <w:sz w:val="22"/>
                 <w:szCs w:val="22"/>
               </w:rPr>
-              <w:t>ИНН {{ applicant.inn }}</w:t>
+              <w:lastRenderedPageBreak/>
+              <w:t>ИНН</w:t>
             </w:r>
             <w:r>
               <w:rPr>
                 <w:rFonts w:ascii="Microsoft Sans Serif" w:hAnsi="Microsoft Sans Serif" w:cs="Microsoft Sans Serif"/>
                 <w:sz w:val="22"/>
                 <w:szCs w:val="22"/>
+                <w:lang w:val="en-US"/>
               </w:rPr>
+              <w:t xml:space="preserve"> </w:t>
+            </w:r>
+            <w:proofErr w:type="gramStart"/>
+            <w:r>
+              <w:rPr>
+                <w:rFonts w:ascii="Microsoft Sans Serif" w:hAnsi="Microsoft Sans Serif" w:cs="Microsoft Sans Serif"/>
+                <w:sz w:val="22"/>
+                <w:szCs w:val="22"/>
+                <w:lang w:val="en-US"/>
+              </w:rPr>
+              <w:t xml:space="preserve">{{ </w:t>
+            </w:r>
+            <w:proofErr w:type="spellStart"/>
+            <w:r>
+              <w:rPr>
+                <w:rFonts w:ascii="Microsoft Sans Serif" w:hAnsi="Microsoft Sans Serif" w:cs="Microsoft Sans Serif"/>
+                <w:sz w:val="22"/>
+                <w:szCs w:val="22"/>
+                <w:lang w:val="en-US"/>
+              </w:rPr>
+              <w:t>applicant.inn</w:t>
+            </w:r>
+            <w:proofErr w:type="spellEnd"/>
+            <w:proofErr w:type="gramEnd"/>
+            <w:r>
+              <w:rPr>
+                <w:rFonts w:ascii="Microsoft Sans Serif" w:hAnsi="Microsoft Sans Serif" w:cs="Microsoft Sans Serif"/>
+                <w:sz w:val="22"/>
+                <w:szCs w:val="22"/>
+                <w:lang w:val="en-US"/>
+              </w:rPr>
+              <w:t xml:space="preserve"> }}</w:t>
             </w:r>
           </w:p>
           <w:p>
@@ -2584,15 +3790,29 @@
                 <w:rFonts w:ascii="Microsoft Sans Serif" w:hAnsi="Microsoft Sans Serif" w:cs="Microsoft Sans Serif"/>
                 <w:sz w:val="22"/>
                 <w:szCs w:val="22"/>
+                <w:lang w:val="en-US"/>
               </w:rPr>
+              <w:keepNext/>
             </w:pPr>
+            <w:proofErr w:type="gramStart"/>
             <w:r>
               <w:rPr>
                 <w:rFonts w:ascii="Microsoft Sans Serif" w:hAnsi="Microsoft Sans Serif" w:cs="Microsoft Sans Serif"/>
                 <w:sz w:val="22"/>
                 <w:szCs w:val="22"/>
+                <w:lang w:val="en-US"/>
               </w:rPr>
-              <w:t xml:space="preserve">{{ applicant.home_address_line1 }} </w:t>
+              <w:t xml:space="preserve">{{ applicant.home_address }} </w:t>
+            </w:r>
+            <w:proofErr w:type="gramEnd"/>
+            <w:r>
+              <w:rPr>
+                <w:rFonts w:ascii="Microsoft Sans Serif" w:hAnsi="Microsoft Sans Serif" w:cs="Microsoft Sans Serif"/>
+                <w:sz w:val="22"/>
+                <w:szCs w:val="22"/>
+                <w:lang w:val="en-US"/>
+              </w:rPr>
+              <w:t xml:space="preserve"/>
             </w:r>
           </w:p>
           <w:p>
@@ -2607,7 +3827,9 @@
                 <w:rFonts w:ascii="Microsoft Sans Serif" w:hAnsi="Microsoft Sans Serif" w:cs="Microsoft Sans Serif"/>
                 <w:sz w:val="22"/>
                 <w:szCs w:val="22"/>
+                <w:lang w:val="en-US"/>
               </w:rPr>
+              <w:keepNext/>
             </w:pPr>
             <w:r>
               <w:rPr>
@@ -2615,7 +3837,73 @@
                 <w:sz w:val="22"/>
                 <w:szCs w:val="22"/>
               </w:rPr>
-              <w:t>{{ applicant.home_address_line2 }}</w:t>
+              <w:t>р</w:t>
+            </w:r>
+            <w:r>
+              <w:rPr>
+                <w:rFonts w:ascii="Microsoft Sans Serif" w:hAnsi="Microsoft Sans Serif" w:cs="Microsoft Sans Serif"/>
+                <w:sz w:val="22"/>
+                <w:szCs w:val="22"/>
+                <w:lang w:val="en-US"/>
+              </w:rPr>
+              <w:t>\</w:t>
+            </w:r>
+            <w:r>
+              <w:rPr>
+                <w:rFonts w:ascii="Microsoft Sans Serif" w:hAnsi="Microsoft Sans Serif" w:cs="Microsoft Sans Serif"/>
+                <w:sz w:val="22"/>
+                <w:szCs w:val="22"/>
+              </w:rPr>
+              <w:t>с</w:t>
+            </w:r>
+            <w:r>
+              <w:rPr>
+                <w:rFonts w:ascii="Microsoft Sans Serif" w:hAnsi="Microsoft Sans Serif" w:cs="Microsoft Sans Serif"/>
+                <w:sz w:val="22"/>
+                <w:szCs w:val="22"/>
+                <w:lang w:val="en-US"/>
+              </w:rPr>
+              <w:t xml:space="preserve"> </w:t>
+            </w:r>
+            <w:proofErr w:type="gramStart"/>
+            <w:r>
+              <w:rPr>
+                <w:rFonts w:ascii="Microsoft Sans Serif" w:hAnsi="Microsoft Sans Serif" w:cs="Microsoft Sans Serif"/>
+                <w:sz w:val="22"/>
+                <w:szCs w:val="22"/>
+                <w:lang w:val="en-US"/>
+              </w:rPr>
+              <w:t xml:space="preserve">{{ </w:t>
+            </w:r>
+            <w:proofErr w:type="spellStart"/>
+            <w:r>
+              <w:rPr>
+                <w:rFonts w:ascii="Microsoft Sans Serif" w:hAnsi="Microsoft Sans Serif" w:cs="Microsoft Sans Serif"/>
+                <w:sz w:val="22"/>
+                <w:szCs w:val="22"/>
+                <w:lang w:val="en-US"/>
+              </w:rPr>
+              <w:t>applicant</w:t>
+            </w:r>
+            <w:proofErr w:type="gramEnd"/>
+            <w:r>
+              <w:rPr>
+                <w:rFonts w:ascii="Microsoft Sans Serif" w:hAnsi="Microsoft Sans Serif" w:cs="Microsoft Sans Serif"/>
+                <w:sz w:val="22"/>
+                <w:szCs w:val="22"/>
+                <w:lang w:val="en-US"/>
+              </w:rPr>
+              <w:t>.bank_account</w:t>
+            </w:r>
+            <w:proofErr w:type="spellEnd"/>
+            <w:r>
+              <w:rPr>
+                <w:rFonts w:ascii="Microsoft Sans Serif" w:hAnsi="Microsoft Sans Serif" w:cs="Microsoft Sans Serif"/>
+                <w:sz w:val="22"/>
+                <w:szCs w:val="22"/>
+                <w:lang w:val="en-US"/>
+              </w:rPr>
+              <w:t xml:space="preserve"> }}</w:t>
             </w:r>
           </w:p>
           <w:p>
@@ -2630,7 +3918,9 @@
                 <w:rFonts w:ascii="Microsoft Sans Serif" w:hAnsi="Microsoft Sans Serif" w:cs="Microsoft Sans Serif"/>
                 <w:sz w:val="22"/>
                 <w:szCs w:val="22"/>
+                <w:lang w:val="en-US"/>
               </w:rPr>
+              <w:keepNext/>
             </w:pPr>
             <w:r>
               <w:rPr>
@@ -2638,13 +3928,81 @@
                 <w:sz w:val="22"/>
                 <w:szCs w:val="22"/>
               </w:rPr>
-              <w:t>р\с {{ applicant.bank_account }}</w:t>
+              <w:t>в</w:t>
             </w:r>
             <w:r>
               <w:rPr>
+                <w:rFonts w:ascii="Microsoft Sans Serif" w:hAnsi="Microsoft Sans Serif" w:cs="Microsoft Sans Serif"/>
                 <w:sz w:val="22"/>
                 <w:szCs w:val="22"/>
+                <w:lang w:val="en-US"/>
               </w:rPr>
+              <w:t xml:space="preserve"> </w:t>
+            </w:r>
+            <w:proofErr w:type="gramStart"/>
+            <w:r>
+              <w:rPr>
+                <w:rFonts w:ascii="Microsoft Sans Serif" w:hAnsi="Microsoft Sans Serif" w:cs="Microsoft Sans Serif"/>
+                <w:sz w:val="22"/>
+                <w:szCs w:val="22"/>
+                <w:lang w:val="en-US"/>
+              </w:rPr>
+              <w:t xml:space="preserve">{{ </w:t>
+            </w:r>
+            <w:proofErr w:type="spellStart"/>
+            <w:r>
+              <w:rPr>
+                <w:rFonts w:ascii="Microsoft Sans Serif" w:hAnsi="Microsoft Sans Serif" w:cs="Microsoft Sans Serif"/>
+                <w:sz w:val="22"/>
+                <w:szCs w:val="22"/>
+                <w:lang w:val="en-US"/>
+              </w:rPr>
+              <w:t>applicant</w:t>
+            </w:r>
+            <w:proofErr w:type="gramEnd"/>
+            <w:r>
+              <w:rPr>
+                <w:rFonts w:ascii="Microsoft Sans Serif" w:hAnsi="Microsoft Sans Serif" w:cs="Microsoft Sans Serif"/>
+                <w:sz w:val="22"/>
+                <w:szCs w:val="22"/>
+                <w:lang w:val="en-US"/>
+              </w:rPr>
+              <w:t>.bank_name</w:t>
+            </w:r>
+            <w:proofErr w:type="spellEnd"/>
+            <w:r>
+              <w:rPr>
+                <w:rFonts w:ascii="Microsoft Sans Serif" w:hAnsi="Microsoft Sans Serif" w:cs="Microsoft Sans Serif"/>
+                <w:sz w:val="22"/>
+                <w:szCs w:val="22"/>
+                <w:lang w:val="en-US"/>
+              </w:rPr>
+              <w:t xml:space="preserve"> }}</w:t>
+            </w:r>
+          </w:p>
+          <w:p>
+            <w:pPr>
+              <w:pStyle w:val="ConsNormal"/>
+              <w:tabs>
+                <w:tab w:val="left" w:pos="1635"/>
+              </w:tabs>
+              <w:jc w:val="left"/>
+              <w:rPr>
+                <w:rFonts w:ascii="Microsoft Sans Serif" w:hAnsi="Microsoft Sans Serif" w:cs="Microsoft Sans Serif"/>
+                <w:sz w:val="22"/>
+                <w:szCs w:val="22"/>
+                <w:lang w:val="en-US"/>
+              </w:rPr>
+              <w:keepNext/>
+            </w:pPr>
+            <w:r>
+              <w:rPr>
+                <w:rFonts w:ascii="Microsoft Sans Serif" w:hAnsi="Microsoft Sans Serif" w:cs="Microsoft Sans Serif"/>
+                <w:sz w:val="22"/>
+                <w:szCs w:val="22"/>
+                <w:lang w:val="en-US"/>
+              </w:rPr>
+              <w:t xml:space="preserve"> </w:t>
             </w:r>
             <w:r>
               <w:rPr>
@@ -2652,6 +4010,73 @@
                 <w:sz w:val="22"/>
                 <w:szCs w:val="22"/>
               </w:rPr>
+              <w:t>БИК</w:t>
+            </w:r>
+            <w:r>
+              <w:rPr>
+                <w:rFonts w:ascii="Microsoft Sans Serif" w:hAnsi="Microsoft Sans Serif" w:cs="Microsoft Sans Serif"/>
+                <w:sz w:val="22"/>
+                <w:szCs w:val="22"/>
+                <w:lang w:val="en-US"/>
+              </w:rPr>
+              <w:t xml:space="preserve"> </w:t>
+            </w:r>
+            <w:r>
+              <w:rPr>
+                <w:rFonts w:ascii="Microsoft Sans Serif" w:hAnsi="Microsoft Sans Serif" w:cs="Microsoft Sans Serif"/>
+                <w:sz w:val="22"/>
+                <w:szCs w:val="22"/>
+              </w:rPr>
+              <w:t>банка</w:t>
+            </w:r>
+            <w:r>
+              <w:rPr>
+                <w:rFonts w:ascii="Microsoft Sans Serif" w:hAnsi="Microsoft Sans Serif" w:cs="Microsoft Sans Serif"/>
+                <w:sz w:val="22"/>
+                <w:szCs w:val="22"/>
+                <w:lang w:val="en-US"/>
+              </w:rPr>
+              <w:t xml:space="preserve">: </w:t>
+            </w:r>
+            <w:proofErr w:type="gramStart"/>
+            <w:r>
+              <w:rPr>
+                <w:rFonts w:ascii="Microsoft Sans Serif" w:hAnsi="Microsoft Sans Serif" w:cs="Microsoft Sans Serif"/>
+                <w:sz w:val="22"/>
+                <w:szCs w:val="22"/>
+                <w:lang w:val="en-US"/>
+              </w:rPr>
+              <w:t xml:space="preserve">{{ </w:t>
+            </w:r>
+            <w:proofErr w:type="spellStart"/>
+            <w:r>
+              <w:rPr>
+                <w:rFonts w:ascii="Microsoft Sans Serif" w:hAnsi="Microsoft Sans Serif" w:cs="Microsoft Sans Serif"/>
+                <w:sz w:val="22"/>
+                <w:szCs w:val="22"/>
+                <w:lang w:val="en-US"/>
+              </w:rPr>
+              <w:t>applicant</w:t>
+            </w:r>
+            <w:proofErr w:type="gramEnd"/>
+            <w:r>
+              <w:rPr>
+                <w:rFonts w:ascii="Microsoft Sans Serif" w:hAnsi="Microsoft Sans Serif" w:cs="Microsoft Sans Serif"/>
+                <w:sz w:val="22"/>
+                <w:szCs w:val="22"/>
+                <w:lang w:val="en-US"/>
+              </w:rPr>
+              <w:t>.bank_bic</w:t>
+            </w:r>
+            <w:proofErr w:type="spellEnd"/>
+            <w:r>
+              <w:rPr>
+                <w:rFonts w:ascii="Microsoft Sans Serif" w:hAnsi="Microsoft Sans Serif" w:cs="Microsoft Sans Serif"/>
+                <w:sz w:val="22"/>
+                <w:szCs w:val="22"/>
+                <w:lang w:val="en-US"/>
+              </w:rPr>
+              <w:t xml:space="preserve"> }}</w:t>
             </w:r>
           </w:p>
           <w:p>
@@ -2666,7 +4091,9 @@
                 <w:rFonts w:ascii="Microsoft Sans Serif" w:hAnsi="Microsoft Sans Serif" w:cs="Microsoft Sans Serif"/>
                 <w:sz w:val="22"/>
                 <w:szCs w:val="22"/>
+                <w:lang w:val="en-US"/>
               </w:rPr>
+              <w:keepNext/>
             </w:pPr>
             <w:r>
               <w:rPr>
@@ -2674,7 +4101,16 @@
                 <w:sz w:val="22"/>
                 <w:szCs w:val="22"/>
               </w:rPr>
-              <w:t>в {{ applicant.bank_name }}</w:t>
+              <w:t>К</w:t>
+            </w:r>
+            <w:r>
+              <w:rPr>
+                <w:rFonts w:ascii="Microsoft Sans Serif" w:hAnsi="Microsoft Sans Serif" w:cs="Microsoft Sans Serif"/>
+                <w:sz w:val="22"/>
+                <w:szCs w:val="22"/>
+                <w:lang w:val="en-US"/>
+              </w:rPr>
+              <w:t>\</w:t>
             </w:r>
             <w:r>
               <w:rPr>
@@ -2682,79 +4118,56 @@
                 <w:sz w:val="22"/>
                 <w:szCs w:val="22"/>
               </w:rPr>
-            </w:r>
-          </w:p>
-          <w:p>
-            <w:pPr>
-              <w:pStyle w:val="ConsNormal"/>
-              <w:tabs>
-                <w:tab w:val="left" w:pos="1635"/>
-              </w:tabs>
-              <w:jc w:val="left"/>
-              <w:rPr>
-                <w:rFonts w:ascii="Microsoft Sans Serif" w:hAnsi="Microsoft Sans Serif" w:cs="Microsoft Sans Serif"/>
-                <w:sz w:val="22"/>
-                <w:szCs w:val="22"/>
-              </w:rPr>
-            </w:pPr>
-            <w:r>
-              <w:rPr>
-                <w:rFonts w:ascii="Microsoft Sans Serif" w:hAnsi="Microsoft Sans Serif" w:cs="Microsoft Sans Serif"/>
-                <w:sz w:val="22"/>
-                <w:szCs w:val="22"/>
-              </w:rPr>
-              <w:t xml:space="preserve"> БИК банка: {{ applicant.bank_bic }}</w:t>
+              <w:t>с</w:t>
             </w:r>
             <w:r>
               <w:rPr>
                 <w:rFonts w:ascii="Microsoft Sans Serif" w:hAnsi="Microsoft Sans Serif" w:cs="Microsoft Sans Serif"/>
                 <w:sz w:val="22"/>
                 <w:szCs w:val="22"/>
+                <w:lang w:val="en-US"/>
               </w:rPr>
+              <w:t xml:space="preserve">: </w:t>
             </w:r>
+            <w:proofErr w:type="gramStart"/>
             <w:r>
               <w:rPr>
                 <w:rFonts w:ascii="Microsoft Sans Serif" w:hAnsi="Microsoft Sans Serif" w:cs="Microsoft Sans Serif"/>
                 <w:sz w:val="22"/>
                 <w:szCs w:val="22"/>
+                <w:lang w:val="en-US"/>
               </w:rPr>
+              <w:t xml:space="preserve">{{ </w:t>
             </w:r>
+            <w:proofErr w:type="spellStart"/>
             <w:r>
               <w:rPr>
                 <w:rFonts w:ascii="Microsoft Sans Serif" w:hAnsi="Microsoft Sans Serif" w:cs="Microsoft Sans Serif"/>
                 <w:sz w:val="22"/>
                 <w:szCs w:val="22"/>
+                <w:lang w:val="en-US"/>
               </w:rPr>
+              <w:t>applicant</w:t>
             </w:r>
-          </w:p>
-          <w:p>
-            <w:pPr>
-              <w:pStyle w:val="ConsNormal"/>
-              <w:tabs>
-                <w:tab w:val="left" w:pos="1635"/>
-              </w:tabs>
-              <w:ind w:left="40"/>
-              <w:jc w:val="left"/>
-              <w:rPr>
-                <w:rFonts w:ascii="Microsoft Sans Serif" w:hAnsi="Microsoft Sans Serif" w:cs="Microsoft Sans Serif"/>
-                <w:sz w:val="22"/>
-                <w:szCs w:val="22"/>
-              </w:rPr>
-            </w:pPr>
+            <w:proofErr w:type="gramEnd"/>
             <w:r>
               <w:rPr>
                 <w:rFonts w:ascii="Microsoft Sans Serif" w:hAnsi="Microsoft Sans Serif" w:cs="Microsoft Sans Serif"/>
                 <w:sz w:val="22"/>
                 <w:szCs w:val="22"/>
+                <w:lang w:val="en-US"/>
               </w:rPr>
-              <w:t>К\с: {{ applicant.bank_correspondent_account }}</w:t>
+              <w:t>.bank_correspondent_account</w:t>
             </w:r>
+            <w:proofErr w:type="spellEnd"/>
             <w:r>
               <w:rPr>
                 <w:rFonts w:ascii="Microsoft Sans Serif" w:hAnsi="Microsoft Sans Serif" w:cs="Microsoft Sans Serif"/>
                 <w:sz w:val="22"/>
                 <w:szCs w:val="22"/>
+                <w:lang w:val="en-US"/>
               </w:rPr>
+              <w:t xml:space="preserve"> }}</w:t>
             </w:r>
           </w:p>
         </w:tc>
@@ -2769,6 +4182,7 @@
           <w:sz w:val="22"/>
           <w:szCs w:val="22"/>
         </w:rPr>
+        <w:keepNext/>
       </w:pPr>
       <w:r>
         <w:rPr>
@@ -2776,6 +4190,7 @@
           <w:sz w:val="22"/>
           <w:szCs w:val="22"/>
         </w:rPr>
+        <w:lastRenderedPageBreak/>
         <w:t>Подписи Сторон</w:t>
       </w:r>
     </w:p>
@@ -2804,6 +4219,7 @@
                 <w:sz w:val="22"/>
                 <w:szCs w:val="22"/>
               </w:rPr>
+              <w:keepNext/>
             </w:pPr>
           </w:p>
         </w:tc>
@@ -2820,6 +4236,7 @@
                 <w:sz w:val="22"/>
                 <w:szCs w:val="22"/>
               </w:rPr>
+              <w:keepNext/>
             </w:pPr>
           </w:p>
         </w:tc>
@@ -2836,6 +4253,7 @@
                 <w:sz w:val="22"/>
                 <w:szCs w:val="22"/>
               </w:rPr>
+              <w:keepNext/>
             </w:pPr>
           </w:p>
         </w:tc>
@@ -2854,6 +4272,7 @@
                 <w:sz w:val="22"/>
                 <w:szCs w:val="22"/>
               </w:rPr>
+              <w:keepNext/>
             </w:pPr>
             <w:r>
               <w:rPr>
@@ -2861,14 +4280,43 @@
                 <w:sz w:val="22"/>
                 <w:szCs w:val="22"/>
               </w:rPr>
-              <w:t>__________________/{{ company.director_short_ru }}</w:t>
+              <w:t>__________________</w:t>
             </w:r>
+            <w:proofErr w:type="gramStart"/>
             <w:r>
               <w:rPr>
                 <w:rFonts w:ascii="Microsoft Sans Serif" w:hAnsi="Microsoft Sans Serif" w:cs="Microsoft Sans Serif"/>
                 <w:sz w:val="22"/>
                 <w:szCs w:val="22"/>
               </w:rPr>
+              <w:t>/{</w:t>
+            </w:r>
+            <w:proofErr w:type="gramEnd"/>
+            <w:r>
+              <w:rPr>
+                <w:rFonts w:ascii="Microsoft Sans Serif" w:hAnsi="Microsoft Sans Serif" w:cs="Microsoft Sans Serif"/>
+                <w:sz w:val="22"/>
+                <w:szCs w:val="22"/>
+              </w:rPr>
+              <w:t xml:space="preserve">{ </w:t>
+            </w:r>
+            <w:proofErr w:type="spellStart"/>
+            <w:r>
+              <w:rPr>
+                <w:rFonts w:ascii="Microsoft Sans Serif" w:hAnsi="Microsoft Sans Serif" w:cs="Microsoft Sans Serif"/>
+                <w:sz w:val="22"/>
+                <w:szCs w:val="22"/>
+              </w:rPr>
+              <w:t>company.director_short_ru</w:t>
+            </w:r>
+            <w:proofErr w:type="spellEnd"/>
+            <w:r>
+              <w:rPr>
+                <w:rFonts w:ascii="Microsoft Sans Serif" w:hAnsi="Microsoft Sans Serif" w:cs="Microsoft Sans Serif"/>
+                <w:sz w:val="22"/>
+                <w:szCs w:val="22"/>
+              </w:rPr>
+              <w:t xml:space="preserve"> }}</w:t>
             </w:r>
           </w:p>
         </w:tc>
@@ -2885,6 +4333,7 @@
                 <w:sz w:val="22"/>
                 <w:szCs w:val="22"/>
               </w:rPr>
+              <w:keepNext/>
             </w:pPr>
           </w:p>
         </w:tc>
@@ -2908,62 +4357,43 @@
                 <w:sz w:val="22"/>
                 <w:szCs w:val="22"/>
               </w:rPr>
-              <w:t xml:space="preserve">              _____________/ {{ applicant.initials_native }}</w:t>
+              <w:t xml:space="preserve">              _____________/ </w:t>
             </w:r>
+            <w:proofErr w:type="gramStart"/>
             <w:r>
               <w:rPr>
                 <w:rFonts w:ascii="Microsoft Sans Serif" w:hAnsi="Microsoft Sans Serif" w:cs="Microsoft Sans Serif"/>
                 <w:sz w:val="22"/>
                 <w:szCs w:val="22"/>
               </w:rPr>
+              <w:t xml:space="preserve">{{ </w:t>
             </w:r>
+            <w:proofErr w:type="spellStart"/>
             <w:r>
               <w:rPr>
                 <w:rFonts w:ascii="Microsoft Sans Serif" w:hAnsi="Microsoft Sans Serif" w:cs="Microsoft Sans Serif"/>
                 <w:sz w:val="22"/>
                 <w:szCs w:val="22"/>
               </w:rPr>
+              <w:t>applicant</w:t>
             </w:r>
+            <w:proofErr w:type="gramEnd"/>
             <w:r>
               <w:rPr>
                 <w:rFonts w:ascii="Microsoft Sans Serif" w:hAnsi="Microsoft Sans Serif" w:cs="Microsoft Sans Serif"/>
                 <w:sz w:val="22"/>
                 <w:szCs w:val="22"/>
               </w:rPr>
+              <w:t>.initials_native</w:t>
             </w:r>
+            <w:proofErr w:type="spellEnd"/>
             <w:r>
               <w:rPr>
                 <w:rFonts w:ascii="Microsoft Sans Serif" w:hAnsi="Microsoft Sans Serif" w:cs="Microsoft Sans Serif"/>
                 <w:sz w:val="22"/>
                 <w:szCs w:val="22"/>
               </w:rPr>
-            </w:r>
-            <w:r>
-              <w:rPr>
-                <w:rFonts w:ascii="Microsoft Sans Serif" w:hAnsi="Microsoft Sans Serif" w:cs="Microsoft Sans Serif"/>
-                <w:sz w:val="22"/>
-                <w:szCs w:val="22"/>
-              </w:rPr>
-            </w:r>
-            <w:r>
-              <w:rPr>
-                <w:rFonts w:ascii="Microsoft Sans Serif" w:hAnsi="Microsoft Sans Serif" w:cs="Microsoft Sans Serif"/>
-                <w:sz w:val="22"/>
-                <w:szCs w:val="22"/>
-              </w:rPr>
-            </w:r>
-            <w:r>
-              <w:rPr>
-                <w:sz w:val="22"/>
-                <w:szCs w:val="22"/>
-              </w:rPr>
-            </w:r>
-            <w:r>
-              <w:rPr>
-                <w:rFonts w:ascii="Microsoft Sans Serif" w:hAnsi="Microsoft Sans Serif" w:cs="Microsoft Sans Serif"/>
-                <w:sz w:val="22"/>
-                <w:szCs w:val="22"/>
-              </w:rPr>
+              <w:t xml:space="preserve"> }}</w:t>
             </w:r>
           </w:p>
         </w:tc>
@@ -2980,8 +4410,8 @@
       </w:pPr>
     </w:p>
     <w:sectPr>
-      <w:footerReference w:type="default" r:id="rId7"/>
-      <w:headerReference w:type="default" r:id="rId10"/>
+      <w:headerReference w:type="default" r:id="rId7"/>
+      <w:footerReference w:type="default" r:id="rId8"/>
       <w:pgSz w:w="11906" w:h="16838"/>
       <w:pgMar w:top="454" w:right="567" w:bottom="567" w:left="567" w:header="0" w:footer="0" w:gutter="0"/>
       <w:cols w:space="1701"/>
@@ -2992,7 +4422,7 @@
 </file>
 
 <file path=word/endnotes.xml><?xml version="1.0" encoding="utf-8"?>
-<w:endnotes xmlns:wpc="http://schemas.microsoft.com/office/word/2010/wordprocessingCanvas" xmlns:cx="http://schemas.microsoft.com/office/drawing/2014/chartex" xmlns:cx1="http://schemas.microsoft.com/office/drawing/2015/9/8/chartex" xmlns:cx2="http://schemas.microsoft.com/office/drawing/2015/10/21/chartex" xmlns:cx3="http://schemas.microsoft.com/office/drawing/2016/5/9/chartex" xmlns:cx4="http://schemas.microsoft.com/office/drawing/2016/5/10/chartex" xmlns:cx5="http://schemas.microsoft.com/office/drawing/2016/5/11/chartex" xmlns:cx6="http://schemas.microsoft.com/office/drawing/2016/5/12/chartex" xmlns:cx7="http://schemas.microsoft.com/office/drawing/2016/5/13/chartex" xmlns:cx8="http://schemas.microsoft.com/office/drawing/2016/5/14/chartex" xmlns:mc="http://schemas.openxmlformats.org/markup-compatibility/2006" xmlns:aink="http://schemas.microsoft.com/office/drawing/2016/ink" xmlns:am3d="http://schemas.microsoft.com/office/drawing/2017/model3d" xmlns:o="urn:schemas-microsoft-com:office:office" xmlns:oel="http://schemas.microsoft.com/office/2019/extlst" xmlns:r="http://schemas.openxmlformats.org/officeDocument/2006/relationships" xmlns:m="http://schemas.openxmlformats.org/officeDocument/2006/math" xmlns:v="urn:schemas-microsoft-com:vml" xmlns:wp14="http://schemas.microsoft.com/office/word/2010/wordprocessingDrawing" xmlns:wp="http://schemas.openxmlformats.org/drawingml/2006/wordprocessingDrawing" xmlns:w10="urn:schemas-microsoft-com:office:word" xmlns:w="http://schemas.openxmlformats.org/wordprocessingml/2006/main" xmlns:w14="http://schemas.microsoft.com/office/word/2010/wordml" xmlns:w15="http://schemas.microsoft.com/office/word/2012/wordml" xmlns:w16cex="http://schemas.microsoft.com/office/word/2018/wordml/cex" xmlns:w16cid="http://schemas.microsoft.com/office/word/2016/wordml/cid" xmlns:w16="http://schemas.microsoft.com/office/word/2018/wordml" xmlns:w16du="http://schemas.microsoft.com/office/word/2023/wordml/word16du" xmlns:w16sdtdh="http://schemas.microsoft.com/office/word/2020/wordml/sdtdatahash" xmlns:w16sdtfl="http://schemas.microsoft.com/office/word/2024/wordml/sdtformatlock" xmlns:w16se="http://schemas.microsoft.com/office/word/2015/wordml/symex" xmlns:wpg="http://schemas.microsoft.com/office/word/2010/wordprocessingGroup" xmlns:wpi="http://schemas.microsoft.com/office/word/2010/wordprocessingInk" xmlns:wne="http://schemas.microsoft.com/office/word/2006/wordml" xmlns:wps="http://schemas.microsoft.com/office/word/2010/wordprocessingShape" mc:Ignorable="w14 w15 w16se w16cid w16 w16cex w16sdtdh w16sdtfl w16du wp14">
+<w:endnotes xmlns:wpc="http://schemas.microsoft.com/office/word/2010/wordprocessingCanvas" xmlns:cx="http://schemas.microsoft.com/office/drawing/2014/chartex" xmlns:cx1="http://schemas.microsoft.com/office/drawing/2015/9/8/chartex" xmlns:cx2="http://schemas.microsoft.com/office/drawing/2015/10/21/chartex" xmlns:cx3="http://schemas.microsoft.com/office/drawing/2016/5/9/chartex" xmlns:cx4="http://schemas.microsoft.com/office/drawing/2016/5/10/chartex" xmlns:cx5="http://schemas.microsoft.com/office/drawing/2016/5/11/chartex" xmlns:cx6="http://schemas.microsoft.com/office/drawing/2016/5/12/chartex" xmlns:cx7="http://schemas.microsoft.com/office/drawing/2016/5/13/chartex" xmlns:cx8="http://schemas.microsoft.com/office/drawing/2016/5/14/chartex" xmlns:mc="http://schemas.openxmlformats.org/markup-compatibility/2006" xmlns:aink="http://schemas.microsoft.com/office/drawing/2016/ink" xmlns:am3d="http://schemas.microsoft.com/office/drawing/2017/model3d" xmlns:o="urn:schemas-microsoft-com:office:office" xmlns:r="http://schemas.openxmlformats.org/officeDocument/2006/relationships" xmlns:m="http://schemas.openxmlformats.org/officeDocument/2006/math" xmlns:v="urn:schemas-microsoft-com:vml" xmlns:wp14="http://schemas.microsoft.com/office/word/2010/wordprocessingDrawing" xmlns:wp="http://schemas.openxmlformats.org/drawingml/2006/wordprocessingDrawing" xmlns:w10="urn:schemas-microsoft-com:office:word" xmlns:w="http://schemas.openxmlformats.org/wordprocessingml/2006/main" xmlns:w14="http://schemas.microsoft.com/office/word/2010/wordml" xmlns:w15="http://schemas.microsoft.com/office/word/2012/wordml" xmlns:w16cid="http://schemas.microsoft.com/office/word/2016/wordml/cid" xmlns:w16se="http://schemas.microsoft.com/office/word/2015/wordml/symex" xmlns:wpg="http://schemas.microsoft.com/office/word/2010/wordprocessingGroup" xmlns:wpi="http://schemas.microsoft.com/office/word/2010/wordprocessingInk" xmlns:wne="http://schemas.microsoft.com/office/word/2006/wordml" xmlns:wps="http://schemas.microsoft.com/office/word/2010/wordprocessingShape" mc:Ignorable="w14 w15 w16se w16cid wp14">
   <w:endnote w:type="separator" w:id="-1">
     <w:p>
       <w:pPr>
@@ -3017,7 +4447,7 @@
 </file>
 
 <file path=word/footer1.xml><?xml version="1.0" encoding="utf-8"?>
-<w:ftr xmlns:wpc="http://schemas.microsoft.com/office/word/2010/wordprocessingCanvas" xmlns:cx="http://schemas.microsoft.com/office/drawing/2014/chartex" xmlns:cx1="http://schemas.microsoft.com/office/drawing/2015/9/8/chartex" xmlns:cx2="http://schemas.microsoft.com/office/drawing/2015/10/21/chartex" xmlns:cx3="http://schemas.microsoft.com/office/drawing/2016/5/9/chartex" xmlns:cx4="http://schemas.microsoft.com/office/drawing/2016/5/10/chartex" xmlns:cx5="http://schemas.microsoft.com/office/drawing/2016/5/11/chartex" xmlns:cx6="http://schemas.microsoft.com/office/drawing/2016/5/12/chartex" xmlns:cx7="http://schemas.microsoft.com/office/drawing/2016/5/13/chartex" xmlns:cx8="http://schemas.microsoft.com/office/drawing/2016/5/14/chartex" xmlns:mc="http://schemas.openxmlformats.org/markup-compatibility/2006" xmlns:aink="http://schemas.microsoft.com/office/drawing/2016/ink" xmlns:am3d="http://schemas.microsoft.com/office/drawing/2017/model3d" xmlns:o="urn:schemas-microsoft-com:office:office" xmlns:oel="http://schemas.microsoft.com/office/2019/extlst" xmlns:r="http://schemas.openxmlformats.org/officeDocument/2006/relationships" xmlns:m="http://schemas.openxmlformats.org/officeDocument/2006/math" xmlns:v="urn:schemas-microsoft-com:vml" xmlns:wp14="http://schemas.microsoft.com/office/word/2010/wordprocessingDrawing" xmlns:wp="http://schemas.openxmlformats.org/drawingml/2006/wordprocessingDrawing" xmlns:w10="urn:schemas-microsoft-com:office:word" xmlns:w="http://schemas.openxmlformats.org/wordprocessingml/2006/main" xmlns:w14="http://schemas.microsoft.com/office/word/2010/wordml" xmlns:w15="http://schemas.microsoft.com/office/word/2012/wordml" xmlns:w16cex="http://schemas.microsoft.com/office/word/2018/wordml/cex" xmlns:w16cid="http://schemas.microsoft.com/office/word/2016/wordml/cid" xmlns:w16="http://schemas.microsoft.com/office/word/2018/wordml" xmlns:w16du="http://schemas.microsoft.com/office/word/2023/wordml/word16du" xmlns:w16sdtdh="http://schemas.microsoft.com/office/word/2020/wordml/sdtdatahash" xmlns:w16sdtfl="http://schemas.microsoft.com/office/word/2024/wordml/sdtformatlock" xmlns:w16se="http://schemas.microsoft.com/office/word/2015/wordml/symex" xmlns:wpg="http://schemas.microsoft.com/office/word/2010/wordprocessingGroup" xmlns:wpi="http://schemas.microsoft.com/office/word/2010/wordprocessingInk" xmlns:wne="http://schemas.microsoft.com/office/word/2006/wordml" xmlns:wps="http://schemas.microsoft.com/office/word/2010/wordprocessingShape" mc:Ignorable="w14 w15 w16se w16cid w16 w16cex w16sdtdh w16sdtfl w16du wp14">
+<w:ftr xmlns:wpc="http://schemas.microsoft.com/office/word/2010/wordprocessingCanvas" xmlns:cx="http://schemas.microsoft.com/office/drawing/2014/chartex" xmlns:cx1="http://schemas.microsoft.com/office/drawing/2015/9/8/chartex" xmlns:cx2="http://schemas.microsoft.com/office/drawing/2015/10/21/chartex" xmlns:cx3="http://schemas.microsoft.com/office/drawing/2016/5/9/chartex" xmlns:cx4="http://schemas.microsoft.com/office/drawing/2016/5/10/chartex" xmlns:cx5="http://schemas.microsoft.com/office/drawing/2016/5/11/chartex" xmlns:cx6="http://schemas.microsoft.com/office/drawing/2016/5/12/chartex" xmlns:cx7="http://schemas.microsoft.com/office/drawing/2016/5/13/chartex" xmlns:cx8="http://schemas.microsoft.com/office/drawing/2016/5/14/chartex" xmlns:mc="http://schemas.openxmlformats.org/markup-compatibility/2006" xmlns:aink="http://schemas.microsoft.com/office/drawing/2016/ink" xmlns:am3d="http://schemas.microsoft.com/office/drawing/2017/model3d" xmlns:o="urn:schemas-microsoft-com:office:office" xmlns:r="http://schemas.openxmlformats.org/officeDocument/2006/relationships" xmlns:m="http://schemas.openxmlformats.org/officeDocument/2006/math" xmlns:v="urn:schemas-microsoft-com:vml" xmlns:wp14="http://schemas.microsoft.com/office/word/2010/wordprocessingDrawing" xmlns:wp="http://schemas.openxmlformats.org/drawingml/2006/wordprocessingDrawing" xmlns:w10="urn:schemas-microsoft-com:office:word" xmlns:w="http://schemas.openxmlformats.org/wordprocessingml/2006/main" xmlns:w14="http://schemas.microsoft.com/office/word/2010/wordml" xmlns:w15="http://schemas.microsoft.com/office/word/2012/wordml" xmlns:w16cid="http://schemas.microsoft.com/office/word/2016/wordml/cid" xmlns:w16se="http://schemas.microsoft.com/office/word/2015/wordml/symex" xmlns:wpg="http://schemas.microsoft.com/office/word/2010/wordprocessingGroup" xmlns:wpi="http://schemas.microsoft.com/office/word/2010/wordprocessingInk" xmlns:wne="http://schemas.microsoft.com/office/word/2006/wordml" xmlns:wps="http://schemas.microsoft.com/office/word/2010/wordprocessingShape" mc:Ignorable="w14 w15 w16se w16cid wp14">
   <w:sdt>
     <w:sdtPr>
       <w:id w:val="1992599383"/>
@@ -3026,6 +4456,7 @@
         <w:docPartUnique/>
       </w:docPartObj>
     </w:sdtPr>
+    <w:sdtEndPr/>
     <w:sdtContent>
       <w:p>
         <w:pPr>
@@ -3061,7 +4492,7 @@
 </file>
 
 <file path=word/footnotes.xml><?xml version="1.0" encoding="utf-8"?>
-<w:footnotes xmlns:wpc="http://schemas.microsoft.com/office/word/2010/wordprocessingCanvas" xmlns:cx="http://schemas.microsoft.com/office/drawing/2014/chartex" xmlns:cx1="http://schemas.microsoft.com/office/drawing/2015/9/8/chartex" xmlns:cx2="http://schemas.microsoft.com/office/drawing/2015/10/21/chartex" xmlns:cx3="http://schemas.microsoft.com/office/drawing/2016/5/9/chartex" xmlns:cx4="http://schemas.microsoft.com/office/drawing/2016/5/10/chartex" xmlns:cx5="http://schemas.microsoft.com/office/drawing/2016/5/11/chartex" xmlns:cx6="http://schemas.microsoft.com/office/drawing/2016/5/12/chartex" xmlns:cx7="http://schemas.microsoft.com/office/drawing/2016/5/13/chartex" xmlns:cx8="http://schemas.microsoft.com/office/drawing/2016/5/14/chartex" xmlns:mc="http://schemas.openxmlformats.org/markup-compatibility/2006" xmlns:aink="http://schemas.microsoft.com/office/drawing/2016/ink" xmlns:am3d="http://schemas.microsoft.com/office/drawing/2017/model3d" xmlns:o="urn:schemas-microsoft-com:office:office" xmlns:oel="http://schemas.microsoft.com/office/2019/extlst" xmlns:r="http://schemas.openxmlformats.org/officeDocument/2006/relationships" xmlns:m="http://schemas.openxmlformats.org/officeDocument/2006/math" xmlns:v="urn:schemas-microsoft-com:vml" xmlns:wp14="http://schemas.microsoft.com/office/word/2010/wordprocessingDrawing" xmlns:wp="http://schemas.openxmlformats.org/drawingml/2006/wordprocessingDrawing" xmlns:w10="urn:schemas-microsoft-com:office:word" xmlns:w="http://schemas.openxmlformats.org/wordprocessingml/2006/main" xmlns:w14="http://schemas.microsoft.com/office/word/2010/wordml" xmlns:w15="http://schemas.microsoft.com/office/word/2012/wordml" xmlns:w16cex="http://schemas.microsoft.com/office/word/2018/wordml/cex" xmlns:w16cid="http://schemas.microsoft.com/office/word/2016/wordml/cid" xmlns:w16="http://schemas.microsoft.com/office/word/2018/wordml" xmlns:w16du="http://schemas.microsoft.com/office/word/2023/wordml/word16du" xmlns:w16sdtdh="http://schemas.microsoft.com/office/word/2020/wordml/sdtdatahash" xmlns:w16sdtfl="http://schemas.microsoft.com/office/word/2024/wordml/sdtformatlock" xmlns:w16se="http://schemas.microsoft.com/office/word/2015/wordml/symex" xmlns:wpg="http://schemas.microsoft.com/office/word/2010/wordprocessingGroup" xmlns:wpi="http://schemas.microsoft.com/office/word/2010/wordprocessingInk" xmlns:wne="http://schemas.microsoft.com/office/word/2006/wordml" xmlns:wps="http://schemas.microsoft.com/office/word/2010/wordprocessingShape" mc:Ignorable="w14 w15 w16se w16cid w16 w16cex w16sdtdh w16sdtfl w16du wp14">
+<w:footnotes xmlns:wpc="http://schemas.microsoft.com/office/word/2010/wordprocessingCanvas" xmlns:cx="http://schemas.microsoft.com/office/drawing/2014/chartex" xmlns:cx1="http://schemas.microsoft.com/office/drawing/2015/9/8/chartex" xmlns:cx2="http://schemas.microsoft.com/office/drawing/2015/10/21/chartex" xmlns:cx3="http://schemas.microsoft.com/office/drawing/2016/5/9/chartex" xmlns:cx4="http://schemas.microsoft.com/office/drawing/2016/5/10/chartex" xmlns:cx5="http://schemas.microsoft.com/office/drawing/2016/5/11/chartex" xmlns:cx6="http://schemas.microsoft.com/office/drawing/2016/5/12/chartex" xmlns:cx7="http://schemas.microsoft.com/office/drawing/2016/5/13/chartex" xmlns:cx8="http://schemas.microsoft.com/office/drawing/2016/5/14/chartex" xmlns:mc="http://schemas.openxmlformats.org/markup-compatibility/2006" xmlns:aink="http://schemas.microsoft.com/office/drawing/2016/ink" xmlns:am3d="http://schemas.microsoft.com/office/drawing/2017/model3d" xmlns:o="urn:schemas-microsoft-com:office:office" xmlns:r="http://schemas.openxmlformats.org/officeDocument/2006/relationships" xmlns:m="http://schemas.openxmlformats.org/officeDocument/2006/math" xmlns:v="urn:schemas-microsoft-com:vml" xmlns:wp14="http://schemas.microsoft.com/office/word/2010/wordprocessingDrawing" xmlns:wp="http://schemas.openxmlformats.org/drawingml/2006/wordprocessingDrawing" xmlns:w10="urn:schemas-microsoft-com:office:word" xmlns:w="http://schemas.openxmlformats.org/wordprocessingml/2006/main" xmlns:w14="http://schemas.microsoft.com/office/word/2010/wordml" xmlns:w15="http://schemas.microsoft.com/office/word/2012/wordml" xmlns:w16cid="http://schemas.microsoft.com/office/word/2016/wordml/cid" xmlns:w16se="http://schemas.microsoft.com/office/word/2015/wordml/symex" xmlns:wpg="http://schemas.microsoft.com/office/word/2010/wordprocessingGroup" xmlns:wpi="http://schemas.microsoft.com/office/word/2010/wordprocessingInk" xmlns:wne="http://schemas.microsoft.com/office/word/2006/wordml" xmlns:wps="http://schemas.microsoft.com/office/word/2010/wordprocessingShape" mc:Ignorable="w14 w15 w16se w16cid wp14">
   <w:footnote w:type="separator" w:id="-1">
     <w:p>
       <w:pPr>
@@ -3086,17 +4517,13 @@
 </file>
 
 <file path=word/header1.xml><?xml version="1.0" encoding="utf-8"?>
-<w:hdr xmlns:m="http://schemas.openxmlformats.org/officeDocument/2006/math" xmlns:mc="http://schemas.openxmlformats.org/markup-compatibility/2006" xmlns:mo="http://schemas.microsoft.com/office/mac/office/2008/main" xmlns:mv="urn:schemas-microsoft-com:mac:vml" xmlns:o="urn:schemas-microsoft-com:office:office" xmlns:r="http://schemas.openxmlformats.org/officeDocument/2006/relationships" xmlns:v="urn:schemas-microsoft-com:vml" xmlns:w10="urn:schemas-microsoft-com:office:word" xmlns:w14="http://schemas.microsoft.com/office/word/2010/wordml" xmlns:w="http://schemas.openxmlformats.org/wordprocessingml/2006/main" xmlns:wne="http://schemas.microsoft.com/office/word/2006/wordml" xmlns:wp14="http://schemas.microsoft.com/office/word/2010/wordprocessingDrawing" xmlns:wp="http://schemas.openxmlformats.org/drawingml/2006/wordprocessingDrawing" xmlns:wpc="http://schemas.microsoft.com/office/word/2010/wordprocessingCanvas" xmlns:wpg="http://schemas.microsoft.com/office/word/2010/wordprocessingGroup" xmlns:wpi="http://schemas.microsoft.com/office/word/2010/wordprocessingInk" xmlns:wps="http://schemas.microsoft.com/office/word/2010/wordprocessingShape" mc:Ignorable="w14 wp14">
-  <w:p>
-    <w:pPr>
-      <w:pStyle w:val="Header"/>
-    </w:pPr>
-  </w:p>
+<w:hdr xmlns:wpc="http://schemas.microsoft.com/office/word/2010/wordprocessingCanvas" xmlns:cx="http://schemas.microsoft.com/office/drawing/2014/chartex" xmlns:cx1="http://schemas.microsoft.com/office/drawing/2015/9/8/chartex" xmlns:cx2="http://schemas.microsoft.com/office/drawing/2015/10/21/chartex" xmlns:cx3="http://schemas.microsoft.com/office/drawing/2016/5/9/chartex" xmlns:cx4="http://schemas.microsoft.com/office/drawing/2016/5/10/chartex" xmlns:cx5="http://schemas.microsoft.com/office/drawing/2016/5/11/chartex" xmlns:cx6="http://schemas.microsoft.com/office/drawing/2016/5/12/chartex" xmlns:cx7="http://schemas.microsoft.com/office/drawing/2016/5/13/chartex" xmlns:cx8="http://schemas.microsoft.com/office/drawing/2016/5/14/chartex" xmlns:mc="http://schemas.openxmlformats.org/markup-compatibility/2006" xmlns:aink="http://schemas.microsoft.com/office/drawing/2016/ink" xmlns:am3d="http://schemas.microsoft.com/office/drawing/2017/model3d" xmlns:o="urn:schemas-microsoft-com:office:office" xmlns:r="http://schemas.openxmlformats.org/officeDocument/2006/relationships" xmlns:m="http://schemas.openxmlformats.org/officeDocument/2006/math" xmlns:v="urn:schemas-microsoft-com:vml" xmlns:wp14="http://schemas.microsoft.com/office/word/2010/wordprocessingDrawing" xmlns:wp="http://schemas.openxmlformats.org/drawingml/2006/wordprocessingDrawing" xmlns:w10="urn:schemas-microsoft-com:office:word" xmlns:w="http://schemas.openxmlformats.org/wordprocessingml/2006/main" xmlns:w14="http://schemas.microsoft.com/office/word/2010/wordml" xmlns:w15="http://schemas.microsoft.com/office/word/2012/wordml" xmlns:w16cid="http://schemas.microsoft.com/office/word/2016/wordml/cid" xmlns:w16se="http://schemas.microsoft.com/office/word/2015/wordml/symex" xmlns:wpg="http://schemas.microsoft.com/office/word/2010/wordprocessingGroup" xmlns:wpi="http://schemas.microsoft.com/office/word/2010/wordprocessingInk" xmlns:wne="http://schemas.microsoft.com/office/word/2006/wordml" xmlns:wps="http://schemas.microsoft.com/office/word/2010/wordprocessingShape" mc:Ignorable="w14 w15 w16se w16cid wp14">
+  <w:p/>
 </w:hdr>
 </file>
 
 <file path=word/numbering.xml><?xml version="1.0" encoding="utf-8"?>
-<w:numbering xmlns:wpc="http://schemas.microsoft.com/office/word/2010/wordprocessingCanvas" xmlns:cx="http://schemas.microsoft.com/office/drawing/2014/chartex" xmlns:cx1="http://schemas.microsoft.com/office/drawing/2015/9/8/chartex" xmlns:cx2="http://schemas.microsoft.com/office/drawing/2015/10/21/chartex" xmlns:cx3="http://schemas.microsoft.com/office/drawing/2016/5/9/chartex" xmlns:cx4="http://schemas.microsoft.com/office/drawing/2016/5/10/chartex" xmlns:cx5="http://schemas.microsoft.com/office/drawing/2016/5/11/chartex" xmlns:cx6="http://schemas.microsoft.com/office/drawing/2016/5/12/chartex" xmlns:cx7="http://schemas.microsoft.com/office/drawing/2016/5/13/chartex" xmlns:cx8="http://schemas.microsoft.com/office/drawing/2016/5/14/chartex" xmlns:mc="http://schemas.openxmlformats.org/markup-compatibility/2006" xmlns:aink="http://schemas.microsoft.com/office/drawing/2016/ink" xmlns:am3d="http://schemas.microsoft.com/office/drawing/2017/model3d" xmlns:o="urn:schemas-microsoft-com:office:office" xmlns:oel="http://schemas.microsoft.com/office/2019/extlst" xmlns:r="http://schemas.openxmlformats.org/officeDocument/2006/relationships" xmlns:m="http://schemas.openxmlformats.org/officeDocument/2006/math" xmlns:v="urn:schemas-microsoft-com:vml" xmlns:wp14="http://schemas.microsoft.com/office/word/2010/wordprocessingDrawing" xmlns:wp="http://schemas.openxmlformats.org/drawingml/2006/wordprocessingDrawing" xmlns:w10="urn:schemas-microsoft-com:office:word" xmlns:w="http://schemas.openxmlformats.org/wordprocessingml/2006/main" xmlns:w14="http://schemas.microsoft.com/office/word/2010/wordml" xmlns:w15="http://schemas.microsoft.com/office/word/2012/wordml" xmlns:w16cex="http://schemas.microsoft.com/office/word/2018/wordml/cex" xmlns:w16cid="http://schemas.microsoft.com/office/word/2016/wordml/cid" xmlns:w16="http://schemas.microsoft.com/office/word/2018/wordml" xmlns:w16du="http://schemas.microsoft.com/office/word/2023/wordml/word16du" xmlns:w16sdtdh="http://schemas.microsoft.com/office/word/2020/wordml/sdtdatahash" xmlns:w16sdtfl="http://schemas.microsoft.com/office/word/2024/wordml/sdtformatlock" xmlns:w16se="http://schemas.microsoft.com/office/word/2015/wordml/symex" xmlns:wpg="http://schemas.microsoft.com/office/word/2010/wordprocessingGroup" xmlns:wpi="http://schemas.microsoft.com/office/word/2010/wordprocessingInk" xmlns:wne="http://schemas.microsoft.com/office/word/2006/wordml" xmlns:wps="http://schemas.microsoft.com/office/word/2010/wordprocessingShape" mc:Ignorable="w14 w15 w16se w16cid w16 w16cex w16sdtdh w16sdtfl w16du wp14">
+<w:numbering xmlns:wpc="http://schemas.microsoft.com/office/word/2010/wordprocessingCanvas" xmlns:cx="http://schemas.microsoft.com/office/drawing/2014/chartex" xmlns:cx1="http://schemas.microsoft.com/office/drawing/2015/9/8/chartex" xmlns:cx2="http://schemas.microsoft.com/office/drawing/2015/10/21/chartex" xmlns:cx3="http://schemas.microsoft.com/office/drawing/2016/5/9/chartex" xmlns:cx4="http://schemas.microsoft.com/office/drawing/2016/5/10/chartex" xmlns:cx5="http://schemas.microsoft.com/office/drawing/2016/5/11/chartex" xmlns:cx6="http://schemas.microsoft.com/office/drawing/2016/5/12/chartex" xmlns:cx7="http://schemas.microsoft.com/office/drawing/2016/5/13/chartex" xmlns:cx8="http://schemas.microsoft.com/office/drawing/2016/5/14/chartex" xmlns:mc="http://schemas.openxmlformats.org/markup-compatibility/2006" xmlns:aink="http://schemas.microsoft.com/office/drawing/2016/ink" xmlns:am3d="http://schemas.microsoft.com/office/drawing/2017/model3d" xmlns:o="urn:schemas-microsoft-com:office:office" xmlns:r="http://schemas.openxmlformats.org/officeDocument/2006/relationships" xmlns:m="http://schemas.openxmlformats.org/officeDocument/2006/math" xmlns:v="urn:schemas-microsoft-com:vml" xmlns:wp14="http://schemas.microsoft.com/office/word/2010/wordprocessingDrawing" xmlns:wp="http://schemas.openxmlformats.org/drawingml/2006/wordprocessingDrawing" xmlns:w10="urn:schemas-microsoft-com:office:word" xmlns:w="http://schemas.openxmlformats.org/wordprocessingml/2006/main" xmlns:w14="http://schemas.microsoft.com/office/word/2010/wordml" xmlns:w15="http://schemas.microsoft.com/office/word/2012/wordml" xmlns:w16cid="http://schemas.microsoft.com/office/word/2016/wordml/cid" xmlns:w16se="http://schemas.microsoft.com/office/word/2015/wordml/symex" xmlns:wpg="http://schemas.microsoft.com/office/word/2010/wordprocessingGroup" xmlns:wpi="http://schemas.microsoft.com/office/word/2010/wordprocessingInk" xmlns:wne="http://schemas.microsoft.com/office/word/2006/wordml" xmlns:wps="http://schemas.microsoft.com/office/word/2010/wordprocessingShape" mc:Ignorable="w14 w15 w16se w16cid wp14">
   <w:abstractNum w:abstractNumId="0" w15:restartNumberingAfterBreak="0">
     <w:nsid w:val="158676A7"/>
     <w:multiLevelType w:val="multilevel"/>
@@ -3323,17 +4750,17 @@
       </w:rPr>
     </w:lvl>
   </w:abstractNum>
-  <w:num w:numId="1" w16cid:durableId="1128006872">
+  <w:num w:numId="1">
     <w:abstractNumId w:val="1"/>
   </w:num>
-  <w:num w:numId="2" w16cid:durableId="368531493">
+  <w:num w:numId="2">
     <w:abstractNumId w:val="0"/>
   </w:num>
 </w:numbering>
 </file>
 
 <file path=word/styles.xml><?xml version="1.0" encoding="utf-8"?>
-<w:styles xmlns:mc="http://schemas.openxmlformats.org/markup-compatibility/2006" xmlns:r="http://schemas.openxmlformats.org/officeDocument/2006/relationships" xmlns:w="http://schemas.openxmlformats.org/wordprocessingml/2006/main" xmlns:w14="http://schemas.microsoft.com/office/word/2010/wordml" xmlns:w15="http://schemas.microsoft.com/office/word/2012/wordml" xmlns:w16cex="http://schemas.microsoft.com/office/word/2018/wordml/cex" xmlns:w16cid="http://schemas.microsoft.com/office/word/2016/wordml/cid" xmlns:w16="http://schemas.microsoft.com/office/word/2018/wordml" xmlns:w16du="http://schemas.microsoft.com/office/word/2023/wordml/word16du" xmlns:w16sdtdh="http://schemas.microsoft.com/office/word/2020/wordml/sdtdatahash" xmlns:w16sdtfl="http://schemas.microsoft.com/office/word/2024/wordml/sdtformatlock" xmlns:w16se="http://schemas.microsoft.com/office/word/2015/wordml/symex" mc:Ignorable="w14 w15 w16se w16cid w16 w16cex w16sdtdh w16sdtfl w16du">
+<w:styles xmlns:mc="http://schemas.openxmlformats.org/markup-compatibility/2006" xmlns:r="http://schemas.openxmlformats.org/officeDocument/2006/relationships" xmlns:w="http://schemas.openxmlformats.org/wordprocessingml/2006/main" xmlns:w14="http://schemas.microsoft.com/office/word/2010/wordml" xmlns:w15="http://schemas.microsoft.com/office/word/2012/wordml" xmlns:w16cid="http://schemas.microsoft.com/office/word/2016/wordml/cid" xmlns:w16se="http://schemas.microsoft.com/office/word/2015/wordml/symex" mc:Ignorable="w14 w15 w16se w16cid">
   <w:docDefaults>
     <w:rPrDefault>
       <w:rPr>
@@ -3345,7 +4772,7 @@
     </w:rPrDefault>
     <w:pPrDefault/>
   </w:docDefaults>
-  <w:latentStyles w:defLockedState="0" w:defUIPriority="99" w:defSemiHidden="0" w:defUnhideWhenUsed="0" w:defQFormat="0" w:count="376">
+  <w:latentStyles w:defLockedState="0" w:defUIPriority="99" w:defSemiHidden="0" w:defUnhideWhenUsed="0" w:defQFormat="0" w:count="375">
     <w:lsdException w:name="Normal" w:uiPriority="0" w:qFormat="1"/>
     <w:lsdException w:name="heading 1" w:uiPriority="9" w:qFormat="1"/>
     <w:lsdException w:name="heading 2" w:semiHidden="1" w:uiPriority="9" w:unhideWhenUsed="1" w:qFormat="1"/>
@@ -3721,7 +5148,6 @@
     <w:lsdException w:name="Smart Hyperlink" w:semiHidden="1" w:unhideWhenUsed="1"/>
     <w:lsdException w:name="Hashtag" w:semiHidden="1" w:unhideWhenUsed="1"/>
     <w:lsdException w:name="Unresolved Mention" w:semiHidden="1" w:unhideWhenUsed="1"/>
-    <w:lsdException w:name="Smart Link" w:semiHidden="1" w:unhideWhenUsed="1"/>
   </w:latentStyles>
   <w:style w:type="paragraph" w:default="1" w:styleId="a">
     <w:name w:val="Normal"/>

</xml_diff>

<commit_message>
Pack 20.4: replace cv_template with LinkedIn-style two-column design
</commit_message>
<xml_diff>
--- a/templates/docx/contract_template.docx
+++ b/templates/docx/contract_template.docx
@@ -2419,8 +2419,6 @@
           <w:szCs w:val="22"/>
         </w:rPr>
       </w:pPr>
-      <w:bookmarkStart w:id="0" w:name="_GoBack"/>
-      <w:bookmarkEnd w:id="0"/>
     </w:p>
     <w:p>
       <w:pPr>
@@ -2596,13 +2594,13 @@
     <w:p>
       <w:pPr>
         <w:pStyle w:val="ConsNormal"/>
+        <w:keepNext/>
         <w:ind w:firstLine="540"/>
         <w:rPr>
           <w:rFonts w:ascii="Microsoft Sans Serif" w:hAnsi="Microsoft Sans Serif" w:cs="Microsoft Sans Serif"/>
           <w:sz w:val="22"/>
           <w:szCs w:val="22"/>
         </w:rPr>
-        <w:keepNext/>
       </w:pPr>
       <w:r>
         <w:rPr>
@@ -2665,13 +2663,13 @@
     <w:p>
       <w:pPr>
         <w:pStyle w:val="ConsNormal"/>
+        <w:keepNext/>
         <w:jc w:val="center"/>
         <w:rPr>
           <w:rFonts w:ascii="Microsoft Sans Serif" w:hAnsi="Microsoft Sans Serif" w:cs="Microsoft Sans Serif"/>
           <w:sz w:val="22"/>
           <w:szCs w:val="22"/>
         </w:rPr>
-        <w:keepNext/>
       </w:pPr>
       <w:r>
         <w:rPr>
@@ -2679,19 +2677,20 @@
           <w:sz w:val="22"/>
           <w:szCs w:val="22"/>
         </w:rPr>
+        <w:lastRenderedPageBreak/>
         <w:t>8. Адреса и реквизиты Сторон</w:t>
       </w:r>
     </w:p>
     <w:p>
       <w:pPr>
         <w:pStyle w:val="ConsNormal"/>
+        <w:keepNext/>
         <w:jc w:val="center"/>
         <w:rPr>
           <w:rFonts w:ascii="Microsoft Sans Serif" w:hAnsi="Microsoft Sans Serif" w:cs="Microsoft Sans Serif"/>
           <w:sz w:val="22"/>
           <w:szCs w:val="22"/>
         </w:rPr>
-        <w:keepNext/>
       </w:pPr>
     </w:p>
     <w:tbl>
@@ -2720,13 +2719,13 @@
           <w:p>
             <w:pPr>
               <w:pStyle w:val="ConsDTNormal"/>
+              <w:keepNext/>
               <w:jc w:val="left"/>
               <w:rPr>
                 <w:rFonts w:ascii="Microsoft Sans Serif" w:hAnsi="Microsoft Sans Serif" w:cs="Microsoft Sans Serif"/>
                 <w:sz w:val="22"/>
                 <w:szCs w:val="22"/>
               </w:rPr>
-              <w:keepNext/>
             </w:pPr>
             <w:r>
               <w:rPr>
@@ -2740,6 +2739,7 @@
           <w:p>
             <w:pPr>
               <w:pStyle w:val="ConsDTNormal"/>
+              <w:keepNext/>
               <w:rPr>
                 <w:rFonts w:ascii="Microsoft Sans Serif" w:hAnsi="Microsoft Sans Serif" w:cs="Microsoft Sans Serif"/>
                 <w:b/>
@@ -2748,7 +2748,6 @@
                 <w:szCs w:val="22"/>
                 <w:lang w:val="en-US"/>
               </w:rPr>
-              <w:keepNext/>
             </w:pPr>
             <w:proofErr w:type="gramStart"/>
             <w:r>
@@ -2802,13 +2801,13 @@
           <w:p>
             <w:pPr>
               <w:pStyle w:val="ConsDTNormal"/>
+              <w:keepNext/>
               <w:rPr>
                 <w:rFonts w:ascii="Microsoft Sans Serif" w:hAnsi="Microsoft Sans Serif" w:cs="Microsoft Sans Serif"/>
                 <w:sz w:val="22"/>
                 <w:szCs w:val="22"/>
                 <w:lang w:val="en-US"/>
               </w:rPr>
-              <w:keepNext/>
             </w:pPr>
             <w:r>
               <w:rPr>
@@ -2908,6 +2907,7 @@
           <w:p>
             <w:pPr>
               <w:pStyle w:val="ConsDTNormal"/>
+              <w:keepNext/>
               <w:ind w:right="321"/>
               <w:rPr>
                 <w:rFonts w:ascii="Microsoft Sans Serif" w:hAnsi="Microsoft Sans Serif" w:cs="Microsoft Sans Serif"/>
@@ -2915,7 +2915,6 @@
                 <w:szCs w:val="22"/>
                 <w:lang w:val="en-US"/>
               </w:rPr>
-              <w:keepNext/>
             </w:pPr>
             <w:proofErr w:type="spellStart"/>
             <w:r>
@@ -2924,7 +2923,7 @@
                 <w:sz w:val="22"/>
                 <w:szCs w:val="22"/>
               </w:rPr>
-              <w:t xml:space="preserve">Юрид. адрес: {{ company.legal_address }} </w:t>
+              <w:t>Юрид</w:t>
             </w:r>
             <w:proofErr w:type="spellEnd"/>
             <w:r>
@@ -2934,7 +2933,7 @@
                 <w:szCs w:val="22"/>
                 <w:lang w:val="en-US"/>
               </w:rPr>
-              <w:t xml:space="preserve"/>
+              <w:t xml:space="preserve">. </w:t>
             </w:r>
             <w:r>
               <w:rPr>
@@ -2942,7 +2941,7 @@
                 <w:sz w:val="22"/>
                 <w:szCs w:val="22"/>
               </w:rPr>
-              <w:t/>
+              <w:t>адрес</w:t>
             </w:r>
             <w:r>
               <w:rPr>
@@ -2951,7 +2950,7 @@
                 <w:szCs w:val="22"/>
                 <w:lang w:val="en-US"/>
               </w:rPr>
-              <w:t xml:space="preserve"/>
+              <w:t xml:space="preserve">: </w:t>
             </w:r>
             <w:proofErr w:type="gramStart"/>
             <w:r>
@@ -2961,7 +2960,17 @@
                 <w:szCs w:val="22"/>
                 <w:lang w:val="en-US"/>
               </w:rPr>
-              <w:t/>
+              <w:t xml:space="preserve">{{ </w:t>
+            </w:r>
+            <w:proofErr w:type="spellStart"/>
+            <w:r>
+              <w:rPr>
+                <w:rFonts w:ascii="Microsoft Sans Serif" w:hAnsi="Microsoft Sans Serif" w:cs="Microsoft Sans Serif"/>
+                <w:sz w:val="22"/>
+                <w:szCs w:val="22"/>
+                <w:lang w:val="en-US"/>
+              </w:rPr>
+              <w:t>company</w:t>
             </w:r>
             <w:proofErr w:type="gramEnd"/>
             <w:r>
@@ -2971,19 +2980,29 @@
                 <w:szCs w:val="22"/>
                 <w:lang w:val="en-US"/>
               </w:rPr>
-              <w:t xml:space="preserve"/>
+              <w:t>.legal_address</w:t>
             </w:r>
-          </w:p>
-          <w:p>
-            <w:pPr>
-              <w:pStyle w:val="ConsDTNormal"/>
+            <w:proofErr w:type="spellEnd"/>
+            <w:r>
               <w:rPr>
                 <w:rFonts w:ascii="Microsoft Sans Serif" w:hAnsi="Microsoft Sans Serif" w:cs="Microsoft Sans Serif"/>
                 <w:sz w:val="22"/>
                 <w:szCs w:val="22"/>
                 <w:lang w:val="en-US"/>
               </w:rPr>
+              <w:t xml:space="preserve"> }} </w:t>
+            </w:r>
+          </w:p>
+          <w:p>
+            <w:pPr>
+              <w:pStyle w:val="ConsDTNormal"/>
               <w:keepNext/>
+              <w:rPr>
+                <w:rFonts w:ascii="Microsoft Sans Serif" w:hAnsi="Microsoft Sans Serif" w:cs="Microsoft Sans Serif"/>
+                <w:sz w:val="22"/>
+                <w:szCs w:val="22"/>
+                <w:lang w:val="en-US"/>
+              </w:rPr>
             </w:pPr>
             <w:r>
               <w:rPr>
@@ -2991,8 +3010,7 @@
                 <w:sz w:val="22"/>
                 <w:szCs w:val="22"/>
               </w:rPr>
-              <w:lastRenderedPageBreak/>
-              <w:t xml:space="preserve">Почт. адрес: {{ company.postal_address }}</w:t>
+              <w:t>Почт</w:t>
             </w:r>
             <w:r>
               <w:rPr>
@@ -3001,7 +3019,7 @@
                 <w:szCs w:val="22"/>
                 <w:lang w:val="en-US"/>
               </w:rPr>
-              <w:t xml:space="preserve"/>
+              <w:t xml:space="preserve">. </w:t>
             </w:r>
             <w:r>
               <w:rPr>
@@ -3009,7 +3027,7 @@
                 <w:sz w:val="22"/>
                 <w:szCs w:val="22"/>
               </w:rPr>
-              <w:t/>
+              <w:t>адрес</w:t>
             </w:r>
             <w:r>
               <w:rPr>
@@ -3018,7 +3036,7 @@
                 <w:szCs w:val="22"/>
                 <w:lang w:val="en-US"/>
               </w:rPr>
-              <w:t xml:space="preserve"/>
+              <w:t xml:space="preserve">: </w:t>
             </w:r>
             <w:proofErr w:type="gramStart"/>
             <w:r>
@@ -3028,7 +3046,17 @@
                 <w:szCs w:val="22"/>
                 <w:lang w:val="en-US"/>
               </w:rPr>
-              <w:t/>
+              <w:t xml:space="preserve">{{ </w:t>
+            </w:r>
+            <w:proofErr w:type="spellStart"/>
+            <w:r>
+              <w:rPr>
+                <w:rFonts w:ascii="Microsoft Sans Serif" w:hAnsi="Microsoft Sans Serif" w:cs="Microsoft Sans Serif"/>
+                <w:sz w:val="22"/>
+                <w:szCs w:val="22"/>
+                <w:lang w:val="en-US"/>
+              </w:rPr>
+              <w:t>company</w:t>
             </w:r>
             <w:proofErr w:type="gramEnd"/>
             <w:r>
@@ -3038,12 +3066,23 @@
                 <w:szCs w:val="22"/>
                 <w:lang w:val="en-US"/>
               </w:rPr>
-              <w:t/>
+              <w:t>.postal_address</w:t>
+            </w:r>
+            <w:proofErr w:type="spellEnd"/>
+            <w:r>
+              <w:rPr>
+                <w:rFonts w:ascii="Microsoft Sans Serif" w:hAnsi="Microsoft Sans Serif" w:cs="Microsoft Sans Serif"/>
+                <w:sz w:val="22"/>
+                <w:szCs w:val="22"/>
+                <w:lang w:val="en-US"/>
+              </w:rPr>
+              <w:t xml:space="preserve"> }}</w:t>
             </w:r>
           </w:p>
           <w:p>
             <w:pPr>
               <w:pStyle w:val="ConsDTNormal"/>
+              <w:keepNext/>
               <w:rPr>
                 <w:rFonts w:ascii="Microsoft Sans Serif" w:hAnsi="Microsoft Sans Serif" w:cs="Microsoft Sans Serif"/>
                 <w:bCs/>
@@ -3051,7 +3090,6 @@
                 <w:szCs w:val="22"/>
                 <w:lang w:val="en-US"/>
               </w:rPr>
-              <w:keepNext/>
             </w:pPr>
             <w:r>
               <w:rPr>
@@ -3139,6 +3177,7 @@
           <w:p>
             <w:pPr>
               <w:pStyle w:val="ConsDTNormal"/>
+              <w:keepNext/>
               <w:rPr>
                 <w:rFonts w:ascii="Microsoft Sans Serif" w:hAnsi="Microsoft Sans Serif" w:cs="Microsoft Sans Serif"/>
                 <w:bCs/>
@@ -3146,7 +3185,6 @@
                 <w:szCs w:val="22"/>
                 <w:lang w:val="en-US"/>
               </w:rPr>
-              <w:keepNext/>
             </w:pPr>
             <w:proofErr w:type="gramStart"/>
             <w:r>
@@ -3196,6 +3234,7 @@
           <w:p>
             <w:pPr>
               <w:pStyle w:val="ConsDTNormal"/>
+              <w:keepNext/>
               <w:rPr>
                 <w:rFonts w:ascii="Microsoft Sans Serif" w:hAnsi="Microsoft Sans Serif" w:cs="Microsoft Sans Serif"/>
                 <w:bCs/>
@@ -3203,7 +3242,6 @@
                 <w:szCs w:val="22"/>
                 <w:lang w:val="en-US"/>
               </w:rPr>
-              <w:keepNext/>
             </w:pPr>
             <w:r>
               <w:rPr>
@@ -3291,6 +3329,7 @@
           <w:p>
             <w:pPr>
               <w:pStyle w:val="ConsDTNormal"/>
+              <w:keepNext/>
               <w:rPr>
                 <w:rFonts w:ascii="Microsoft Sans Serif" w:hAnsi="Microsoft Sans Serif" w:cs="Microsoft Sans Serif"/>
                 <w:bCs/>
@@ -3298,7 +3337,6 @@
                 <w:szCs w:val="22"/>
                 <w:lang w:val="en-US"/>
               </w:rPr>
-              <w:keepNext/>
             </w:pPr>
             <w:r>
               <w:rPr>
@@ -3386,13 +3424,13 @@
           <w:p>
             <w:pPr>
               <w:pStyle w:val="ConsDTNormal"/>
+              <w:keepNext/>
               <w:rPr>
                 <w:rFonts w:ascii="Microsoft Sans Serif" w:hAnsi="Microsoft Sans Serif" w:cs="Microsoft Sans Serif"/>
                 <w:sz w:val="22"/>
                 <w:szCs w:val="22"/>
                 <w:lang w:val="en-US"/>
               </w:rPr>
-              <w:keepNext/>
             </w:pPr>
           </w:p>
         </w:tc>
@@ -3403,6 +3441,7 @@
           <w:p>
             <w:pPr>
               <w:pStyle w:val="ConsNormal"/>
+              <w:keepNext/>
               <w:jc w:val="left"/>
               <w:rPr>
                 <w:rFonts w:ascii="Microsoft Sans Serif" w:hAnsi="Microsoft Sans Serif" w:cs="Microsoft Sans Serif"/>
@@ -3410,7 +3449,6 @@
                 <w:szCs w:val="22"/>
                 <w:lang w:val="en-US"/>
               </w:rPr>
-              <w:keepNext/>
             </w:pPr>
             <w:r>
               <w:rPr>
@@ -3419,7 +3457,6 @@
                 <w:szCs w:val="22"/>
                 <w:lang w:val="en-US"/>
               </w:rPr>
-              <w:lastRenderedPageBreak/>
               <w:t xml:space="preserve"> </w:t>
             </w:r>
             <w:r>
@@ -3443,6 +3480,7 @@
           <w:p>
             <w:pPr>
               <w:pStyle w:val="ConsNormal"/>
+              <w:keepNext/>
               <w:tabs>
                 <w:tab w:val="left" w:pos="1635"/>
               </w:tabs>
@@ -3456,7 +3494,6 @@
                 <w:szCs w:val="22"/>
                 <w:lang w:val="en-US"/>
               </w:rPr>
-              <w:keepNext/>
             </w:pPr>
             <w:proofErr w:type="gramStart"/>
             <w:r>
@@ -3510,6 +3547,7 @@
           <w:p>
             <w:pPr>
               <w:pStyle w:val="ConsNormal"/>
+              <w:keepNext/>
               <w:tabs>
                 <w:tab w:val="left" w:pos="1635"/>
               </w:tabs>
@@ -3521,7 +3559,6 @@
                 <w:szCs w:val="22"/>
                 <w:lang w:val="en-US"/>
               </w:rPr>
-              <w:keepNext/>
             </w:pPr>
             <w:r>
               <w:rPr>
@@ -3584,6 +3621,7 @@
           <w:p>
             <w:pPr>
               <w:pStyle w:val="ConsNormal"/>
+              <w:keepNext/>
               <w:tabs>
                 <w:tab w:val="left" w:pos="1635"/>
               </w:tabs>
@@ -3595,7 +3633,6 @@
                 <w:szCs w:val="22"/>
                 <w:lang w:val="en-US"/>
               </w:rPr>
-              <w:keepNext/>
             </w:pPr>
             <w:r>
               <w:rPr>
@@ -3715,6 +3752,7 @@
           <w:p>
             <w:pPr>
               <w:pStyle w:val="ConsNormal"/>
+              <w:keepNext/>
               <w:tabs>
                 <w:tab w:val="left" w:pos="1635"/>
               </w:tabs>
@@ -3726,7 +3764,6 @@
                 <w:szCs w:val="22"/>
                 <w:lang w:val="en-US"/>
               </w:rPr>
-              <w:keepNext/>
             </w:pPr>
             <w:r>
               <w:rPr>
@@ -3734,7 +3771,6 @@
                 <w:sz w:val="22"/>
                 <w:szCs w:val="22"/>
               </w:rPr>
-              <w:lastRenderedPageBreak/>
               <w:t>ИНН</w:t>
             </w:r>
             <w:r>
@@ -3781,6 +3817,7 @@
           <w:p>
             <w:pPr>
               <w:pStyle w:val="ConsNormal"/>
+              <w:keepNext/>
               <w:tabs>
                 <w:tab w:val="left" w:pos="1635"/>
               </w:tabs>
@@ -3792,7 +3829,6 @@
                 <w:szCs w:val="22"/>
                 <w:lang w:val="en-US"/>
               </w:rPr>
-              <w:keepNext/>
             </w:pPr>
             <w:proofErr w:type="gramStart"/>
             <w:r>
@@ -3802,7 +3838,7 @@
                 <w:szCs w:val="22"/>
                 <w:lang w:val="en-US"/>
               </w:rPr>
-              <w:t xml:space="preserve">{{ applicant.home_address }} </w:t>
+              <w:t>{{ applicant</w:t>
             </w:r>
             <w:proofErr w:type="gramEnd"/>
             <w:r>
@@ -3812,12 +3848,13 @@
                 <w:szCs w:val="22"/>
                 <w:lang w:val="en-US"/>
               </w:rPr>
-              <w:t xml:space="preserve"/>
+              <w:t xml:space="preserve">.home_address }} </w:t>
             </w:r>
           </w:p>
           <w:p>
             <w:pPr>
               <w:pStyle w:val="ConsNormal"/>
+              <w:keepNext/>
               <w:tabs>
                 <w:tab w:val="left" w:pos="1635"/>
               </w:tabs>
@@ -3829,7 +3866,6 @@
                 <w:szCs w:val="22"/>
                 <w:lang w:val="en-US"/>
               </w:rPr>
-              <w:keepNext/>
             </w:pPr>
             <w:r>
               <w:rPr>
@@ -3909,6 +3945,7 @@
           <w:p>
             <w:pPr>
               <w:pStyle w:val="ConsNormal"/>
+              <w:keepNext/>
               <w:tabs>
                 <w:tab w:val="left" w:pos="1635"/>
               </w:tabs>
@@ -3920,7 +3957,6 @@
                 <w:szCs w:val="22"/>
                 <w:lang w:val="en-US"/>
               </w:rPr>
-              <w:keepNext/>
             </w:pPr>
             <w:r>
               <w:rPr>
@@ -3983,6 +4019,7 @@
           <w:p>
             <w:pPr>
               <w:pStyle w:val="ConsNormal"/>
+              <w:keepNext/>
               <w:tabs>
                 <w:tab w:val="left" w:pos="1635"/>
               </w:tabs>
@@ -3993,7 +4030,6 @@
                 <w:szCs w:val="22"/>
                 <w:lang w:val="en-US"/>
               </w:rPr>
-              <w:keepNext/>
             </w:pPr>
             <w:r>
               <w:rPr>
@@ -4082,6 +4118,7 @@
           <w:p>
             <w:pPr>
               <w:pStyle w:val="ConsNormal"/>
+              <w:keepNext/>
               <w:tabs>
                 <w:tab w:val="left" w:pos="1635"/>
               </w:tabs>
@@ -4093,7 +4130,6 @@
                 <w:szCs w:val="22"/>
                 <w:lang w:val="en-US"/>
               </w:rPr>
-              <w:keepNext/>
             </w:pPr>
             <w:r>
               <w:rPr>
@@ -4170,19 +4206,55 @@
               <w:t xml:space="preserve"> }}</w:t>
             </w:r>
           </w:p>
+          <w:p>
+            <w:pPr>
+              <w:pStyle w:val="ConsNormal"/>
+              <w:keepNext/>
+              <w:tabs>
+                <w:tab w:val="left" w:pos="1635"/>
+              </w:tabs>
+              <w:ind w:left="40"/>
+              <w:jc w:val="left"/>
+              <w:rPr>
+                <w:rFonts w:ascii="Microsoft Sans Serif" w:hAnsi="Microsoft Sans Serif" w:cs="Microsoft Sans Serif"/>
+                <w:sz w:val="22"/>
+                <w:szCs w:val="22"/>
+                <w:lang w:val="en-US"/>
+              </w:rPr>
+            </w:pPr>
+          </w:p>
+          <w:p>
+            <w:pPr>
+              <w:pStyle w:val="ConsNormal"/>
+              <w:keepNext/>
+              <w:tabs>
+                <w:tab w:val="left" w:pos="1635"/>
+              </w:tabs>
+              <w:ind w:left="40"/>
+              <w:jc w:val="left"/>
+              <w:rPr>
+                <w:rFonts w:ascii="Microsoft Sans Serif" w:hAnsi="Microsoft Sans Serif" w:cs="Microsoft Sans Serif"/>
+                <w:sz w:val="22"/>
+                <w:szCs w:val="22"/>
+                <w:lang w:val="en-US"/>
+              </w:rPr>
+            </w:pPr>
+            <w:bookmarkStart w:id="0" w:name="_GoBack"/>
+            <w:bookmarkEnd w:id="0"/>
+          </w:p>
         </w:tc>
       </w:tr>
     </w:tbl>
     <w:p>
       <w:pPr>
         <w:pStyle w:val="ConsNormal"/>
+        <w:keepNext/>
         <w:jc w:val="center"/>
         <w:rPr>
           <w:rFonts w:ascii="Microsoft Sans Serif" w:hAnsi="Microsoft Sans Serif" w:cs="Microsoft Sans Serif"/>
           <w:sz w:val="22"/>
           <w:szCs w:val="22"/>
         </w:rPr>
-        <w:keepNext/>
       </w:pPr>
       <w:r>
         <w:rPr>
@@ -4190,7 +4262,6 @@
           <w:sz w:val="22"/>
           <w:szCs w:val="22"/>
         </w:rPr>
-        <w:lastRenderedPageBreak/>
         <w:t>Подписи Сторон</w:t>
       </w:r>
     </w:p>
@@ -4213,13 +4284,13 @@
           <w:p>
             <w:pPr>
               <w:pStyle w:val="ConsDTNormal"/>
+              <w:keepNext/>
               <w:jc w:val="left"/>
               <w:rPr>
                 <w:rFonts w:ascii="Microsoft Sans Serif" w:hAnsi="Microsoft Sans Serif" w:cs="Microsoft Sans Serif"/>
                 <w:sz w:val="22"/>
                 <w:szCs w:val="22"/>
               </w:rPr>
-              <w:keepNext/>
             </w:pPr>
           </w:p>
         </w:tc>
@@ -4230,13 +4301,13 @@
           <w:p>
             <w:pPr>
               <w:pStyle w:val="ConsDTNormal"/>
+              <w:keepNext/>
               <w:jc w:val="left"/>
               <w:rPr>
                 <w:rFonts w:ascii="Microsoft Sans Serif" w:hAnsi="Microsoft Sans Serif" w:cs="Microsoft Sans Serif"/>
                 <w:sz w:val="22"/>
                 <w:szCs w:val="22"/>
               </w:rPr>
-              <w:keepNext/>
             </w:pPr>
           </w:p>
         </w:tc>
@@ -4247,13 +4318,13 @@
           <w:p>
             <w:pPr>
               <w:pStyle w:val="ConsDTNormal"/>
+              <w:keepNext/>
               <w:jc w:val="left"/>
               <w:rPr>
                 <w:rFonts w:ascii="Microsoft Sans Serif" w:hAnsi="Microsoft Sans Serif" w:cs="Microsoft Sans Serif"/>
                 <w:sz w:val="22"/>
                 <w:szCs w:val="22"/>
               </w:rPr>
-              <w:keepNext/>
             </w:pPr>
           </w:p>
         </w:tc>
@@ -4266,13 +4337,13 @@
           <w:p>
             <w:pPr>
               <w:pStyle w:val="ConsDTNormal"/>
+              <w:keepNext/>
               <w:jc w:val="left"/>
               <w:rPr>
                 <w:rFonts w:ascii="Microsoft Sans Serif" w:hAnsi="Microsoft Sans Serif" w:cs="Microsoft Sans Serif"/>
                 <w:sz w:val="22"/>
                 <w:szCs w:val="22"/>
               </w:rPr>
-              <w:keepNext/>
             </w:pPr>
             <w:r>
               <w:rPr>
@@ -4327,13 +4398,13 @@
           <w:p>
             <w:pPr>
               <w:pStyle w:val="ConsDTNormal"/>
+              <w:keepNext/>
               <w:jc w:val="left"/>
               <w:rPr>
                 <w:rFonts w:ascii="Microsoft Sans Serif" w:hAnsi="Microsoft Sans Serif" w:cs="Microsoft Sans Serif"/>
                 <w:sz w:val="22"/>
                 <w:szCs w:val="22"/>
               </w:rPr>
-              <w:keepNext/>
             </w:pPr>
           </w:p>
         </w:tc>

</xml_diff>

<commit_message>
Pack 26.1: split company/applicant address into 2 lines in contract template
</commit_message>
<xml_diff>
--- a/templates/docx/contract_template.docx
+++ b/templates/docx/contract_template.docx
@@ -2916,81 +2916,34 @@
                 <w:lang w:val="en-US"/>
               </w:rPr>
             </w:pPr>
-            <w:proofErr w:type="spellStart"/>
             <w:r>
               <w:rPr>
                 <w:rFonts w:ascii="Microsoft Sans Serif" w:hAnsi="Microsoft Sans Serif" w:cs="Microsoft Sans Serif"/>
                 <w:sz w:val="22"/>
                 <w:szCs w:val="22"/>
               </w:rPr>
-              <w:t>Юрид</w:t>
+              <w:t xml:space="preserve">Юрид. адрес: {{ company.legal_address_line1 }}</w:t>
             </w:r>
-            <w:proofErr w:type="spellEnd"/>
-            <w:r>
+          </w:p>
+          <w:p>
+            <w:pPr>
+              <w:pStyle w:val="ConsDTNormal"/>
+              <w:keepNext/>
+              <w:ind w:right="321"/>
               <w:rPr>
                 <w:rFonts w:ascii="Microsoft Sans Serif" w:hAnsi="Microsoft Sans Serif" w:cs="Microsoft Sans Serif"/>
                 <w:sz w:val="22"/>
                 <w:szCs w:val="22"/>
                 <w:lang w:val="en-US"/>
               </w:rPr>
-              <w:t xml:space="preserve">. </w:t>
-            </w:r>
+            </w:pPr>
             <w:r>
               <w:rPr>
                 <w:rFonts w:ascii="Microsoft Sans Serif" w:hAnsi="Microsoft Sans Serif" w:cs="Microsoft Sans Serif"/>
                 <w:sz w:val="22"/>
                 <w:szCs w:val="22"/>
               </w:rPr>
-              <w:t>адрес</w:t>
-            </w:r>
-            <w:r>
-              <w:rPr>
-                <w:rFonts w:ascii="Microsoft Sans Serif" w:hAnsi="Microsoft Sans Serif" w:cs="Microsoft Sans Serif"/>
-                <w:sz w:val="22"/>
-                <w:szCs w:val="22"/>
-                <w:lang w:val="en-US"/>
-              </w:rPr>
-              <w:t xml:space="preserve">: </w:t>
-            </w:r>
-            <w:proofErr w:type="gramStart"/>
-            <w:r>
-              <w:rPr>
-                <w:rFonts w:ascii="Microsoft Sans Serif" w:hAnsi="Microsoft Sans Serif" w:cs="Microsoft Sans Serif"/>
-                <w:sz w:val="22"/>
-                <w:szCs w:val="22"/>
-                <w:lang w:val="en-US"/>
-              </w:rPr>
-              <w:t xml:space="preserve">{{ </w:t>
-            </w:r>
-            <w:proofErr w:type="spellStart"/>
-            <w:r>
-              <w:rPr>
-                <w:rFonts w:ascii="Microsoft Sans Serif" w:hAnsi="Microsoft Sans Serif" w:cs="Microsoft Sans Serif"/>
-                <w:sz w:val="22"/>
-                <w:szCs w:val="22"/>
-                <w:lang w:val="en-US"/>
-              </w:rPr>
-              <w:t>company</w:t>
-            </w:r>
-            <w:proofErr w:type="gramEnd"/>
-            <w:r>
-              <w:rPr>
-                <w:rFonts w:ascii="Microsoft Sans Serif" w:hAnsi="Microsoft Sans Serif" w:cs="Microsoft Sans Serif"/>
-                <w:sz w:val="22"/>
-                <w:szCs w:val="22"/>
-                <w:lang w:val="en-US"/>
-              </w:rPr>
-              <w:t>.legal_address</w:t>
-            </w:r>
-            <w:proofErr w:type="spellEnd"/>
-            <w:r>
-              <w:rPr>
-                <w:rFonts w:ascii="Microsoft Sans Serif" w:hAnsi="Microsoft Sans Serif" w:cs="Microsoft Sans Serif"/>
-                <w:sz w:val="22"/>
-                <w:szCs w:val="22"/>
-                <w:lang w:val="en-US"/>
-              </w:rPr>
-              <w:t xml:space="preserve"> }} </w:t>
+              <w:t xml:space="preserve">{{ company.legal_address_line2 }}</w:t>
             </w:r>
           </w:p>
           <w:p>
@@ -3010,73 +2963,27 @@
                 <w:sz w:val="22"/>
                 <w:szCs w:val="22"/>
               </w:rPr>
-              <w:t>Почт</w:t>
+              <w:t xml:space="preserve">Почт. адрес: {{ company.postal_address_line1 }}</w:t>
             </w:r>
-            <w:r>
+          </w:p>
+          <w:p>
+            <w:pPr>
+              <w:pStyle w:val="ConsDTNormal"/>
+              <w:keepNext/>
               <w:rPr>
                 <w:rFonts w:ascii="Microsoft Sans Serif" w:hAnsi="Microsoft Sans Serif" w:cs="Microsoft Sans Serif"/>
                 <w:sz w:val="22"/>
                 <w:szCs w:val="22"/>
                 <w:lang w:val="en-US"/>
               </w:rPr>
-              <w:t xml:space="preserve">. </w:t>
-            </w:r>
+            </w:pPr>
             <w:r>
               <w:rPr>
                 <w:rFonts w:ascii="Microsoft Sans Serif" w:hAnsi="Microsoft Sans Serif" w:cs="Microsoft Sans Serif"/>
                 <w:sz w:val="22"/>
                 <w:szCs w:val="22"/>
               </w:rPr>
-              <w:t>адрес</w:t>
-            </w:r>
-            <w:r>
-              <w:rPr>
-                <w:rFonts w:ascii="Microsoft Sans Serif" w:hAnsi="Microsoft Sans Serif" w:cs="Microsoft Sans Serif"/>
-                <w:sz w:val="22"/>
-                <w:szCs w:val="22"/>
-                <w:lang w:val="en-US"/>
-              </w:rPr>
-              <w:t xml:space="preserve">: </w:t>
-            </w:r>
-            <w:proofErr w:type="gramStart"/>
-            <w:r>
-              <w:rPr>
-                <w:rFonts w:ascii="Microsoft Sans Serif" w:hAnsi="Microsoft Sans Serif" w:cs="Microsoft Sans Serif"/>
-                <w:sz w:val="22"/>
-                <w:szCs w:val="22"/>
-                <w:lang w:val="en-US"/>
-              </w:rPr>
-              <w:t xml:space="preserve">{{ </w:t>
-            </w:r>
-            <w:proofErr w:type="spellStart"/>
-            <w:r>
-              <w:rPr>
-                <w:rFonts w:ascii="Microsoft Sans Serif" w:hAnsi="Microsoft Sans Serif" w:cs="Microsoft Sans Serif"/>
-                <w:sz w:val="22"/>
-                <w:szCs w:val="22"/>
-                <w:lang w:val="en-US"/>
-              </w:rPr>
-              <w:t>company</w:t>
-            </w:r>
-            <w:proofErr w:type="gramEnd"/>
-            <w:r>
-              <w:rPr>
-                <w:rFonts w:ascii="Microsoft Sans Serif" w:hAnsi="Microsoft Sans Serif" w:cs="Microsoft Sans Serif"/>
-                <w:sz w:val="22"/>
-                <w:szCs w:val="22"/>
-                <w:lang w:val="en-US"/>
-              </w:rPr>
-              <w:t>.postal_address</w:t>
-            </w:r>
-            <w:proofErr w:type="spellEnd"/>
-            <w:r>
-              <w:rPr>
-                <w:rFonts w:ascii="Microsoft Sans Serif" w:hAnsi="Microsoft Sans Serif" w:cs="Microsoft Sans Serif"/>
-                <w:sz w:val="22"/>
-                <w:szCs w:val="22"/>
-                <w:lang w:val="en-US"/>
-              </w:rPr>
-              <w:t xml:space="preserve"> }}</w:t>
+              <w:t xml:space="preserve">{{ company.postal_address_line2 }}</w:t>
             </w:r>
           </w:p>
           <w:p>
@@ -3830,25 +3737,38 @@
                 <w:lang w:val="en-US"/>
               </w:rPr>
             </w:pPr>
-            <w:proofErr w:type="gramStart"/>
             <w:r>
+              <w:rPr>
+                <w:rFonts w:ascii="Microsoft Sans Serif" w:hAnsi="Microsoft Sans Serif" w:cs="Microsoft Sans Serif"/>
+                <w:sz w:val="22"/>
+                <w:szCs w:val="22"/>
+              </w:rPr>
+              <w:t xml:space="preserve">{{ applicant.home_address_line1 }}</w:t>
+            </w:r>
+          </w:p>
+          <w:p>
+            <w:pPr>
+              <w:pStyle w:val="ConsNormal"/>
+              <w:keepNext/>
+              <w:tabs>
+                <w:tab w:val="left" w:pos="1635"/>
+              </w:tabs>
+              <w:ind w:left="40"/>
+              <w:jc w:val="left"/>
               <w:rPr>
                 <w:rFonts w:ascii="Microsoft Sans Serif" w:hAnsi="Microsoft Sans Serif" w:cs="Microsoft Sans Serif"/>
                 <w:sz w:val="22"/>
                 <w:szCs w:val="22"/>
                 <w:lang w:val="en-US"/>
               </w:rPr>
-              <w:t>{{ applicant</w:t>
-            </w:r>
-            <w:proofErr w:type="gramEnd"/>
+            </w:pPr>
             <w:r>
               <w:rPr>
                 <w:rFonts w:ascii="Microsoft Sans Serif" w:hAnsi="Microsoft Sans Serif" w:cs="Microsoft Sans Serif"/>
                 <w:sz w:val="22"/>
                 <w:szCs w:val="22"/>
-                <w:lang w:val="en-US"/>
               </w:rPr>
-              <w:t xml:space="preserve">.home_address }} </w:t>
+              <w:t xml:space="preserve">{{ applicant.home_address_line2 }}</w:t>
             </w:r>
           </w:p>
           <w:p>

</xml_diff>

<commit_message>
Pack 34.7: merge address line1+line2 in all 11 contract templates
</commit_message>
<xml_diff>
--- a/templates/docx/contract_template.docx
+++ b/templates/docx/contract_template.docx
@@ -2922,28 +2922,7 @@
                 <w:sz w:val="22"/>
                 <w:szCs w:val="22"/>
               </w:rPr>
-              <w:t xml:space="preserve">Юрид. адрес: {{ company.legal_address_line1 }}</w:t>
-            </w:r>
-          </w:p>
-          <w:p>
-            <w:pPr>
-              <w:pStyle w:val="ConsDTNormal"/>
-              <w:keepNext/>
-              <w:ind w:right="321"/>
-              <w:rPr>
-                <w:rFonts w:ascii="Microsoft Sans Serif" w:hAnsi="Microsoft Sans Serif" w:cs="Microsoft Sans Serif"/>
-                <w:sz w:val="22"/>
-                <w:szCs w:val="22"/>
-                <w:lang w:val="en-US"/>
-              </w:rPr>
-            </w:pPr>
-            <w:r>
-              <w:rPr>
-                <w:rFonts w:ascii="Microsoft Sans Serif" w:hAnsi="Microsoft Sans Serif" w:cs="Microsoft Sans Serif"/>
-                <w:sz w:val="22"/>
-                <w:szCs w:val="22"/>
-              </w:rPr>
-              <w:t xml:space="preserve">{{ company.legal_address_line2 }}</w:t>
+              <w:t xml:space="preserve">Юрид. адрес: {{ company.legal_address }}</w:t>
             </w:r>
           </w:p>
           <w:p>
@@ -2963,27 +2942,7 @@
                 <w:sz w:val="22"/>
                 <w:szCs w:val="22"/>
               </w:rPr>
-              <w:t xml:space="preserve">Почт. адрес: {{ company.postal_address_line1 }}</w:t>
-            </w:r>
-          </w:p>
-          <w:p>
-            <w:pPr>
-              <w:pStyle w:val="ConsDTNormal"/>
-              <w:keepNext/>
-              <w:rPr>
-                <w:rFonts w:ascii="Microsoft Sans Serif" w:hAnsi="Microsoft Sans Serif" w:cs="Microsoft Sans Serif"/>
-                <w:sz w:val="22"/>
-                <w:szCs w:val="22"/>
-                <w:lang w:val="en-US"/>
-              </w:rPr>
-            </w:pPr>
-            <w:r>
-              <w:rPr>
-                <w:rFonts w:ascii="Microsoft Sans Serif" w:hAnsi="Microsoft Sans Serif" w:cs="Microsoft Sans Serif"/>
-                <w:sz w:val="22"/>
-                <w:szCs w:val="22"/>
-              </w:rPr>
-              <w:t xml:space="preserve">{{ company.postal_address_line2 }}</w:t>
+              <w:t xml:space="preserve">Почт. адрес: {{ company.postal_address }}</w:t>
             </w:r>
           </w:p>
           <w:p>
@@ -3743,32 +3702,7 @@
                 <w:sz w:val="22"/>
                 <w:szCs w:val="22"/>
               </w:rPr>
-              <w:t xml:space="preserve">{{ applicant.home_address_line1 }}</w:t>
-            </w:r>
-          </w:p>
-          <w:p>
-            <w:pPr>
-              <w:pStyle w:val="ConsNormal"/>
-              <w:keepNext/>
-              <w:tabs>
-                <w:tab w:val="left" w:pos="1635"/>
-              </w:tabs>
-              <w:ind w:left="40"/>
-              <w:jc w:val="left"/>
-              <w:rPr>
-                <w:rFonts w:ascii="Microsoft Sans Serif" w:hAnsi="Microsoft Sans Serif" w:cs="Microsoft Sans Serif"/>
-                <w:sz w:val="22"/>
-                <w:szCs w:val="22"/>
-                <w:lang w:val="en-US"/>
-              </w:rPr>
-            </w:pPr>
-            <w:r>
-              <w:rPr>
-                <w:rFonts w:ascii="Microsoft Sans Serif" w:hAnsi="Microsoft Sans Serif" w:cs="Microsoft Sans Serif"/>
-                <w:sz w:val="22"/>
-                <w:szCs w:val="22"/>
-              </w:rPr>
-              <w:t xml:space="preserve">{{ applicant.home_address_line2 }}</w:t>
+              <w:t xml:space="preserve">{{ applicant.home_address }}</w:t>
             </w:r>
           </w:p>
           <w:p>

</xml_diff>